<commit_message>
fix: harden readiness v5 rollout boundaries
</commit_message>
<xml_diff>
--- a/docs/survey/Global Market Entry Readiness Assessment 46 Questions v5.0.docx
+++ b/docs/survey/Global Market Entry Readiness Assessment 46 Questions v5.0.docx
@@ -9,7 +9,7 @@
       </w:pPr>
       <w:r>
         <w:rPr>
-          <w:rFonts w:ascii="Arial Unicode MS" w:hAnsi="Arial Unicode MS" w:eastAsia="Arial Unicode MS"/>
+          <w:rFonts w:ascii="Noto Serif KR" w:hAnsi="Noto Serif KR" w:eastAsia="Noto Serif KR"/>
           <w:b/>
           <w:i w:val="0"/>
           <w:sz w:val="44"/>
@@ -24,7 +24,7 @@
       </w:pPr>
       <w:r>
         <w:rPr>
-          <w:rFonts w:ascii="Arial Unicode MS" w:hAnsi="Arial Unicode MS" w:eastAsia="Arial Unicode MS"/>
+          <w:rFonts w:ascii="Noto Serif KR" w:hAnsi="Noto Serif KR" w:eastAsia="Noto Serif KR"/>
           <w:b w:val="0"/>
           <w:i w:val="0"/>
           <w:color w:val="666666"/>
@@ -60,7 +60,7 @@
           <w:p>
             <w:r>
               <w:rPr>
-                <w:rFonts w:ascii="Arial Unicode MS" w:hAnsi="Arial Unicode MS" w:eastAsia="Arial Unicode MS"/>
+                <w:rFonts w:ascii="Noto Serif KR" w:hAnsi="Noto Serif KR" w:eastAsia="Noto Serif KR"/>
                 <w:b/>
                 <w:i w:val="0"/>
                 <w:sz w:val="20"/>
@@ -83,7 +83,7 @@
           <w:p>
             <w:r>
               <w:rPr>
-                <w:rFonts w:ascii="Arial Unicode MS" w:hAnsi="Arial Unicode MS" w:eastAsia="Arial Unicode MS"/>
+                <w:rFonts w:ascii="Noto Serif KR" w:hAnsi="Noto Serif KR" w:eastAsia="Noto Serif KR"/>
                 <w:b w:val="0"/>
                 <w:i w:val="0"/>
                 <w:sz w:val="20"/>
@@ -108,7 +108,7 @@
           <w:p>
             <w:r>
               <w:rPr>
-                <w:rFonts w:ascii="Arial Unicode MS" w:hAnsi="Arial Unicode MS" w:eastAsia="Arial Unicode MS"/>
+                <w:rFonts w:ascii="Noto Serif KR" w:hAnsi="Noto Serif KR" w:eastAsia="Noto Serif KR"/>
                 <w:b/>
                 <w:i w:val="0"/>
                 <w:sz w:val="20"/>
@@ -131,7 +131,7 @@
           <w:p>
             <w:r>
               <w:rPr>
-                <w:rFonts w:ascii="Arial Unicode MS" w:hAnsi="Arial Unicode MS" w:eastAsia="Arial Unicode MS"/>
+                <w:rFonts w:ascii="Noto Serif KR" w:hAnsi="Noto Serif KR" w:eastAsia="Noto Serif KR"/>
                 <w:b w:val="0"/>
                 <w:i w:val="0"/>
                 <w:sz w:val="20"/>
@@ -156,7 +156,7 @@
           <w:p>
             <w:r>
               <w:rPr>
-                <w:rFonts w:ascii="Arial Unicode MS" w:hAnsi="Arial Unicode MS" w:eastAsia="Arial Unicode MS"/>
+                <w:rFonts w:ascii="Noto Serif KR" w:hAnsi="Noto Serif KR" w:eastAsia="Noto Serif KR"/>
                 <w:b/>
                 <w:i w:val="0"/>
                 <w:sz w:val="20"/>
@@ -179,7 +179,7 @@
           <w:p>
             <w:r>
               <w:rPr>
-                <w:rFonts w:ascii="Arial Unicode MS" w:hAnsi="Arial Unicode MS" w:eastAsia="Arial Unicode MS"/>
+                <w:rFonts w:ascii="Noto Serif KR" w:hAnsi="Noto Serif KR" w:eastAsia="Noto Serif KR"/>
                 <w:b w:val="0"/>
                 <w:i w:val="0"/>
                 <w:sz w:val="20"/>
@@ -204,7 +204,7 @@
           <w:p>
             <w:r>
               <w:rPr>
-                <w:rFonts w:ascii="Arial Unicode MS" w:hAnsi="Arial Unicode MS" w:eastAsia="Arial Unicode MS"/>
+                <w:rFonts w:ascii="Noto Serif KR" w:hAnsi="Noto Serif KR" w:eastAsia="Noto Serif KR"/>
                 <w:b/>
                 <w:i w:val="0"/>
                 <w:sz w:val="20"/>
@@ -227,7 +227,7 @@
           <w:p>
             <w:r>
               <w:rPr>
-                <w:rFonts w:ascii="Arial Unicode MS" w:hAnsi="Arial Unicode MS" w:eastAsia="Arial Unicode MS"/>
+                <w:rFonts w:ascii="Noto Serif KR" w:hAnsi="Noto Serif KR" w:eastAsia="Noto Serif KR"/>
                 <w:b w:val="0"/>
                 <w:i w:val="0"/>
                 <w:sz w:val="20"/>
@@ -252,7 +252,7 @@
           <w:p>
             <w:r>
               <w:rPr>
-                <w:rFonts w:ascii="Arial Unicode MS" w:hAnsi="Arial Unicode MS" w:eastAsia="Arial Unicode MS"/>
+                <w:rFonts w:ascii="Noto Serif KR" w:hAnsi="Noto Serif KR" w:eastAsia="Noto Serif KR"/>
                 <w:b/>
                 <w:i w:val="0"/>
                 <w:sz w:val="20"/>
@@ -275,7 +275,7 @@
           <w:p>
             <w:r>
               <w:rPr>
-                <w:rFonts w:ascii="Arial Unicode MS" w:hAnsi="Arial Unicode MS" w:eastAsia="Arial Unicode MS"/>
+                <w:rFonts w:ascii="Noto Serif KR" w:hAnsi="Noto Serif KR" w:eastAsia="Noto Serif KR"/>
                 <w:b w:val="0"/>
                 <w:i w:val="0"/>
                 <w:sz w:val="20"/>
@@ -291,7 +291,7 @@
       </w:pPr>
       <w:r>
         <w:rPr>
-          <w:rFonts w:ascii="Arial Unicode MS" w:hAnsi="Arial Unicode MS" w:eastAsia="Arial Unicode MS"/>
+          <w:rFonts w:ascii="Noto Serif KR" w:hAnsi="Noto Serif KR" w:eastAsia="Noto Serif KR"/>
           <w:b/>
           <w:i w:val="0"/>
           <w:sz w:val="26"/>
@@ -305,7 +305,7 @@
       </w:pPr>
       <w:r>
         <w:rPr>
-          <w:rFonts w:ascii="Arial Unicode MS" w:hAnsi="Arial Unicode MS" w:eastAsia="Arial Unicode MS"/>
+          <w:rFonts w:ascii="Noto Serif KR" w:hAnsi="Noto Serif KR" w:eastAsia="Noto Serif KR"/>
           <w:b w:val="0"/>
           <w:i w:val="0"/>
           <w:sz w:val="20"/>
@@ -319,7 +319,7 @@
       </w:pPr>
       <w:r>
         <w:rPr>
-          <w:rFonts w:ascii="Arial Unicode MS" w:hAnsi="Arial Unicode MS" w:eastAsia="Arial Unicode MS"/>
+          <w:rFonts w:ascii="Noto Serif KR" w:hAnsi="Noto Serif KR" w:eastAsia="Noto Serif KR"/>
           <w:b w:val="0"/>
           <w:i w:val="0"/>
           <w:sz w:val="20"/>
@@ -333,7 +333,7 @@
       </w:pPr>
       <w:r>
         <w:rPr>
-          <w:rFonts w:ascii="Arial Unicode MS" w:hAnsi="Arial Unicode MS" w:eastAsia="Arial Unicode MS"/>
+          <w:rFonts w:ascii="Noto Serif KR" w:hAnsi="Noto Serif KR" w:eastAsia="Noto Serif KR"/>
           <w:b w:val="0"/>
           <w:i w:val="0"/>
           <w:sz w:val="20"/>
@@ -347,7 +347,7 @@
       </w:pPr>
       <w:r>
         <w:rPr>
-          <w:rFonts w:ascii="Arial Unicode MS" w:hAnsi="Arial Unicode MS" w:eastAsia="Arial Unicode MS"/>
+          <w:rFonts w:ascii="Noto Serif KR" w:hAnsi="Noto Serif KR" w:eastAsia="Noto Serif KR"/>
           <w:b w:val="0"/>
           <w:i w:val="0"/>
           <w:sz w:val="20"/>
@@ -361,7 +361,7 @@
       </w:pPr>
       <w:r>
         <w:rPr>
-          <w:rFonts w:ascii="Arial Unicode MS" w:hAnsi="Arial Unicode MS" w:eastAsia="Arial Unicode MS"/>
+          <w:rFonts w:ascii="Noto Serif KR" w:hAnsi="Noto Serif KR" w:eastAsia="Noto Serif KR"/>
           <w:b w:val="0"/>
           <w:i w:val="0"/>
           <w:sz w:val="20"/>
@@ -376,7 +376,7 @@
       </w:pPr>
       <w:r>
         <w:rPr>
-          <w:rFonts w:ascii="Arial Unicode MS" w:hAnsi="Arial Unicode MS" w:eastAsia="Arial Unicode MS"/>
+          <w:rFonts w:ascii="Noto Serif KR" w:hAnsi="Noto Serif KR" w:eastAsia="Noto Serif KR"/>
           <w:b/>
           <w:i w:val="0"/>
           <w:sz w:val="34"/>
@@ -390,7 +390,7 @@
       </w:pPr>
       <w:r>
         <w:rPr>
-          <w:rFonts w:ascii="Arial Unicode MS" w:hAnsi="Arial Unicode MS" w:eastAsia="Arial Unicode MS"/>
+          <w:rFonts w:ascii="Noto Serif KR" w:hAnsi="Noto Serif KR" w:eastAsia="Noto Serif KR"/>
           <w:b w:val="0"/>
           <w:i w:val="0"/>
           <w:color w:val="666666"/>
@@ -405,7 +405,7 @@
       </w:pPr>
       <w:r>
         <w:rPr>
-          <w:rFonts w:ascii="Arial Unicode MS" w:hAnsi="Arial Unicode MS" w:eastAsia="Arial Unicode MS"/>
+          <w:rFonts w:ascii="Noto Serif KR" w:hAnsi="Noto Serif KR" w:eastAsia="Noto Serif KR"/>
           <w:b/>
           <w:i w:val="0"/>
           <w:sz w:val="26"/>
@@ -419,7 +419,7 @@
       </w:pPr>
       <w:r>
         <w:rPr>
-          <w:rFonts w:ascii="Arial Unicode MS" w:hAnsi="Arial Unicode MS" w:eastAsia="Arial Unicode MS"/>
+          <w:rFonts w:ascii="Noto Serif KR" w:hAnsi="Noto Serif KR" w:eastAsia="Noto Serif KR"/>
           <w:b w:val="0"/>
           <w:i w:val="0"/>
           <w:sz w:val="20"/>
@@ -427,7 +427,7 @@
       </w:r>
       <w:r>
         <w:rPr>
-          <w:rFonts w:ascii="Arial Unicode MS" w:hAnsi="Arial Unicode MS" w:eastAsia="Arial Unicode MS"/>
+          <w:rFonts w:ascii="Noto Serif KR" w:hAnsi="Noto Serif KR" w:eastAsia="Noto Serif KR"/>
           <w:b/>
           <w:i w:val="0"/>
           <w:sz w:val="21"/>
@@ -436,7 +436,7 @@
       </w:r>
       <w:r>
         <w:rPr>
-          <w:rFonts w:ascii="Arial Unicode MS" w:hAnsi="Arial Unicode MS" w:eastAsia="Arial Unicode MS"/>
+          <w:rFonts w:ascii="Noto Serif KR" w:hAnsi="Noto Serif KR" w:eastAsia="Noto Serif KR"/>
           <w:b w:val="0"/>
           <w:i w:val="0"/>
           <w:sz w:val="21"/>
@@ -451,7 +451,7 @@
       </w:pPr>
       <w:r>
         <w:rPr>
-          <w:rFonts w:ascii="Arial Unicode MS" w:hAnsi="Arial Unicode MS" w:eastAsia="Arial Unicode MS"/>
+          <w:rFonts w:ascii="Noto Serif KR" w:hAnsi="Noto Serif KR" w:eastAsia="Noto Serif KR"/>
           <w:b w:val="0"/>
           <w:i w:val="0"/>
           <w:sz w:val="20"/>
@@ -466,7 +466,7 @@
       </w:pPr>
       <w:r>
         <w:rPr>
-          <w:rFonts w:ascii="Arial Unicode MS" w:hAnsi="Arial Unicode MS" w:eastAsia="Arial Unicode MS"/>
+          <w:rFonts w:ascii="Noto Serif KR" w:hAnsi="Noto Serif KR" w:eastAsia="Noto Serif KR"/>
           <w:b w:val="0"/>
           <w:i w:val="0"/>
           <w:sz w:val="20"/>
@@ -481,7 +481,7 @@
       </w:pPr>
       <w:r>
         <w:rPr>
-          <w:rFonts w:ascii="Arial Unicode MS" w:hAnsi="Arial Unicode MS" w:eastAsia="Arial Unicode MS"/>
+          <w:rFonts w:ascii="Noto Serif KR" w:hAnsi="Noto Serif KR" w:eastAsia="Noto Serif KR"/>
           <w:b w:val="0"/>
           <w:i w:val="0"/>
           <w:sz w:val="20"/>
@@ -496,7 +496,7 @@
       </w:pPr>
       <w:r>
         <w:rPr>
-          <w:rFonts w:ascii="Arial Unicode MS" w:hAnsi="Arial Unicode MS" w:eastAsia="Arial Unicode MS"/>
+          <w:rFonts w:ascii="Noto Serif KR" w:hAnsi="Noto Serif KR" w:eastAsia="Noto Serif KR"/>
           <w:b w:val="0"/>
           <w:i w:val="0"/>
           <w:sz w:val="20"/>
@@ -510,7 +510,7 @@
       </w:pPr>
       <w:r>
         <w:rPr>
-          <w:rFonts w:ascii="Arial Unicode MS" w:hAnsi="Arial Unicode MS" w:eastAsia="Arial Unicode MS"/>
+          <w:rFonts w:ascii="Noto Serif KR" w:hAnsi="Noto Serif KR" w:eastAsia="Noto Serif KR"/>
           <w:b w:val="0"/>
           <w:i/>
           <w:color w:val="666666"/>
@@ -542,7 +542,7 @@
           <w:p>
             <w:r>
               <w:rPr>
-                <w:rFonts w:ascii="Arial Unicode MS" w:hAnsi="Arial Unicode MS" w:eastAsia="Arial Unicode MS"/>
+                <w:rFonts w:ascii="Noto Serif KR" w:hAnsi="Noto Serif KR" w:eastAsia="Noto Serif KR"/>
                 <w:b w:val="0"/>
                 <w:i w:val="0"/>
                 <w:sz w:val="20"/>
@@ -559,7 +559,7 @@
       </w:pPr>
       <w:r>
         <w:rPr>
-          <w:rFonts w:ascii="Arial Unicode MS" w:hAnsi="Arial Unicode MS" w:eastAsia="Arial Unicode MS"/>
+          <w:rFonts w:ascii="Noto Serif KR" w:hAnsi="Noto Serif KR" w:eastAsia="Noto Serif KR"/>
           <w:b w:val="0"/>
           <w:i w:val="0"/>
           <w:sz w:val="20"/>
@@ -567,7 +567,7 @@
       </w:r>
       <w:r>
         <w:rPr>
-          <w:rFonts w:ascii="Arial Unicode MS" w:hAnsi="Arial Unicode MS" w:eastAsia="Arial Unicode MS"/>
+          <w:rFonts w:ascii="Noto Serif KR" w:hAnsi="Noto Serif KR" w:eastAsia="Noto Serif KR"/>
           <w:b/>
           <w:i w:val="0"/>
           <w:sz w:val="21"/>
@@ -576,7 +576,7 @@
       </w:r>
       <w:r>
         <w:rPr>
-          <w:rFonts w:ascii="Arial Unicode MS" w:hAnsi="Arial Unicode MS" w:eastAsia="Arial Unicode MS"/>
+          <w:rFonts w:ascii="Noto Serif KR" w:hAnsi="Noto Serif KR" w:eastAsia="Noto Serif KR"/>
           <w:b w:val="0"/>
           <w:i w:val="0"/>
           <w:sz w:val="21"/>
@@ -591,7 +591,7 @@
       </w:pPr>
       <w:r>
         <w:rPr>
-          <w:rFonts w:ascii="Arial Unicode MS" w:hAnsi="Arial Unicode MS" w:eastAsia="Arial Unicode MS"/>
+          <w:rFonts w:ascii="Noto Serif KR" w:hAnsi="Noto Serif KR" w:eastAsia="Noto Serif KR"/>
           <w:b w:val="0"/>
           <w:i w:val="0"/>
           <w:sz w:val="20"/>
@@ -606,7 +606,7 @@
       </w:pPr>
       <w:r>
         <w:rPr>
-          <w:rFonts w:ascii="Arial Unicode MS" w:hAnsi="Arial Unicode MS" w:eastAsia="Arial Unicode MS"/>
+          <w:rFonts w:ascii="Noto Serif KR" w:hAnsi="Noto Serif KR" w:eastAsia="Noto Serif KR"/>
           <w:b w:val="0"/>
           <w:i w:val="0"/>
           <w:sz w:val="20"/>
@@ -621,7 +621,7 @@
       </w:pPr>
       <w:r>
         <w:rPr>
-          <w:rFonts w:ascii="Arial Unicode MS" w:hAnsi="Arial Unicode MS" w:eastAsia="Arial Unicode MS"/>
+          <w:rFonts w:ascii="Noto Serif KR" w:hAnsi="Noto Serif KR" w:eastAsia="Noto Serif KR"/>
           <w:b w:val="0"/>
           <w:i w:val="0"/>
           <w:sz w:val="20"/>
@@ -636,7 +636,7 @@
       </w:pPr>
       <w:r>
         <w:rPr>
-          <w:rFonts w:ascii="Arial Unicode MS" w:hAnsi="Arial Unicode MS" w:eastAsia="Arial Unicode MS"/>
+          <w:rFonts w:ascii="Noto Serif KR" w:hAnsi="Noto Serif KR" w:eastAsia="Noto Serif KR"/>
           <w:b w:val="0"/>
           <w:i w:val="0"/>
           <w:sz w:val="20"/>
@@ -650,7 +650,7 @@
       </w:pPr>
       <w:r>
         <w:rPr>
-          <w:rFonts w:ascii="Arial Unicode MS" w:hAnsi="Arial Unicode MS" w:eastAsia="Arial Unicode MS"/>
+          <w:rFonts w:ascii="Noto Serif KR" w:hAnsi="Noto Serif KR" w:eastAsia="Noto Serif KR"/>
           <w:b w:val="0"/>
           <w:i/>
           <w:color w:val="666666"/>
@@ -682,7 +682,7 @@
           <w:p>
             <w:r>
               <w:rPr>
-                <w:rFonts w:ascii="Arial Unicode MS" w:hAnsi="Arial Unicode MS" w:eastAsia="Arial Unicode MS"/>
+                <w:rFonts w:ascii="Noto Serif KR" w:hAnsi="Noto Serif KR" w:eastAsia="Noto Serif KR"/>
                 <w:b w:val="0"/>
                 <w:i w:val="0"/>
                 <w:sz w:val="20"/>
@@ -699,7 +699,7 @@
       </w:pPr>
       <w:r>
         <w:rPr>
-          <w:rFonts w:ascii="Arial Unicode MS" w:hAnsi="Arial Unicode MS" w:eastAsia="Arial Unicode MS"/>
+          <w:rFonts w:ascii="Noto Serif KR" w:hAnsi="Noto Serif KR" w:eastAsia="Noto Serif KR"/>
           <w:b w:val="0"/>
           <w:i w:val="0"/>
           <w:sz w:val="20"/>
@@ -707,7 +707,7 @@
       </w:r>
       <w:r>
         <w:rPr>
-          <w:rFonts w:ascii="Arial Unicode MS" w:hAnsi="Arial Unicode MS" w:eastAsia="Arial Unicode MS"/>
+          <w:rFonts w:ascii="Noto Serif KR" w:hAnsi="Noto Serif KR" w:eastAsia="Noto Serif KR"/>
           <w:b/>
           <w:i w:val="0"/>
           <w:sz w:val="21"/>
@@ -716,7 +716,7 @@
       </w:r>
       <w:r>
         <w:rPr>
-          <w:rFonts w:ascii="Arial Unicode MS" w:hAnsi="Arial Unicode MS" w:eastAsia="Arial Unicode MS"/>
+          <w:rFonts w:ascii="Noto Serif KR" w:hAnsi="Noto Serif KR" w:eastAsia="Noto Serif KR"/>
           <w:b w:val="0"/>
           <w:i w:val="0"/>
           <w:sz w:val="21"/>
@@ -731,7 +731,7 @@
       </w:pPr>
       <w:r>
         <w:rPr>
-          <w:rFonts w:ascii="Arial Unicode MS" w:hAnsi="Arial Unicode MS" w:eastAsia="Arial Unicode MS"/>
+          <w:rFonts w:ascii="Noto Serif KR" w:hAnsi="Noto Serif KR" w:eastAsia="Noto Serif KR"/>
           <w:b w:val="0"/>
           <w:i w:val="0"/>
           <w:sz w:val="20"/>
@@ -746,7 +746,7 @@
       </w:pPr>
       <w:r>
         <w:rPr>
-          <w:rFonts w:ascii="Arial Unicode MS" w:hAnsi="Arial Unicode MS" w:eastAsia="Arial Unicode MS"/>
+          <w:rFonts w:ascii="Noto Serif KR" w:hAnsi="Noto Serif KR" w:eastAsia="Noto Serif KR"/>
           <w:b w:val="0"/>
           <w:i w:val="0"/>
           <w:sz w:val="20"/>
@@ -761,7 +761,7 @@
       </w:pPr>
       <w:r>
         <w:rPr>
-          <w:rFonts w:ascii="Arial Unicode MS" w:hAnsi="Arial Unicode MS" w:eastAsia="Arial Unicode MS"/>
+          <w:rFonts w:ascii="Noto Serif KR" w:hAnsi="Noto Serif KR" w:eastAsia="Noto Serif KR"/>
           <w:b w:val="0"/>
           <w:i w:val="0"/>
           <w:sz w:val="20"/>
@@ -776,7 +776,7 @@
       </w:pPr>
       <w:r>
         <w:rPr>
-          <w:rFonts w:ascii="Arial Unicode MS" w:hAnsi="Arial Unicode MS" w:eastAsia="Arial Unicode MS"/>
+          <w:rFonts w:ascii="Noto Serif KR" w:hAnsi="Noto Serif KR" w:eastAsia="Noto Serif KR"/>
           <w:b w:val="0"/>
           <w:i w:val="0"/>
           <w:sz w:val="20"/>
@@ -790,7 +790,7 @@
       </w:pPr>
       <w:r>
         <w:rPr>
-          <w:rFonts w:ascii="Arial Unicode MS" w:hAnsi="Arial Unicode MS" w:eastAsia="Arial Unicode MS"/>
+          <w:rFonts w:ascii="Noto Serif KR" w:hAnsi="Noto Serif KR" w:eastAsia="Noto Serif KR"/>
           <w:b w:val="0"/>
           <w:i/>
           <w:color w:val="666666"/>
@@ -822,7 +822,7 @@
           <w:p>
             <w:r>
               <w:rPr>
-                <w:rFonts w:ascii="Arial Unicode MS" w:hAnsi="Arial Unicode MS" w:eastAsia="Arial Unicode MS"/>
+                <w:rFonts w:ascii="Noto Serif KR" w:hAnsi="Noto Serif KR" w:eastAsia="Noto Serif KR"/>
                 <w:b w:val="0"/>
                 <w:i w:val="0"/>
                 <w:sz w:val="20"/>
@@ -839,7 +839,7 @@
       </w:pPr>
       <w:r>
         <w:rPr>
-          <w:rFonts w:ascii="Arial Unicode MS" w:hAnsi="Arial Unicode MS" w:eastAsia="Arial Unicode MS"/>
+          <w:rFonts w:ascii="Noto Serif KR" w:hAnsi="Noto Serif KR" w:eastAsia="Noto Serif KR"/>
           <w:b/>
           <w:i w:val="0"/>
           <w:sz w:val="26"/>
@@ -853,7 +853,7 @@
       </w:pPr>
       <w:r>
         <w:rPr>
-          <w:rFonts w:ascii="Arial Unicode MS" w:hAnsi="Arial Unicode MS" w:eastAsia="Arial Unicode MS"/>
+          <w:rFonts w:ascii="Noto Serif KR" w:hAnsi="Noto Serif KR" w:eastAsia="Noto Serif KR"/>
           <w:b w:val="0"/>
           <w:i w:val="0"/>
           <w:sz w:val="20"/>
@@ -861,7 +861,7 @@
       </w:r>
       <w:r>
         <w:rPr>
-          <w:rFonts w:ascii="Arial Unicode MS" w:hAnsi="Arial Unicode MS" w:eastAsia="Arial Unicode MS"/>
+          <w:rFonts w:ascii="Noto Serif KR" w:hAnsi="Noto Serif KR" w:eastAsia="Noto Serif KR"/>
           <w:b/>
           <w:i w:val="0"/>
           <w:sz w:val="21"/>
@@ -870,7 +870,7 @@
       </w:r>
       <w:r>
         <w:rPr>
-          <w:rFonts w:ascii="Arial Unicode MS" w:hAnsi="Arial Unicode MS" w:eastAsia="Arial Unicode MS"/>
+          <w:rFonts w:ascii="Noto Serif KR" w:hAnsi="Noto Serif KR" w:eastAsia="Noto Serif KR"/>
           <w:b w:val="0"/>
           <w:i w:val="0"/>
           <w:sz w:val="21"/>
@@ -885,7 +885,7 @@
       </w:pPr>
       <w:r>
         <w:rPr>
-          <w:rFonts w:ascii="Arial Unicode MS" w:hAnsi="Arial Unicode MS" w:eastAsia="Arial Unicode MS"/>
+          <w:rFonts w:ascii="Noto Serif KR" w:hAnsi="Noto Serif KR" w:eastAsia="Noto Serif KR"/>
           <w:b w:val="0"/>
           <w:i w:val="0"/>
           <w:sz w:val="20"/>
@@ -900,7 +900,7 @@
       </w:pPr>
       <w:r>
         <w:rPr>
-          <w:rFonts w:ascii="Arial Unicode MS" w:hAnsi="Arial Unicode MS" w:eastAsia="Arial Unicode MS"/>
+          <w:rFonts w:ascii="Noto Serif KR" w:hAnsi="Noto Serif KR" w:eastAsia="Noto Serif KR"/>
           <w:b w:val="0"/>
           <w:i w:val="0"/>
           <w:sz w:val="20"/>
@@ -915,7 +915,7 @@
       </w:pPr>
       <w:r>
         <w:rPr>
-          <w:rFonts w:ascii="Arial Unicode MS" w:hAnsi="Arial Unicode MS" w:eastAsia="Arial Unicode MS"/>
+          <w:rFonts w:ascii="Noto Serif KR" w:hAnsi="Noto Serif KR" w:eastAsia="Noto Serif KR"/>
           <w:b w:val="0"/>
           <w:i w:val="0"/>
           <w:sz w:val="20"/>
@@ -930,7 +930,7 @@
       </w:pPr>
       <w:r>
         <w:rPr>
-          <w:rFonts w:ascii="Arial Unicode MS" w:hAnsi="Arial Unicode MS" w:eastAsia="Arial Unicode MS"/>
+          <w:rFonts w:ascii="Noto Serif KR" w:hAnsi="Noto Serif KR" w:eastAsia="Noto Serif KR"/>
           <w:b w:val="0"/>
           <w:i w:val="0"/>
           <w:sz w:val="20"/>
@@ -944,7 +944,7 @@
       </w:pPr>
       <w:r>
         <w:rPr>
-          <w:rFonts w:ascii="Arial Unicode MS" w:hAnsi="Arial Unicode MS" w:eastAsia="Arial Unicode MS"/>
+          <w:rFonts w:ascii="Noto Serif KR" w:hAnsi="Noto Serif KR" w:eastAsia="Noto Serif KR"/>
           <w:b w:val="0"/>
           <w:i/>
           <w:color w:val="666666"/>
@@ -976,7 +976,7 @@
           <w:p>
             <w:r>
               <w:rPr>
-                <w:rFonts w:ascii="Arial Unicode MS" w:hAnsi="Arial Unicode MS" w:eastAsia="Arial Unicode MS"/>
+                <w:rFonts w:ascii="Noto Serif KR" w:hAnsi="Noto Serif KR" w:eastAsia="Noto Serif KR"/>
                 <w:b w:val="0"/>
                 <w:i w:val="0"/>
                 <w:sz w:val="20"/>
@@ -993,7 +993,7 @@
       </w:pPr>
       <w:r>
         <w:rPr>
-          <w:rFonts w:ascii="Arial Unicode MS" w:hAnsi="Arial Unicode MS" w:eastAsia="Arial Unicode MS"/>
+          <w:rFonts w:ascii="Noto Serif KR" w:hAnsi="Noto Serif KR" w:eastAsia="Noto Serif KR"/>
           <w:b w:val="0"/>
           <w:i w:val="0"/>
           <w:sz w:val="20"/>
@@ -1001,7 +1001,7 @@
       </w:r>
       <w:r>
         <w:rPr>
-          <w:rFonts w:ascii="Arial Unicode MS" w:hAnsi="Arial Unicode MS" w:eastAsia="Arial Unicode MS"/>
+          <w:rFonts w:ascii="Noto Serif KR" w:hAnsi="Noto Serif KR" w:eastAsia="Noto Serif KR"/>
           <w:b/>
           <w:i w:val="0"/>
           <w:sz w:val="21"/>
@@ -1010,7 +1010,7 @@
       </w:r>
       <w:r>
         <w:rPr>
-          <w:rFonts w:ascii="Arial Unicode MS" w:hAnsi="Arial Unicode MS" w:eastAsia="Arial Unicode MS"/>
+          <w:rFonts w:ascii="Noto Serif KR" w:hAnsi="Noto Serif KR" w:eastAsia="Noto Serif KR"/>
           <w:b w:val="0"/>
           <w:i w:val="0"/>
           <w:sz w:val="21"/>
@@ -1025,7 +1025,7 @@
       </w:pPr>
       <w:r>
         <w:rPr>
-          <w:rFonts w:ascii="Arial Unicode MS" w:hAnsi="Arial Unicode MS" w:eastAsia="Arial Unicode MS"/>
+          <w:rFonts w:ascii="Noto Serif KR" w:hAnsi="Noto Serif KR" w:eastAsia="Noto Serif KR"/>
           <w:b w:val="0"/>
           <w:i w:val="0"/>
           <w:sz w:val="20"/>
@@ -1040,7 +1040,7 @@
       </w:pPr>
       <w:r>
         <w:rPr>
-          <w:rFonts w:ascii="Arial Unicode MS" w:hAnsi="Arial Unicode MS" w:eastAsia="Arial Unicode MS"/>
+          <w:rFonts w:ascii="Noto Serif KR" w:hAnsi="Noto Serif KR" w:eastAsia="Noto Serif KR"/>
           <w:b w:val="0"/>
           <w:i w:val="0"/>
           <w:sz w:val="20"/>
@@ -1055,7 +1055,7 @@
       </w:pPr>
       <w:r>
         <w:rPr>
-          <w:rFonts w:ascii="Arial Unicode MS" w:hAnsi="Arial Unicode MS" w:eastAsia="Arial Unicode MS"/>
+          <w:rFonts w:ascii="Noto Serif KR" w:hAnsi="Noto Serif KR" w:eastAsia="Noto Serif KR"/>
           <w:b w:val="0"/>
           <w:i w:val="0"/>
           <w:sz w:val="20"/>
@@ -1070,7 +1070,7 @@
       </w:pPr>
       <w:r>
         <w:rPr>
-          <w:rFonts w:ascii="Arial Unicode MS" w:hAnsi="Arial Unicode MS" w:eastAsia="Arial Unicode MS"/>
+          <w:rFonts w:ascii="Noto Serif KR" w:hAnsi="Noto Serif KR" w:eastAsia="Noto Serif KR"/>
           <w:b w:val="0"/>
           <w:i w:val="0"/>
           <w:sz w:val="20"/>
@@ -1084,7 +1084,7 @@
       </w:pPr>
       <w:r>
         <w:rPr>
-          <w:rFonts w:ascii="Arial Unicode MS" w:hAnsi="Arial Unicode MS" w:eastAsia="Arial Unicode MS"/>
+          <w:rFonts w:ascii="Noto Serif KR" w:hAnsi="Noto Serif KR" w:eastAsia="Noto Serif KR"/>
           <w:b w:val="0"/>
           <w:i/>
           <w:color w:val="666666"/>
@@ -1116,7 +1116,7 @@
           <w:p>
             <w:r>
               <w:rPr>
-                <w:rFonts w:ascii="Arial Unicode MS" w:hAnsi="Arial Unicode MS" w:eastAsia="Arial Unicode MS"/>
+                <w:rFonts w:ascii="Noto Serif KR" w:hAnsi="Noto Serif KR" w:eastAsia="Noto Serif KR"/>
                 <w:b w:val="0"/>
                 <w:i w:val="0"/>
                 <w:sz w:val="20"/>
@@ -1133,7 +1133,7 @@
       </w:pPr>
       <w:r>
         <w:rPr>
-          <w:rFonts w:ascii="Arial Unicode MS" w:hAnsi="Arial Unicode MS" w:eastAsia="Arial Unicode MS"/>
+          <w:rFonts w:ascii="Noto Serif KR" w:hAnsi="Noto Serif KR" w:eastAsia="Noto Serif KR"/>
           <w:b w:val="0"/>
           <w:i w:val="0"/>
           <w:sz w:val="20"/>
@@ -1141,7 +1141,7 @@
       </w:r>
       <w:r>
         <w:rPr>
-          <w:rFonts w:ascii="Arial Unicode MS" w:hAnsi="Arial Unicode MS" w:eastAsia="Arial Unicode MS"/>
+          <w:rFonts w:ascii="Noto Serif KR" w:hAnsi="Noto Serif KR" w:eastAsia="Noto Serif KR"/>
           <w:b/>
           <w:i w:val="0"/>
           <w:sz w:val="21"/>
@@ -1150,7 +1150,7 @@
       </w:r>
       <w:r>
         <w:rPr>
-          <w:rFonts w:ascii="Arial Unicode MS" w:hAnsi="Arial Unicode MS" w:eastAsia="Arial Unicode MS"/>
+          <w:rFonts w:ascii="Noto Serif KR" w:hAnsi="Noto Serif KR" w:eastAsia="Noto Serif KR"/>
           <w:b w:val="0"/>
           <w:i w:val="0"/>
           <w:sz w:val="21"/>
@@ -1165,7 +1165,7 @@
       </w:pPr>
       <w:r>
         <w:rPr>
-          <w:rFonts w:ascii="Arial Unicode MS" w:hAnsi="Arial Unicode MS" w:eastAsia="Arial Unicode MS"/>
+          <w:rFonts w:ascii="Noto Serif KR" w:hAnsi="Noto Serif KR" w:eastAsia="Noto Serif KR"/>
           <w:b w:val="0"/>
           <w:i w:val="0"/>
           <w:sz w:val="20"/>
@@ -1180,7 +1180,7 @@
       </w:pPr>
       <w:r>
         <w:rPr>
-          <w:rFonts w:ascii="Arial Unicode MS" w:hAnsi="Arial Unicode MS" w:eastAsia="Arial Unicode MS"/>
+          <w:rFonts w:ascii="Noto Serif KR" w:hAnsi="Noto Serif KR" w:eastAsia="Noto Serif KR"/>
           <w:b w:val="0"/>
           <w:i w:val="0"/>
           <w:sz w:val="20"/>
@@ -1195,7 +1195,7 @@
       </w:pPr>
       <w:r>
         <w:rPr>
-          <w:rFonts w:ascii="Arial Unicode MS" w:hAnsi="Arial Unicode MS" w:eastAsia="Arial Unicode MS"/>
+          <w:rFonts w:ascii="Noto Serif KR" w:hAnsi="Noto Serif KR" w:eastAsia="Noto Serif KR"/>
           <w:b w:val="0"/>
           <w:i w:val="0"/>
           <w:sz w:val="20"/>
@@ -1210,7 +1210,7 @@
       </w:pPr>
       <w:r>
         <w:rPr>
-          <w:rFonts w:ascii="Arial Unicode MS" w:hAnsi="Arial Unicode MS" w:eastAsia="Arial Unicode MS"/>
+          <w:rFonts w:ascii="Noto Serif KR" w:hAnsi="Noto Serif KR" w:eastAsia="Noto Serif KR"/>
           <w:b w:val="0"/>
           <w:i w:val="0"/>
           <w:sz w:val="20"/>
@@ -1224,7 +1224,7 @@
       </w:pPr>
       <w:r>
         <w:rPr>
-          <w:rFonts w:ascii="Arial Unicode MS" w:hAnsi="Arial Unicode MS" w:eastAsia="Arial Unicode MS"/>
+          <w:rFonts w:ascii="Noto Serif KR" w:hAnsi="Noto Serif KR" w:eastAsia="Noto Serif KR"/>
           <w:b w:val="0"/>
           <w:i/>
           <w:color w:val="666666"/>
@@ -1256,7 +1256,7 @@
           <w:p>
             <w:r>
               <w:rPr>
-                <w:rFonts w:ascii="Arial Unicode MS" w:hAnsi="Arial Unicode MS" w:eastAsia="Arial Unicode MS"/>
+                <w:rFonts w:ascii="Noto Serif KR" w:hAnsi="Noto Serif KR" w:eastAsia="Noto Serif KR"/>
                 <w:b w:val="0"/>
                 <w:i w:val="0"/>
                 <w:sz w:val="20"/>
@@ -1273,7 +1273,7 @@
       </w:pPr>
       <w:r>
         <w:rPr>
-          <w:rFonts w:ascii="Arial Unicode MS" w:hAnsi="Arial Unicode MS" w:eastAsia="Arial Unicode MS"/>
+          <w:rFonts w:ascii="Noto Serif KR" w:hAnsi="Noto Serif KR" w:eastAsia="Noto Serif KR"/>
           <w:b w:val="0"/>
           <w:i w:val="0"/>
           <w:sz w:val="20"/>
@@ -1281,7 +1281,7 @@
       </w:r>
       <w:r>
         <w:rPr>
-          <w:rFonts w:ascii="Arial Unicode MS" w:hAnsi="Arial Unicode MS" w:eastAsia="Arial Unicode MS"/>
+          <w:rFonts w:ascii="Noto Serif KR" w:hAnsi="Noto Serif KR" w:eastAsia="Noto Serif KR"/>
           <w:b/>
           <w:i w:val="0"/>
           <w:sz w:val="21"/>
@@ -1290,7 +1290,7 @@
       </w:r>
       <w:r>
         <w:rPr>
-          <w:rFonts w:ascii="Arial Unicode MS" w:hAnsi="Arial Unicode MS" w:eastAsia="Arial Unicode MS"/>
+          <w:rFonts w:ascii="Noto Serif KR" w:hAnsi="Noto Serif KR" w:eastAsia="Noto Serif KR"/>
           <w:b w:val="0"/>
           <w:i w:val="0"/>
           <w:sz w:val="21"/>
@@ -1305,7 +1305,7 @@
       </w:pPr>
       <w:r>
         <w:rPr>
-          <w:rFonts w:ascii="Arial Unicode MS" w:hAnsi="Arial Unicode MS" w:eastAsia="Arial Unicode MS"/>
+          <w:rFonts w:ascii="Noto Serif KR" w:hAnsi="Noto Serif KR" w:eastAsia="Noto Serif KR"/>
           <w:b w:val="0"/>
           <w:i w:val="0"/>
           <w:sz w:val="20"/>
@@ -1320,7 +1320,7 @@
       </w:pPr>
       <w:r>
         <w:rPr>
-          <w:rFonts w:ascii="Arial Unicode MS" w:hAnsi="Arial Unicode MS" w:eastAsia="Arial Unicode MS"/>
+          <w:rFonts w:ascii="Noto Serif KR" w:hAnsi="Noto Serif KR" w:eastAsia="Noto Serif KR"/>
           <w:b w:val="0"/>
           <w:i w:val="0"/>
           <w:sz w:val="20"/>
@@ -1335,7 +1335,7 @@
       </w:pPr>
       <w:r>
         <w:rPr>
-          <w:rFonts w:ascii="Arial Unicode MS" w:hAnsi="Arial Unicode MS" w:eastAsia="Arial Unicode MS"/>
+          <w:rFonts w:ascii="Noto Serif KR" w:hAnsi="Noto Serif KR" w:eastAsia="Noto Serif KR"/>
           <w:b w:val="0"/>
           <w:i w:val="0"/>
           <w:sz w:val="20"/>
@@ -1350,7 +1350,7 @@
       </w:pPr>
       <w:r>
         <w:rPr>
-          <w:rFonts w:ascii="Arial Unicode MS" w:hAnsi="Arial Unicode MS" w:eastAsia="Arial Unicode MS"/>
+          <w:rFonts w:ascii="Noto Serif KR" w:hAnsi="Noto Serif KR" w:eastAsia="Noto Serif KR"/>
           <w:b w:val="0"/>
           <w:i w:val="0"/>
           <w:sz w:val="20"/>
@@ -1364,7 +1364,7 @@
       </w:pPr>
       <w:r>
         <w:rPr>
-          <w:rFonts w:ascii="Arial Unicode MS" w:hAnsi="Arial Unicode MS" w:eastAsia="Arial Unicode MS"/>
+          <w:rFonts w:ascii="Noto Serif KR" w:hAnsi="Noto Serif KR" w:eastAsia="Noto Serif KR"/>
           <w:b w:val="0"/>
           <w:i/>
           <w:color w:val="666666"/>
@@ -1396,7 +1396,7 @@
           <w:p>
             <w:r>
               <w:rPr>
-                <w:rFonts w:ascii="Arial Unicode MS" w:hAnsi="Arial Unicode MS" w:eastAsia="Arial Unicode MS"/>
+                <w:rFonts w:ascii="Noto Serif KR" w:hAnsi="Noto Serif KR" w:eastAsia="Noto Serif KR"/>
                 <w:b w:val="0"/>
                 <w:i w:val="0"/>
                 <w:sz w:val="20"/>
@@ -1413,7 +1413,7 @@
       </w:pPr>
       <w:r>
         <w:rPr>
-          <w:rFonts w:ascii="Arial Unicode MS" w:hAnsi="Arial Unicode MS" w:eastAsia="Arial Unicode MS"/>
+          <w:rFonts w:ascii="Noto Serif KR" w:hAnsi="Noto Serif KR" w:eastAsia="Noto Serif KR"/>
           <w:b/>
           <w:i w:val="0"/>
           <w:sz w:val="26"/>
@@ -1427,7 +1427,7 @@
       </w:pPr>
       <w:r>
         <w:rPr>
-          <w:rFonts w:ascii="Arial Unicode MS" w:hAnsi="Arial Unicode MS" w:eastAsia="Arial Unicode MS"/>
+          <w:rFonts w:ascii="Noto Serif KR" w:hAnsi="Noto Serif KR" w:eastAsia="Noto Serif KR"/>
           <w:b w:val="0"/>
           <w:i w:val="0"/>
           <w:sz w:val="20"/>
@@ -1435,7 +1435,7 @@
       </w:r>
       <w:r>
         <w:rPr>
-          <w:rFonts w:ascii="Arial Unicode MS" w:hAnsi="Arial Unicode MS" w:eastAsia="Arial Unicode MS"/>
+          <w:rFonts w:ascii="Noto Serif KR" w:hAnsi="Noto Serif KR" w:eastAsia="Noto Serif KR"/>
           <w:b/>
           <w:i w:val="0"/>
           <w:sz w:val="21"/>
@@ -1444,7 +1444,7 @@
       </w:r>
       <w:r>
         <w:rPr>
-          <w:rFonts w:ascii="Arial Unicode MS" w:hAnsi="Arial Unicode MS" w:eastAsia="Arial Unicode MS"/>
+          <w:rFonts w:ascii="Noto Serif KR" w:hAnsi="Noto Serif KR" w:eastAsia="Noto Serif KR"/>
           <w:b w:val="0"/>
           <w:i w:val="0"/>
           <w:sz w:val="21"/>
@@ -1454,12 +1454,27 @@
     </w:p>
     <w:p>
       <w:pPr>
+        <w:spacing w:before="0" w:after="60"/>
+      </w:pPr>
+      <w:r>
+        <w:rPr>
+          <w:rFonts w:ascii="Noto Serif KR" w:hAnsi="Noto Serif KR" w:eastAsia="Noto Serif KR"/>
+          <w:b w:val="0"/>
+          <w:i/>
+          <w:color w:val="666666"/>
+          <w:sz w:val="18"/>
+        </w:rPr>
+        <w:t>Choose the closest one.</w:t>
+      </w:r>
+    </w:p>
+    <w:p>
+      <w:pPr>
         <w:spacing w:before="0" w:after="40"/>
         <w:ind w:left="288"/>
       </w:pPr>
       <w:r>
         <w:rPr>
-          <w:rFonts w:ascii="Arial Unicode MS" w:hAnsi="Arial Unicode MS" w:eastAsia="Arial Unicode MS"/>
+          <w:rFonts w:ascii="Noto Serif KR" w:hAnsi="Noto Serif KR" w:eastAsia="Noto Serif KR"/>
           <w:b w:val="0"/>
           <w:i w:val="0"/>
           <w:sz w:val="20"/>
@@ -1474,7 +1489,7 @@
       </w:pPr>
       <w:r>
         <w:rPr>
-          <w:rFonts w:ascii="Arial Unicode MS" w:hAnsi="Arial Unicode MS" w:eastAsia="Arial Unicode MS"/>
+          <w:rFonts w:ascii="Noto Serif KR" w:hAnsi="Noto Serif KR" w:eastAsia="Noto Serif KR"/>
           <w:b w:val="0"/>
           <w:i w:val="0"/>
           <w:sz w:val="20"/>
@@ -1489,7 +1504,7 @@
       </w:pPr>
       <w:r>
         <w:rPr>
-          <w:rFonts w:ascii="Arial Unicode MS" w:hAnsi="Arial Unicode MS" w:eastAsia="Arial Unicode MS"/>
+          <w:rFonts w:ascii="Noto Serif KR" w:hAnsi="Noto Serif KR" w:eastAsia="Noto Serif KR"/>
           <w:b w:val="0"/>
           <w:i w:val="0"/>
           <w:sz w:val="20"/>
@@ -1504,7 +1519,7 @@
       </w:pPr>
       <w:r>
         <w:rPr>
-          <w:rFonts w:ascii="Arial Unicode MS" w:hAnsi="Arial Unicode MS" w:eastAsia="Arial Unicode MS"/>
+          <w:rFonts w:ascii="Noto Serif KR" w:hAnsi="Noto Serif KR" w:eastAsia="Noto Serif KR"/>
           <w:b w:val="0"/>
           <w:i w:val="0"/>
           <w:sz w:val="20"/>
@@ -1518,7 +1533,7 @@
       </w:pPr>
       <w:r>
         <w:rPr>
-          <w:rFonts w:ascii="Arial Unicode MS" w:hAnsi="Arial Unicode MS" w:eastAsia="Arial Unicode MS"/>
+          <w:rFonts w:ascii="Noto Serif KR" w:hAnsi="Noto Serif KR" w:eastAsia="Noto Serif KR"/>
           <w:b w:val="0"/>
           <w:i/>
           <w:color w:val="666666"/>
@@ -1550,7 +1565,7 @@
           <w:p>
             <w:r>
               <w:rPr>
-                <w:rFonts w:ascii="Arial Unicode MS" w:hAnsi="Arial Unicode MS" w:eastAsia="Arial Unicode MS"/>
+                <w:rFonts w:ascii="Noto Serif KR" w:hAnsi="Noto Serif KR" w:eastAsia="Noto Serif KR"/>
                 <w:b w:val="0"/>
                 <w:i w:val="0"/>
                 <w:sz w:val="20"/>
@@ -1567,7 +1582,7 @@
       </w:pPr>
       <w:r>
         <w:rPr>
-          <w:rFonts w:ascii="Arial Unicode MS" w:hAnsi="Arial Unicode MS" w:eastAsia="Arial Unicode MS"/>
+          <w:rFonts w:ascii="Noto Serif KR" w:hAnsi="Noto Serif KR" w:eastAsia="Noto Serif KR"/>
           <w:b w:val="0"/>
           <w:i w:val="0"/>
           <w:sz w:val="20"/>
@@ -1575,7 +1590,7 @@
       </w:r>
       <w:r>
         <w:rPr>
-          <w:rFonts w:ascii="Arial Unicode MS" w:hAnsi="Arial Unicode MS" w:eastAsia="Arial Unicode MS"/>
+          <w:rFonts w:ascii="Noto Serif KR" w:hAnsi="Noto Serif KR" w:eastAsia="Noto Serif KR"/>
           <w:b/>
           <w:i w:val="0"/>
           <w:sz w:val="21"/>
@@ -1584,7 +1599,7 @@
       </w:r>
       <w:r>
         <w:rPr>
-          <w:rFonts w:ascii="Arial Unicode MS" w:hAnsi="Arial Unicode MS" w:eastAsia="Arial Unicode MS"/>
+          <w:rFonts w:ascii="Noto Serif KR" w:hAnsi="Noto Serif KR" w:eastAsia="Noto Serif KR"/>
           <w:b w:val="0"/>
           <w:i w:val="0"/>
           <w:sz w:val="21"/>
@@ -1599,7 +1614,7 @@
       </w:pPr>
       <w:r>
         <w:rPr>
-          <w:rFonts w:ascii="Arial Unicode MS" w:hAnsi="Arial Unicode MS" w:eastAsia="Arial Unicode MS"/>
+          <w:rFonts w:ascii="Noto Serif KR" w:hAnsi="Noto Serif KR" w:eastAsia="Noto Serif KR"/>
           <w:b w:val="0"/>
           <w:i w:val="0"/>
           <w:sz w:val="20"/>
@@ -1614,7 +1629,7 @@
       </w:pPr>
       <w:r>
         <w:rPr>
-          <w:rFonts w:ascii="Arial Unicode MS" w:hAnsi="Arial Unicode MS" w:eastAsia="Arial Unicode MS"/>
+          <w:rFonts w:ascii="Noto Serif KR" w:hAnsi="Noto Serif KR" w:eastAsia="Noto Serif KR"/>
           <w:b w:val="0"/>
           <w:i w:val="0"/>
           <w:sz w:val="20"/>
@@ -1629,7 +1644,7 @@
       </w:pPr>
       <w:r>
         <w:rPr>
-          <w:rFonts w:ascii="Arial Unicode MS" w:hAnsi="Arial Unicode MS" w:eastAsia="Arial Unicode MS"/>
+          <w:rFonts w:ascii="Noto Serif KR" w:hAnsi="Noto Serif KR" w:eastAsia="Noto Serif KR"/>
           <w:b w:val="0"/>
           <w:i w:val="0"/>
           <w:sz w:val="20"/>
@@ -1644,7 +1659,7 @@
       </w:pPr>
       <w:r>
         <w:rPr>
-          <w:rFonts w:ascii="Arial Unicode MS" w:hAnsi="Arial Unicode MS" w:eastAsia="Arial Unicode MS"/>
+          <w:rFonts w:ascii="Noto Serif KR" w:hAnsi="Noto Serif KR" w:eastAsia="Noto Serif KR"/>
           <w:b w:val="0"/>
           <w:i w:val="0"/>
           <w:sz w:val="20"/>
@@ -1658,7 +1673,7 @@
       </w:pPr>
       <w:r>
         <w:rPr>
-          <w:rFonts w:ascii="Arial Unicode MS" w:hAnsi="Arial Unicode MS" w:eastAsia="Arial Unicode MS"/>
+          <w:rFonts w:ascii="Noto Serif KR" w:hAnsi="Noto Serif KR" w:eastAsia="Noto Serif KR"/>
           <w:b w:val="0"/>
           <w:i/>
           <w:color w:val="666666"/>
@@ -1690,7 +1705,7 @@
           <w:p>
             <w:r>
               <w:rPr>
-                <w:rFonts w:ascii="Arial Unicode MS" w:hAnsi="Arial Unicode MS" w:eastAsia="Arial Unicode MS"/>
+                <w:rFonts w:ascii="Noto Serif KR" w:hAnsi="Noto Serif KR" w:eastAsia="Noto Serif KR"/>
                 <w:b w:val="0"/>
                 <w:i w:val="0"/>
                 <w:sz w:val="20"/>
@@ -1707,7 +1722,7 @@
       </w:pPr>
       <w:r>
         <w:rPr>
-          <w:rFonts w:ascii="Arial Unicode MS" w:hAnsi="Arial Unicode MS" w:eastAsia="Arial Unicode MS"/>
+          <w:rFonts w:ascii="Noto Serif KR" w:hAnsi="Noto Serif KR" w:eastAsia="Noto Serif KR"/>
           <w:b w:val="0"/>
           <w:i w:val="0"/>
           <w:sz w:val="20"/>
@@ -1715,7 +1730,7 @@
       </w:r>
       <w:r>
         <w:rPr>
-          <w:rFonts w:ascii="Arial Unicode MS" w:hAnsi="Arial Unicode MS" w:eastAsia="Arial Unicode MS"/>
+          <w:rFonts w:ascii="Noto Serif KR" w:hAnsi="Noto Serif KR" w:eastAsia="Noto Serif KR"/>
           <w:b/>
           <w:i w:val="0"/>
           <w:sz w:val="21"/>
@@ -1724,7 +1739,7 @@
       </w:r>
       <w:r>
         <w:rPr>
-          <w:rFonts w:ascii="Arial Unicode MS" w:hAnsi="Arial Unicode MS" w:eastAsia="Arial Unicode MS"/>
+          <w:rFonts w:ascii="Noto Serif KR" w:hAnsi="Noto Serif KR" w:eastAsia="Noto Serif KR"/>
           <w:b w:val="0"/>
           <w:i w:val="0"/>
           <w:sz w:val="21"/>
@@ -1739,7 +1754,7 @@
       </w:pPr>
       <w:r>
         <w:rPr>
-          <w:rFonts w:ascii="Arial Unicode MS" w:hAnsi="Arial Unicode MS" w:eastAsia="Arial Unicode MS"/>
+          <w:rFonts w:ascii="Noto Serif KR" w:hAnsi="Noto Serif KR" w:eastAsia="Noto Serif KR"/>
           <w:b w:val="0"/>
           <w:i w:val="0"/>
           <w:sz w:val="20"/>
@@ -1754,7 +1769,7 @@
       </w:pPr>
       <w:r>
         <w:rPr>
-          <w:rFonts w:ascii="Arial Unicode MS" w:hAnsi="Arial Unicode MS" w:eastAsia="Arial Unicode MS"/>
+          <w:rFonts w:ascii="Noto Serif KR" w:hAnsi="Noto Serif KR" w:eastAsia="Noto Serif KR"/>
           <w:b w:val="0"/>
           <w:i w:val="0"/>
           <w:sz w:val="20"/>
@@ -1769,7 +1784,7 @@
       </w:pPr>
       <w:r>
         <w:rPr>
-          <w:rFonts w:ascii="Arial Unicode MS" w:hAnsi="Arial Unicode MS" w:eastAsia="Arial Unicode MS"/>
+          <w:rFonts w:ascii="Noto Serif KR" w:hAnsi="Noto Serif KR" w:eastAsia="Noto Serif KR"/>
           <w:b w:val="0"/>
           <w:i w:val="0"/>
           <w:sz w:val="20"/>
@@ -1784,7 +1799,7 @@
       </w:pPr>
       <w:r>
         <w:rPr>
-          <w:rFonts w:ascii="Arial Unicode MS" w:hAnsi="Arial Unicode MS" w:eastAsia="Arial Unicode MS"/>
+          <w:rFonts w:ascii="Noto Serif KR" w:hAnsi="Noto Serif KR" w:eastAsia="Noto Serif KR"/>
           <w:b w:val="0"/>
           <w:i w:val="0"/>
           <w:sz w:val="20"/>
@@ -1798,7 +1813,7 @@
       </w:pPr>
       <w:r>
         <w:rPr>
-          <w:rFonts w:ascii="Arial Unicode MS" w:hAnsi="Arial Unicode MS" w:eastAsia="Arial Unicode MS"/>
+          <w:rFonts w:ascii="Noto Serif KR" w:hAnsi="Noto Serif KR" w:eastAsia="Noto Serif KR"/>
           <w:b w:val="0"/>
           <w:i/>
           <w:color w:val="666666"/>
@@ -1830,7 +1845,7 @@
           <w:p>
             <w:r>
               <w:rPr>
-                <w:rFonts w:ascii="Arial Unicode MS" w:hAnsi="Arial Unicode MS" w:eastAsia="Arial Unicode MS"/>
+                <w:rFonts w:ascii="Noto Serif KR" w:hAnsi="Noto Serif KR" w:eastAsia="Noto Serif KR"/>
                 <w:b w:val="0"/>
                 <w:i w:val="0"/>
                 <w:sz w:val="20"/>
@@ -1847,7 +1862,7 @@
       </w:pPr>
       <w:r>
         <w:rPr>
-          <w:rFonts w:ascii="Arial Unicode MS" w:hAnsi="Arial Unicode MS" w:eastAsia="Arial Unicode MS"/>
+          <w:rFonts w:ascii="Noto Serif KR" w:hAnsi="Noto Serif KR" w:eastAsia="Noto Serif KR"/>
           <w:b w:val="0"/>
           <w:i w:val="0"/>
           <w:sz w:val="20"/>
@@ -1855,7 +1870,7 @@
       </w:r>
       <w:r>
         <w:rPr>
-          <w:rFonts w:ascii="Arial Unicode MS" w:hAnsi="Arial Unicode MS" w:eastAsia="Arial Unicode MS"/>
+          <w:rFonts w:ascii="Noto Serif KR" w:hAnsi="Noto Serif KR" w:eastAsia="Noto Serif KR"/>
           <w:b/>
           <w:i w:val="0"/>
           <w:sz w:val="21"/>
@@ -1864,7 +1879,7 @@
       </w:r>
       <w:r>
         <w:rPr>
-          <w:rFonts w:ascii="Arial Unicode MS" w:hAnsi="Arial Unicode MS" w:eastAsia="Arial Unicode MS"/>
+          <w:rFonts w:ascii="Noto Serif KR" w:hAnsi="Noto Serif KR" w:eastAsia="Noto Serif KR"/>
           <w:b w:val="0"/>
           <w:i w:val="0"/>
           <w:sz w:val="21"/>
@@ -1879,7 +1894,7 @@
       </w:pPr>
       <w:r>
         <w:rPr>
-          <w:rFonts w:ascii="Arial Unicode MS" w:hAnsi="Arial Unicode MS" w:eastAsia="Arial Unicode MS"/>
+          <w:rFonts w:ascii="Noto Serif KR" w:hAnsi="Noto Serif KR" w:eastAsia="Noto Serif KR"/>
           <w:b w:val="0"/>
           <w:i w:val="0"/>
           <w:sz w:val="20"/>
@@ -1894,7 +1909,7 @@
       </w:pPr>
       <w:r>
         <w:rPr>
-          <w:rFonts w:ascii="Arial Unicode MS" w:hAnsi="Arial Unicode MS" w:eastAsia="Arial Unicode MS"/>
+          <w:rFonts w:ascii="Noto Serif KR" w:hAnsi="Noto Serif KR" w:eastAsia="Noto Serif KR"/>
           <w:b w:val="0"/>
           <w:i w:val="0"/>
           <w:sz w:val="20"/>
@@ -1909,7 +1924,7 @@
       </w:pPr>
       <w:r>
         <w:rPr>
-          <w:rFonts w:ascii="Arial Unicode MS" w:hAnsi="Arial Unicode MS" w:eastAsia="Arial Unicode MS"/>
+          <w:rFonts w:ascii="Noto Serif KR" w:hAnsi="Noto Serif KR" w:eastAsia="Noto Serif KR"/>
           <w:b w:val="0"/>
           <w:i w:val="0"/>
           <w:sz w:val="20"/>
@@ -1924,7 +1939,7 @@
       </w:pPr>
       <w:r>
         <w:rPr>
-          <w:rFonts w:ascii="Arial Unicode MS" w:hAnsi="Arial Unicode MS" w:eastAsia="Arial Unicode MS"/>
+          <w:rFonts w:ascii="Noto Serif KR" w:hAnsi="Noto Serif KR" w:eastAsia="Noto Serif KR"/>
           <w:b w:val="0"/>
           <w:i w:val="0"/>
           <w:sz w:val="20"/>
@@ -1938,7 +1953,7 @@
       </w:pPr>
       <w:r>
         <w:rPr>
-          <w:rFonts w:ascii="Arial Unicode MS" w:hAnsi="Arial Unicode MS" w:eastAsia="Arial Unicode MS"/>
+          <w:rFonts w:ascii="Noto Serif KR" w:hAnsi="Noto Serif KR" w:eastAsia="Noto Serif KR"/>
           <w:b w:val="0"/>
           <w:i/>
           <w:color w:val="666666"/>
@@ -1970,7 +1985,7 @@
           <w:p>
             <w:r>
               <w:rPr>
-                <w:rFonts w:ascii="Arial Unicode MS" w:hAnsi="Arial Unicode MS" w:eastAsia="Arial Unicode MS"/>
+                <w:rFonts w:ascii="Noto Serif KR" w:hAnsi="Noto Serif KR" w:eastAsia="Noto Serif KR"/>
                 <w:b w:val="0"/>
                 <w:i w:val="0"/>
                 <w:sz w:val="20"/>
@@ -1987,7 +2002,7 @@
       </w:pPr>
       <w:r>
         <w:rPr>
-          <w:rFonts w:ascii="Arial Unicode MS" w:hAnsi="Arial Unicode MS" w:eastAsia="Arial Unicode MS"/>
+          <w:rFonts w:ascii="Noto Serif KR" w:hAnsi="Noto Serif KR" w:eastAsia="Noto Serif KR"/>
           <w:b/>
           <w:i w:val="0"/>
           <w:sz w:val="26"/>
@@ -2001,7 +2016,7 @@
       </w:pPr>
       <w:r>
         <w:rPr>
-          <w:rFonts w:ascii="Arial Unicode MS" w:hAnsi="Arial Unicode MS" w:eastAsia="Arial Unicode MS"/>
+          <w:rFonts w:ascii="Noto Serif KR" w:hAnsi="Noto Serif KR" w:eastAsia="Noto Serif KR"/>
           <w:b w:val="0"/>
           <w:i w:val="0"/>
           <w:sz w:val="20"/>
@@ -2009,7 +2024,7 @@
       </w:r>
       <w:r>
         <w:rPr>
-          <w:rFonts w:ascii="Arial Unicode MS" w:hAnsi="Arial Unicode MS" w:eastAsia="Arial Unicode MS"/>
+          <w:rFonts w:ascii="Noto Serif KR" w:hAnsi="Noto Serif KR" w:eastAsia="Noto Serif KR"/>
           <w:b/>
           <w:i w:val="0"/>
           <w:sz w:val="21"/>
@@ -2018,7 +2033,7 @@
       </w:r>
       <w:r>
         <w:rPr>
-          <w:rFonts w:ascii="Arial Unicode MS" w:hAnsi="Arial Unicode MS" w:eastAsia="Arial Unicode MS"/>
+          <w:rFonts w:ascii="Noto Serif KR" w:hAnsi="Noto Serif KR" w:eastAsia="Noto Serif KR"/>
           <w:b w:val="0"/>
           <w:i w:val="0"/>
           <w:sz w:val="21"/>
@@ -2033,7 +2048,7 @@
       </w:pPr>
       <w:r>
         <w:rPr>
-          <w:rFonts w:ascii="Arial Unicode MS" w:hAnsi="Arial Unicode MS" w:eastAsia="Arial Unicode MS"/>
+          <w:rFonts w:ascii="Noto Serif KR" w:hAnsi="Noto Serif KR" w:eastAsia="Noto Serif KR"/>
           <w:b w:val="0"/>
           <w:i w:val="0"/>
           <w:sz w:val="20"/>
@@ -2048,7 +2063,7 @@
       </w:pPr>
       <w:r>
         <w:rPr>
-          <w:rFonts w:ascii="Arial Unicode MS" w:hAnsi="Arial Unicode MS" w:eastAsia="Arial Unicode MS"/>
+          <w:rFonts w:ascii="Noto Serif KR" w:hAnsi="Noto Serif KR" w:eastAsia="Noto Serif KR"/>
           <w:b w:val="0"/>
           <w:i w:val="0"/>
           <w:sz w:val="20"/>
@@ -2063,7 +2078,7 @@
       </w:pPr>
       <w:r>
         <w:rPr>
-          <w:rFonts w:ascii="Arial Unicode MS" w:hAnsi="Arial Unicode MS" w:eastAsia="Arial Unicode MS"/>
+          <w:rFonts w:ascii="Noto Serif KR" w:hAnsi="Noto Serif KR" w:eastAsia="Noto Serif KR"/>
           <w:b w:val="0"/>
           <w:i w:val="0"/>
           <w:sz w:val="20"/>
@@ -2078,7 +2093,7 @@
       </w:pPr>
       <w:r>
         <w:rPr>
-          <w:rFonts w:ascii="Arial Unicode MS" w:hAnsi="Arial Unicode MS" w:eastAsia="Arial Unicode MS"/>
+          <w:rFonts w:ascii="Noto Serif KR" w:hAnsi="Noto Serif KR" w:eastAsia="Noto Serif KR"/>
           <w:b w:val="0"/>
           <w:i w:val="0"/>
           <w:sz w:val="20"/>
@@ -2092,7 +2107,7 @@
       </w:pPr>
       <w:r>
         <w:rPr>
-          <w:rFonts w:ascii="Arial Unicode MS" w:hAnsi="Arial Unicode MS" w:eastAsia="Arial Unicode MS"/>
+          <w:rFonts w:ascii="Noto Serif KR" w:hAnsi="Noto Serif KR" w:eastAsia="Noto Serif KR"/>
           <w:b w:val="0"/>
           <w:i/>
           <w:color w:val="666666"/>
@@ -2124,7 +2139,7 @@
           <w:p>
             <w:r>
               <w:rPr>
-                <w:rFonts w:ascii="Arial Unicode MS" w:hAnsi="Arial Unicode MS" w:eastAsia="Arial Unicode MS"/>
+                <w:rFonts w:ascii="Noto Serif KR" w:hAnsi="Noto Serif KR" w:eastAsia="Noto Serif KR"/>
                 <w:b w:val="0"/>
                 <w:i w:val="0"/>
                 <w:sz w:val="20"/>
@@ -2141,7 +2156,7 @@
       </w:pPr>
       <w:r>
         <w:rPr>
-          <w:rFonts w:ascii="Arial Unicode MS" w:hAnsi="Arial Unicode MS" w:eastAsia="Arial Unicode MS"/>
+          <w:rFonts w:ascii="Noto Serif KR" w:hAnsi="Noto Serif KR" w:eastAsia="Noto Serif KR"/>
           <w:b w:val="0"/>
           <w:i w:val="0"/>
           <w:sz w:val="20"/>
@@ -2149,7 +2164,7 @@
       </w:r>
       <w:r>
         <w:rPr>
-          <w:rFonts w:ascii="Arial Unicode MS" w:hAnsi="Arial Unicode MS" w:eastAsia="Arial Unicode MS"/>
+          <w:rFonts w:ascii="Noto Serif KR" w:hAnsi="Noto Serif KR" w:eastAsia="Noto Serif KR"/>
           <w:b/>
           <w:i w:val="0"/>
           <w:sz w:val="21"/>
@@ -2158,7 +2173,7 @@
       </w:r>
       <w:r>
         <w:rPr>
-          <w:rFonts w:ascii="Arial Unicode MS" w:hAnsi="Arial Unicode MS" w:eastAsia="Arial Unicode MS"/>
+          <w:rFonts w:ascii="Noto Serif KR" w:hAnsi="Noto Serif KR" w:eastAsia="Noto Serif KR"/>
           <w:b w:val="0"/>
           <w:i w:val="0"/>
           <w:sz w:val="21"/>
@@ -2173,7 +2188,7 @@
       </w:pPr>
       <w:r>
         <w:rPr>
-          <w:rFonts w:ascii="Arial Unicode MS" w:hAnsi="Arial Unicode MS" w:eastAsia="Arial Unicode MS"/>
+          <w:rFonts w:ascii="Noto Serif KR" w:hAnsi="Noto Serif KR" w:eastAsia="Noto Serif KR"/>
           <w:b w:val="0"/>
           <w:i w:val="0"/>
           <w:sz w:val="20"/>
@@ -2188,7 +2203,7 @@
       </w:pPr>
       <w:r>
         <w:rPr>
-          <w:rFonts w:ascii="Arial Unicode MS" w:hAnsi="Arial Unicode MS" w:eastAsia="Arial Unicode MS"/>
+          <w:rFonts w:ascii="Noto Serif KR" w:hAnsi="Noto Serif KR" w:eastAsia="Noto Serif KR"/>
           <w:b w:val="0"/>
           <w:i w:val="0"/>
           <w:sz w:val="20"/>
@@ -2203,7 +2218,7 @@
       </w:pPr>
       <w:r>
         <w:rPr>
-          <w:rFonts w:ascii="Arial Unicode MS" w:hAnsi="Arial Unicode MS" w:eastAsia="Arial Unicode MS"/>
+          <w:rFonts w:ascii="Noto Serif KR" w:hAnsi="Noto Serif KR" w:eastAsia="Noto Serif KR"/>
           <w:b w:val="0"/>
           <w:i w:val="0"/>
           <w:sz w:val="20"/>
@@ -2218,7 +2233,7 @@
       </w:pPr>
       <w:r>
         <w:rPr>
-          <w:rFonts w:ascii="Arial Unicode MS" w:hAnsi="Arial Unicode MS" w:eastAsia="Arial Unicode MS"/>
+          <w:rFonts w:ascii="Noto Serif KR" w:hAnsi="Noto Serif KR" w:eastAsia="Noto Serif KR"/>
           <w:b w:val="0"/>
           <w:i w:val="0"/>
           <w:sz w:val="20"/>
@@ -2232,7 +2247,7 @@
       </w:pPr>
       <w:r>
         <w:rPr>
-          <w:rFonts w:ascii="Arial Unicode MS" w:hAnsi="Arial Unicode MS" w:eastAsia="Arial Unicode MS"/>
+          <w:rFonts w:ascii="Noto Serif KR" w:hAnsi="Noto Serif KR" w:eastAsia="Noto Serif KR"/>
           <w:b w:val="0"/>
           <w:i/>
           <w:color w:val="666666"/>
@@ -2264,7 +2279,7 @@
           <w:p>
             <w:r>
               <w:rPr>
-                <w:rFonts w:ascii="Arial Unicode MS" w:hAnsi="Arial Unicode MS" w:eastAsia="Arial Unicode MS"/>
+                <w:rFonts w:ascii="Noto Serif KR" w:hAnsi="Noto Serif KR" w:eastAsia="Noto Serif KR"/>
                 <w:b w:val="0"/>
                 <w:i w:val="0"/>
                 <w:sz w:val="20"/>
@@ -2282,7 +2297,7 @@
       </w:pPr>
       <w:r>
         <w:rPr>
-          <w:rFonts w:ascii="Arial Unicode MS" w:hAnsi="Arial Unicode MS" w:eastAsia="Arial Unicode MS"/>
+          <w:rFonts w:ascii="Noto Serif KR" w:hAnsi="Noto Serif KR" w:eastAsia="Noto Serif KR"/>
           <w:b/>
           <w:i w:val="0"/>
           <w:sz w:val="34"/>
@@ -2296,7 +2311,7 @@
       </w:pPr>
       <w:r>
         <w:rPr>
-          <w:rFonts w:ascii="Arial Unicode MS" w:hAnsi="Arial Unicode MS" w:eastAsia="Arial Unicode MS"/>
+          <w:rFonts w:ascii="Noto Serif KR" w:hAnsi="Noto Serif KR" w:eastAsia="Noto Serif KR"/>
           <w:b w:val="0"/>
           <w:i w:val="0"/>
           <w:color w:val="666666"/>
@@ -2311,7 +2326,7 @@
       </w:pPr>
       <w:r>
         <w:rPr>
-          <w:rFonts w:ascii="Arial Unicode MS" w:hAnsi="Arial Unicode MS" w:eastAsia="Arial Unicode MS"/>
+          <w:rFonts w:ascii="Noto Serif KR" w:hAnsi="Noto Serif KR" w:eastAsia="Noto Serif KR"/>
           <w:b/>
           <w:i w:val="0"/>
           <w:sz w:val="26"/>
@@ -2325,7 +2340,7 @@
       </w:pPr>
       <w:r>
         <w:rPr>
-          <w:rFonts w:ascii="Arial Unicode MS" w:hAnsi="Arial Unicode MS" w:eastAsia="Arial Unicode MS"/>
+          <w:rFonts w:ascii="Noto Serif KR" w:hAnsi="Noto Serif KR" w:eastAsia="Noto Serif KR"/>
           <w:b w:val="0"/>
           <w:i w:val="0"/>
           <w:sz w:val="20"/>
@@ -2333,7 +2348,7 @@
       </w:r>
       <w:r>
         <w:rPr>
-          <w:rFonts w:ascii="Arial Unicode MS" w:hAnsi="Arial Unicode MS" w:eastAsia="Arial Unicode MS"/>
+          <w:rFonts w:ascii="Noto Serif KR" w:hAnsi="Noto Serif KR" w:eastAsia="Noto Serif KR"/>
           <w:b/>
           <w:i w:val="0"/>
           <w:sz w:val="21"/>
@@ -2342,7 +2357,7 @@
       </w:r>
       <w:r>
         <w:rPr>
-          <w:rFonts w:ascii="Arial Unicode MS" w:hAnsi="Arial Unicode MS" w:eastAsia="Arial Unicode MS"/>
+          <w:rFonts w:ascii="Noto Serif KR" w:hAnsi="Noto Serif KR" w:eastAsia="Noto Serif KR"/>
           <w:b w:val="0"/>
           <w:i w:val="0"/>
           <w:sz w:val="21"/>
@@ -2357,7 +2372,7 @@
       </w:pPr>
       <w:r>
         <w:rPr>
-          <w:rFonts w:ascii="Arial Unicode MS" w:hAnsi="Arial Unicode MS" w:eastAsia="Arial Unicode MS"/>
+          <w:rFonts w:ascii="Noto Serif KR" w:hAnsi="Noto Serif KR" w:eastAsia="Noto Serif KR"/>
           <w:b w:val="0"/>
           <w:i w:val="0"/>
           <w:sz w:val="20"/>
@@ -2372,7 +2387,7 @@
       </w:pPr>
       <w:r>
         <w:rPr>
-          <w:rFonts w:ascii="Arial Unicode MS" w:hAnsi="Arial Unicode MS" w:eastAsia="Arial Unicode MS"/>
+          <w:rFonts w:ascii="Noto Serif KR" w:hAnsi="Noto Serif KR" w:eastAsia="Noto Serif KR"/>
           <w:b w:val="0"/>
           <w:i w:val="0"/>
           <w:sz w:val="20"/>
@@ -2387,7 +2402,7 @@
       </w:pPr>
       <w:r>
         <w:rPr>
-          <w:rFonts w:ascii="Arial Unicode MS" w:hAnsi="Arial Unicode MS" w:eastAsia="Arial Unicode MS"/>
+          <w:rFonts w:ascii="Noto Serif KR" w:hAnsi="Noto Serif KR" w:eastAsia="Noto Serif KR"/>
           <w:b w:val="0"/>
           <w:i w:val="0"/>
           <w:sz w:val="20"/>
@@ -2402,7 +2417,7 @@
       </w:pPr>
       <w:r>
         <w:rPr>
-          <w:rFonts w:ascii="Arial Unicode MS" w:hAnsi="Arial Unicode MS" w:eastAsia="Arial Unicode MS"/>
+          <w:rFonts w:ascii="Noto Serif KR" w:hAnsi="Noto Serif KR" w:eastAsia="Noto Serif KR"/>
           <w:b w:val="0"/>
           <w:i w:val="0"/>
           <w:sz w:val="20"/>
@@ -2416,7 +2431,7 @@
       </w:pPr>
       <w:r>
         <w:rPr>
-          <w:rFonts w:ascii="Arial Unicode MS" w:hAnsi="Arial Unicode MS" w:eastAsia="Arial Unicode MS"/>
+          <w:rFonts w:ascii="Noto Serif KR" w:hAnsi="Noto Serif KR" w:eastAsia="Noto Serif KR"/>
           <w:b w:val="0"/>
           <w:i/>
           <w:color w:val="666666"/>
@@ -2448,7 +2463,7 @@
           <w:p>
             <w:r>
               <w:rPr>
-                <w:rFonts w:ascii="Arial Unicode MS" w:hAnsi="Arial Unicode MS" w:eastAsia="Arial Unicode MS"/>
+                <w:rFonts w:ascii="Noto Serif KR" w:hAnsi="Noto Serif KR" w:eastAsia="Noto Serif KR"/>
                 <w:b w:val="0"/>
                 <w:i w:val="0"/>
                 <w:sz w:val="20"/>
@@ -2465,7 +2480,7 @@
       </w:pPr>
       <w:r>
         <w:rPr>
-          <w:rFonts w:ascii="Arial Unicode MS" w:hAnsi="Arial Unicode MS" w:eastAsia="Arial Unicode MS"/>
+          <w:rFonts w:ascii="Noto Serif KR" w:hAnsi="Noto Serif KR" w:eastAsia="Noto Serif KR"/>
           <w:b w:val="0"/>
           <w:i w:val="0"/>
           <w:sz w:val="20"/>
@@ -2473,7 +2488,7 @@
       </w:r>
       <w:r>
         <w:rPr>
-          <w:rFonts w:ascii="Arial Unicode MS" w:hAnsi="Arial Unicode MS" w:eastAsia="Arial Unicode MS"/>
+          <w:rFonts w:ascii="Noto Serif KR" w:hAnsi="Noto Serif KR" w:eastAsia="Noto Serif KR"/>
           <w:b/>
           <w:i w:val="0"/>
           <w:sz w:val="21"/>
@@ -2482,7 +2497,7 @@
       </w:r>
       <w:r>
         <w:rPr>
-          <w:rFonts w:ascii="Arial Unicode MS" w:hAnsi="Arial Unicode MS" w:eastAsia="Arial Unicode MS"/>
+          <w:rFonts w:ascii="Noto Serif KR" w:hAnsi="Noto Serif KR" w:eastAsia="Noto Serif KR"/>
           <w:b w:val="0"/>
           <w:i w:val="0"/>
           <w:sz w:val="21"/>
@@ -2497,7 +2512,7 @@
       </w:pPr>
       <w:r>
         <w:rPr>
-          <w:rFonts w:ascii="Arial Unicode MS" w:hAnsi="Arial Unicode MS" w:eastAsia="Arial Unicode MS"/>
+          <w:rFonts w:ascii="Noto Serif KR" w:hAnsi="Noto Serif KR" w:eastAsia="Noto Serif KR"/>
           <w:b w:val="0"/>
           <w:i w:val="0"/>
           <w:sz w:val="20"/>
@@ -2512,7 +2527,7 @@
       </w:pPr>
       <w:r>
         <w:rPr>
-          <w:rFonts w:ascii="Arial Unicode MS" w:hAnsi="Arial Unicode MS" w:eastAsia="Arial Unicode MS"/>
+          <w:rFonts w:ascii="Noto Serif KR" w:hAnsi="Noto Serif KR" w:eastAsia="Noto Serif KR"/>
           <w:b w:val="0"/>
           <w:i w:val="0"/>
           <w:sz w:val="20"/>
@@ -2527,7 +2542,7 @@
       </w:pPr>
       <w:r>
         <w:rPr>
-          <w:rFonts w:ascii="Arial Unicode MS" w:hAnsi="Arial Unicode MS" w:eastAsia="Arial Unicode MS"/>
+          <w:rFonts w:ascii="Noto Serif KR" w:hAnsi="Noto Serif KR" w:eastAsia="Noto Serif KR"/>
           <w:b w:val="0"/>
           <w:i w:val="0"/>
           <w:sz w:val="20"/>
@@ -2542,7 +2557,7 @@
       </w:pPr>
       <w:r>
         <w:rPr>
-          <w:rFonts w:ascii="Arial Unicode MS" w:hAnsi="Arial Unicode MS" w:eastAsia="Arial Unicode MS"/>
+          <w:rFonts w:ascii="Noto Serif KR" w:hAnsi="Noto Serif KR" w:eastAsia="Noto Serif KR"/>
           <w:b w:val="0"/>
           <w:i w:val="0"/>
           <w:sz w:val="20"/>
@@ -2556,7 +2571,7 @@
       </w:pPr>
       <w:r>
         <w:rPr>
-          <w:rFonts w:ascii="Arial Unicode MS" w:hAnsi="Arial Unicode MS" w:eastAsia="Arial Unicode MS"/>
+          <w:rFonts w:ascii="Noto Serif KR" w:hAnsi="Noto Serif KR" w:eastAsia="Noto Serif KR"/>
           <w:b w:val="0"/>
           <w:i/>
           <w:color w:val="666666"/>
@@ -2588,7 +2603,7 @@
           <w:p>
             <w:r>
               <w:rPr>
-                <w:rFonts w:ascii="Arial Unicode MS" w:hAnsi="Arial Unicode MS" w:eastAsia="Arial Unicode MS"/>
+                <w:rFonts w:ascii="Noto Serif KR" w:hAnsi="Noto Serif KR" w:eastAsia="Noto Serif KR"/>
                 <w:b w:val="0"/>
                 <w:i w:val="0"/>
                 <w:sz w:val="20"/>
@@ -2605,7 +2620,7 @@
       </w:pPr>
       <w:r>
         <w:rPr>
-          <w:rFonts w:ascii="Arial Unicode MS" w:hAnsi="Arial Unicode MS" w:eastAsia="Arial Unicode MS"/>
+          <w:rFonts w:ascii="Noto Serif KR" w:hAnsi="Noto Serif KR" w:eastAsia="Noto Serif KR"/>
           <w:b w:val="0"/>
           <w:i w:val="0"/>
           <w:sz w:val="20"/>
@@ -2613,7 +2628,7 @@
       </w:r>
       <w:r>
         <w:rPr>
-          <w:rFonts w:ascii="Arial Unicode MS" w:hAnsi="Arial Unicode MS" w:eastAsia="Arial Unicode MS"/>
+          <w:rFonts w:ascii="Noto Serif KR" w:hAnsi="Noto Serif KR" w:eastAsia="Noto Serif KR"/>
           <w:b/>
           <w:i w:val="0"/>
           <w:sz w:val="21"/>
@@ -2622,7 +2637,7 @@
       </w:r>
       <w:r>
         <w:rPr>
-          <w:rFonts w:ascii="Arial Unicode MS" w:hAnsi="Arial Unicode MS" w:eastAsia="Arial Unicode MS"/>
+          <w:rFonts w:ascii="Noto Serif KR" w:hAnsi="Noto Serif KR" w:eastAsia="Noto Serif KR"/>
           <w:b w:val="0"/>
           <w:i w:val="0"/>
           <w:sz w:val="21"/>
@@ -2637,7 +2652,7 @@
       </w:pPr>
       <w:r>
         <w:rPr>
-          <w:rFonts w:ascii="Arial Unicode MS" w:hAnsi="Arial Unicode MS" w:eastAsia="Arial Unicode MS"/>
+          <w:rFonts w:ascii="Noto Serif KR" w:hAnsi="Noto Serif KR" w:eastAsia="Noto Serif KR"/>
           <w:b w:val="0"/>
           <w:i w:val="0"/>
           <w:sz w:val="20"/>
@@ -2652,7 +2667,7 @@
       </w:pPr>
       <w:r>
         <w:rPr>
-          <w:rFonts w:ascii="Arial Unicode MS" w:hAnsi="Arial Unicode MS" w:eastAsia="Arial Unicode MS"/>
+          <w:rFonts w:ascii="Noto Serif KR" w:hAnsi="Noto Serif KR" w:eastAsia="Noto Serif KR"/>
           <w:b w:val="0"/>
           <w:i w:val="0"/>
           <w:sz w:val="20"/>
@@ -2667,7 +2682,7 @@
       </w:pPr>
       <w:r>
         <w:rPr>
-          <w:rFonts w:ascii="Arial Unicode MS" w:hAnsi="Arial Unicode MS" w:eastAsia="Arial Unicode MS"/>
+          <w:rFonts w:ascii="Noto Serif KR" w:hAnsi="Noto Serif KR" w:eastAsia="Noto Serif KR"/>
           <w:b w:val="0"/>
           <w:i w:val="0"/>
           <w:sz w:val="20"/>
@@ -2682,7 +2697,7 @@
       </w:pPr>
       <w:r>
         <w:rPr>
-          <w:rFonts w:ascii="Arial Unicode MS" w:hAnsi="Arial Unicode MS" w:eastAsia="Arial Unicode MS"/>
+          <w:rFonts w:ascii="Noto Serif KR" w:hAnsi="Noto Serif KR" w:eastAsia="Noto Serif KR"/>
           <w:b w:val="0"/>
           <w:i w:val="0"/>
           <w:sz w:val="20"/>
@@ -2696,7 +2711,7 @@
       </w:pPr>
       <w:r>
         <w:rPr>
-          <w:rFonts w:ascii="Arial Unicode MS" w:hAnsi="Arial Unicode MS" w:eastAsia="Arial Unicode MS"/>
+          <w:rFonts w:ascii="Noto Serif KR" w:hAnsi="Noto Serif KR" w:eastAsia="Noto Serif KR"/>
           <w:b w:val="0"/>
           <w:i/>
           <w:color w:val="666666"/>
@@ -2728,7 +2743,7 @@
           <w:p>
             <w:r>
               <w:rPr>
-                <w:rFonts w:ascii="Arial Unicode MS" w:hAnsi="Arial Unicode MS" w:eastAsia="Arial Unicode MS"/>
+                <w:rFonts w:ascii="Noto Serif KR" w:hAnsi="Noto Serif KR" w:eastAsia="Noto Serif KR"/>
                 <w:b w:val="0"/>
                 <w:i w:val="0"/>
                 <w:sz w:val="20"/>
@@ -2745,7 +2760,7 @@
       </w:pPr>
       <w:r>
         <w:rPr>
-          <w:rFonts w:ascii="Arial Unicode MS" w:hAnsi="Arial Unicode MS" w:eastAsia="Arial Unicode MS"/>
+          <w:rFonts w:ascii="Noto Serif KR" w:hAnsi="Noto Serif KR" w:eastAsia="Noto Serif KR"/>
           <w:b w:val="0"/>
           <w:i w:val="0"/>
           <w:sz w:val="20"/>
@@ -2753,7 +2768,7 @@
       </w:r>
       <w:r>
         <w:rPr>
-          <w:rFonts w:ascii="Arial Unicode MS" w:hAnsi="Arial Unicode MS" w:eastAsia="Arial Unicode MS"/>
+          <w:rFonts w:ascii="Noto Serif KR" w:hAnsi="Noto Serif KR" w:eastAsia="Noto Serif KR"/>
           <w:b/>
           <w:i w:val="0"/>
           <w:sz w:val="21"/>
@@ -2762,7 +2777,7 @@
       </w:r>
       <w:r>
         <w:rPr>
-          <w:rFonts w:ascii="Arial Unicode MS" w:hAnsi="Arial Unicode MS" w:eastAsia="Arial Unicode MS"/>
+          <w:rFonts w:ascii="Noto Serif KR" w:hAnsi="Noto Serif KR" w:eastAsia="Noto Serif KR"/>
           <w:b w:val="0"/>
           <w:i w:val="0"/>
           <w:sz w:val="21"/>
@@ -2777,7 +2792,7 @@
       </w:pPr>
       <w:r>
         <w:rPr>
-          <w:rFonts w:ascii="Arial Unicode MS" w:hAnsi="Arial Unicode MS" w:eastAsia="Arial Unicode MS"/>
+          <w:rFonts w:ascii="Noto Serif KR" w:hAnsi="Noto Serif KR" w:eastAsia="Noto Serif KR"/>
           <w:b w:val="0"/>
           <w:i w:val="0"/>
           <w:sz w:val="20"/>
@@ -2792,7 +2807,7 @@
       </w:pPr>
       <w:r>
         <w:rPr>
-          <w:rFonts w:ascii="Arial Unicode MS" w:hAnsi="Arial Unicode MS" w:eastAsia="Arial Unicode MS"/>
+          <w:rFonts w:ascii="Noto Serif KR" w:hAnsi="Noto Serif KR" w:eastAsia="Noto Serif KR"/>
           <w:b w:val="0"/>
           <w:i w:val="0"/>
           <w:sz w:val="20"/>
@@ -2807,7 +2822,7 @@
       </w:pPr>
       <w:r>
         <w:rPr>
-          <w:rFonts w:ascii="Arial Unicode MS" w:hAnsi="Arial Unicode MS" w:eastAsia="Arial Unicode MS"/>
+          <w:rFonts w:ascii="Noto Serif KR" w:hAnsi="Noto Serif KR" w:eastAsia="Noto Serif KR"/>
           <w:b w:val="0"/>
           <w:i w:val="0"/>
           <w:sz w:val="20"/>
@@ -2822,7 +2837,7 @@
       </w:pPr>
       <w:r>
         <w:rPr>
-          <w:rFonts w:ascii="Arial Unicode MS" w:hAnsi="Arial Unicode MS" w:eastAsia="Arial Unicode MS"/>
+          <w:rFonts w:ascii="Noto Serif KR" w:hAnsi="Noto Serif KR" w:eastAsia="Noto Serif KR"/>
           <w:b w:val="0"/>
           <w:i w:val="0"/>
           <w:sz w:val="20"/>
@@ -2836,7 +2851,7 @@
       </w:pPr>
       <w:r>
         <w:rPr>
-          <w:rFonts w:ascii="Arial Unicode MS" w:hAnsi="Arial Unicode MS" w:eastAsia="Arial Unicode MS"/>
+          <w:rFonts w:ascii="Noto Serif KR" w:hAnsi="Noto Serif KR" w:eastAsia="Noto Serif KR"/>
           <w:b w:val="0"/>
           <w:i/>
           <w:color w:val="666666"/>
@@ -2868,7 +2883,7 @@
           <w:p>
             <w:r>
               <w:rPr>
-                <w:rFonts w:ascii="Arial Unicode MS" w:hAnsi="Arial Unicode MS" w:eastAsia="Arial Unicode MS"/>
+                <w:rFonts w:ascii="Noto Serif KR" w:hAnsi="Noto Serif KR" w:eastAsia="Noto Serif KR"/>
                 <w:b w:val="0"/>
                 <w:i w:val="0"/>
                 <w:sz w:val="20"/>
@@ -2885,7 +2900,7 @@
       </w:pPr>
       <w:r>
         <w:rPr>
-          <w:rFonts w:ascii="Arial Unicode MS" w:hAnsi="Arial Unicode MS" w:eastAsia="Arial Unicode MS"/>
+          <w:rFonts w:ascii="Noto Serif KR" w:hAnsi="Noto Serif KR" w:eastAsia="Noto Serif KR"/>
           <w:b/>
           <w:i w:val="0"/>
           <w:sz w:val="26"/>
@@ -2899,7 +2914,7 @@
       </w:pPr>
       <w:r>
         <w:rPr>
-          <w:rFonts w:ascii="Arial Unicode MS" w:hAnsi="Arial Unicode MS" w:eastAsia="Arial Unicode MS"/>
+          <w:rFonts w:ascii="Noto Serif KR" w:hAnsi="Noto Serif KR" w:eastAsia="Noto Serif KR"/>
           <w:b w:val="0"/>
           <w:i w:val="0"/>
           <w:sz w:val="20"/>
@@ -2907,7 +2922,7 @@
       </w:r>
       <w:r>
         <w:rPr>
-          <w:rFonts w:ascii="Arial Unicode MS" w:hAnsi="Arial Unicode MS" w:eastAsia="Arial Unicode MS"/>
+          <w:rFonts w:ascii="Noto Serif KR" w:hAnsi="Noto Serif KR" w:eastAsia="Noto Serif KR"/>
           <w:b/>
           <w:i w:val="0"/>
           <w:sz w:val="21"/>
@@ -2916,7 +2931,7 @@
       </w:r>
       <w:r>
         <w:rPr>
-          <w:rFonts w:ascii="Arial Unicode MS" w:hAnsi="Arial Unicode MS" w:eastAsia="Arial Unicode MS"/>
+          <w:rFonts w:ascii="Noto Serif KR" w:hAnsi="Noto Serif KR" w:eastAsia="Noto Serif KR"/>
           <w:b w:val="0"/>
           <w:i w:val="0"/>
           <w:sz w:val="21"/>
@@ -2931,7 +2946,7 @@
       </w:pPr>
       <w:r>
         <w:rPr>
-          <w:rFonts w:ascii="Arial Unicode MS" w:hAnsi="Arial Unicode MS" w:eastAsia="Arial Unicode MS"/>
+          <w:rFonts w:ascii="Noto Serif KR" w:hAnsi="Noto Serif KR" w:eastAsia="Noto Serif KR"/>
           <w:b w:val="0"/>
           <w:i w:val="0"/>
           <w:sz w:val="20"/>
@@ -2946,7 +2961,7 @@
       </w:pPr>
       <w:r>
         <w:rPr>
-          <w:rFonts w:ascii="Arial Unicode MS" w:hAnsi="Arial Unicode MS" w:eastAsia="Arial Unicode MS"/>
+          <w:rFonts w:ascii="Noto Serif KR" w:hAnsi="Noto Serif KR" w:eastAsia="Noto Serif KR"/>
           <w:b w:val="0"/>
           <w:i w:val="0"/>
           <w:sz w:val="20"/>
@@ -2961,7 +2976,7 @@
       </w:pPr>
       <w:r>
         <w:rPr>
-          <w:rFonts w:ascii="Arial Unicode MS" w:hAnsi="Arial Unicode MS" w:eastAsia="Arial Unicode MS"/>
+          <w:rFonts w:ascii="Noto Serif KR" w:hAnsi="Noto Serif KR" w:eastAsia="Noto Serif KR"/>
           <w:b w:val="0"/>
           <w:i w:val="0"/>
           <w:sz w:val="20"/>
@@ -2976,7 +2991,7 @@
       </w:pPr>
       <w:r>
         <w:rPr>
-          <w:rFonts w:ascii="Arial Unicode MS" w:hAnsi="Arial Unicode MS" w:eastAsia="Arial Unicode MS"/>
+          <w:rFonts w:ascii="Noto Serif KR" w:hAnsi="Noto Serif KR" w:eastAsia="Noto Serif KR"/>
           <w:b w:val="0"/>
           <w:i w:val="0"/>
           <w:sz w:val="20"/>
@@ -2990,7 +3005,7 @@
       </w:pPr>
       <w:r>
         <w:rPr>
-          <w:rFonts w:ascii="Arial Unicode MS" w:hAnsi="Arial Unicode MS" w:eastAsia="Arial Unicode MS"/>
+          <w:rFonts w:ascii="Noto Serif KR" w:hAnsi="Noto Serif KR" w:eastAsia="Noto Serif KR"/>
           <w:b w:val="0"/>
           <w:i/>
           <w:color w:val="666666"/>
@@ -3022,7 +3037,7 @@
           <w:p>
             <w:r>
               <w:rPr>
-                <w:rFonts w:ascii="Arial Unicode MS" w:hAnsi="Arial Unicode MS" w:eastAsia="Arial Unicode MS"/>
+                <w:rFonts w:ascii="Noto Serif KR" w:hAnsi="Noto Serif KR" w:eastAsia="Noto Serif KR"/>
                 <w:b w:val="0"/>
                 <w:i w:val="0"/>
                 <w:sz w:val="20"/>
@@ -3039,7 +3054,7 @@
       </w:pPr>
       <w:r>
         <w:rPr>
-          <w:rFonts w:ascii="Arial Unicode MS" w:hAnsi="Arial Unicode MS" w:eastAsia="Arial Unicode MS"/>
+          <w:rFonts w:ascii="Noto Serif KR" w:hAnsi="Noto Serif KR" w:eastAsia="Noto Serif KR"/>
           <w:b w:val="0"/>
           <w:i w:val="0"/>
           <w:sz w:val="20"/>
@@ -3047,7 +3062,7 @@
       </w:r>
       <w:r>
         <w:rPr>
-          <w:rFonts w:ascii="Arial Unicode MS" w:hAnsi="Arial Unicode MS" w:eastAsia="Arial Unicode MS"/>
+          <w:rFonts w:ascii="Noto Serif KR" w:hAnsi="Noto Serif KR" w:eastAsia="Noto Serif KR"/>
           <w:b/>
           <w:i w:val="0"/>
           <w:sz w:val="21"/>
@@ -3056,7 +3071,7 @@
       </w:r>
       <w:r>
         <w:rPr>
-          <w:rFonts w:ascii="Arial Unicode MS" w:hAnsi="Arial Unicode MS" w:eastAsia="Arial Unicode MS"/>
+          <w:rFonts w:ascii="Noto Serif KR" w:hAnsi="Noto Serif KR" w:eastAsia="Noto Serif KR"/>
           <w:b w:val="0"/>
           <w:i w:val="0"/>
           <w:sz w:val="21"/>
@@ -3071,7 +3086,7 @@
       </w:pPr>
       <w:r>
         <w:rPr>
-          <w:rFonts w:ascii="Arial Unicode MS" w:hAnsi="Arial Unicode MS" w:eastAsia="Arial Unicode MS"/>
+          <w:rFonts w:ascii="Noto Serif KR" w:hAnsi="Noto Serif KR" w:eastAsia="Noto Serif KR"/>
           <w:b w:val="0"/>
           <w:i w:val="0"/>
           <w:sz w:val="20"/>
@@ -3086,7 +3101,7 @@
       </w:pPr>
       <w:r>
         <w:rPr>
-          <w:rFonts w:ascii="Arial Unicode MS" w:hAnsi="Arial Unicode MS" w:eastAsia="Arial Unicode MS"/>
+          <w:rFonts w:ascii="Noto Serif KR" w:hAnsi="Noto Serif KR" w:eastAsia="Noto Serif KR"/>
           <w:b w:val="0"/>
           <w:i w:val="0"/>
           <w:sz w:val="20"/>
@@ -3101,7 +3116,7 @@
       </w:pPr>
       <w:r>
         <w:rPr>
-          <w:rFonts w:ascii="Arial Unicode MS" w:hAnsi="Arial Unicode MS" w:eastAsia="Arial Unicode MS"/>
+          <w:rFonts w:ascii="Noto Serif KR" w:hAnsi="Noto Serif KR" w:eastAsia="Noto Serif KR"/>
           <w:b w:val="0"/>
           <w:i w:val="0"/>
           <w:sz w:val="20"/>
@@ -3116,7 +3131,7 @@
       </w:pPr>
       <w:r>
         <w:rPr>
-          <w:rFonts w:ascii="Arial Unicode MS" w:hAnsi="Arial Unicode MS" w:eastAsia="Arial Unicode MS"/>
+          <w:rFonts w:ascii="Noto Serif KR" w:hAnsi="Noto Serif KR" w:eastAsia="Noto Serif KR"/>
           <w:b w:val="0"/>
           <w:i w:val="0"/>
           <w:sz w:val="20"/>
@@ -3130,7 +3145,7 @@
       </w:pPr>
       <w:r>
         <w:rPr>
-          <w:rFonts w:ascii="Arial Unicode MS" w:hAnsi="Arial Unicode MS" w:eastAsia="Arial Unicode MS"/>
+          <w:rFonts w:ascii="Noto Serif KR" w:hAnsi="Noto Serif KR" w:eastAsia="Noto Serif KR"/>
           <w:b w:val="0"/>
           <w:i/>
           <w:color w:val="666666"/>
@@ -3162,7 +3177,7 @@
           <w:p>
             <w:r>
               <w:rPr>
-                <w:rFonts w:ascii="Arial Unicode MS" w:hAnsi="Arial Unicode MS" w:eastAsia="Arial Unicode MS"/>
+                <w:rFonts w:ascii="Noto Serif KR" w:hAnsi="Noto Serif KR" w:eastAsia="Noto Serif KR"/>
                 <w:b w:val="0"/>
                 <w:i w:val="0"/>
                 <w:sz w:val="20"/>
@@ -3179,7 +3194,7 @@
       </w:pPr>
       <w:r>
         <w:rPr>
-          <w:rFonts w:ascii="Arial Unicode MS" w:hAnsi="Arial Unicode MS" w:eastAsia="Arial Unicode MS"/>
+          <w:rFonts w:ascii="Noto Serif KR" w:hAnsi="Noto Serif KR" w:eastAsia="Noto Serif KR"/>
           <w:b w:val="0"/>
           <w:i w:val="0"/>
           <w:sz w:val="20"/>
@@ -3187,7 +3202,7 @@
       </w:r>
       <w:r>
         <w:rPr>
-          <w:rFonts w:ascii="Arial Unicode MS" w:hAnsi="Arial Unicode MS" w:eastAsia="Arial Unicode MS"/>
+          <w:rFonts w:ascii="Noto Serif KR" w:hAnsi="Noto Serif KR" w:eastAsia="Noto Serif KR"/>
           <w:b/>
           <w:i w:val="0"/>
           <w:sz w:val="21"/>
@@ -3196,7 +3211,7 @@
       </w:r>
       <w:r>
         <w:rPr>
-          <w:rFonts w:ascii="Arial Unicode MS" w:hAnsi="Arial Unicode MS" w:eastAsia="Arial Unicode MS"/>
+          <w:rFonts w:ascii="Noto Serif KR" w:hAnsi="Noto Serif KR" w:eastAsia="Noto Serif KR"/>
           <w:b w:val="0"/>
           <w:i w:val="0"/>
           <w:sz w:val="21"/>
@@ -3211,7 +3226,7 @@
       </w:pPr>
       <w:r>
         <w:rPr>
-          <w:rFonts w:ascii="Arial Unicode MS" w:hAnsi="Arial Unicode MS" w:eastAsia="Arial Unicode MS"/>
+          <w:rFonts w:ascii="Noto Serif KR" w:hAnsi="Noto Serif KR" w:eastAsia="Noto Serif KR"/>
           <w:b w:val="0"/>
           <w:i w:val="0"/>
           <w:sz w:val="20"/>
@@ -3226,7 +3241,7 @@
       </w:pPr>
       <w:r>
         <w:rPr>
-          <w:rFonts w:ascii="Arial Unicode MS" w:hAnsi="Arial Unicode MS" w:eastAsia="Arial Unicode MS"/>
+          <w:rFonts w:ascii="Noto Serif KR" w:hAnsi="Noto Serif KR" w:eastAsia="Noto Serif KR"/>
           <w:b w:val="0"/>
           <w:i w:val="0"/>
           <w:sz w:val="20"/>
@@ -3241,7 +3256,7 @@
       </w:pPr>
       <w:r>
         <w:rPr>
-          <w:rFonts w:ascii="Arial Unicode MS" w:hAnsi="Arial Unicode MS" w:eastAsia="Arial Unicode MS"/>
+          <w:rFonts w:ascii="Noto Serif KR" w:hAnsi="Noto Serif KR" w:eastAsia="Noto Serif KR"/>
           <w:b w:val="0"/>
           <w:i w:val="0"/>
           <w:sz w:val="20"/>
@@ -3256,7 +3271,7 @@
       </w:pPr>
       <w:r>
         <w:rPr>
-          <w:rFonts w:ascii="Arial Unicode MS" w:hAnsi="Arial Unicode MS" w:eastAsia="Arial Unicode MS"/>
+          <w:rFonts w:ascii="Noto Serif KR" w:hAnsi="Noto Serif KR" w:eastAsia="Noto Serif KR"/>
           <w:b w:val="0"/>
           <w:i w:val="0"/>
           <w:sz w:val="20"/>
@@ -3270,7 +3285,7 @@
       </w:pPr>
       <w:r>
         <w:rPr>
-          <w:rFonts w:ascii="Arial Unicode MS" w:hAnsi="Arial Unicode MS" w:eastAsia="Arial Unicode MS"/>
+          <w:rFonts w:ascii="Noto Serif KR" w:hAnsi="Noto Serif KR" w:eastAsia="Noto Serif KR"/>
           <w:b w:val="0"/>
           <w:i/>
           <w:color w:val="666666"/>
@@ -3302,7 +3317,7 @@
           <w:p>
             <w:r>
               <w:rPr>
-                <w:rFonts w:ascii="Arial Unicode MS" w:hAnsi="Arial Unicode MS" w:eastAsia="Arial Unicode MS"/>
+                <w:rFonts w:ascii="Noto Serif KR" w:hAnsi="Noto Serif KR" w:eastAsia="Noto Serif KR"/>
                 <w:b w:val="0"/>
                 <w:i w:val="0"/>
                 <w:sz w:val="20"/>
@@ -3319,7 +3334,7 @@
       </w:pPr>
       <w:r>
         <w:rPr>
-          <w:rFonts w:ascii="Arial Unicode MS" w:hAnsi="Arial Unicode MS" w:eastAsia="Arial Unicode MS"/>
+          <w:rFonts w:ascii="Noto Serif KR" w:hAnsi="Noto Serif KR" w:eastAsia="Noto Serif KR"/>
           <w:b w:val="0"/>
           <w:i w:val="0"/>
           <w:sz w:val="20"/>
@@ -3327,7 +3342,7 @@
       </w:r>
       <w:r>
         <w:rPr>
-          <w:rFonts w:ascii="Arial Unicode MS" w:hAnsi="Arial Unicode MS" w:eastAsia="Arial Unicode MS"/>
+          <w:rFonts w:ascii="Noto Serif KR" w:hAnsi="Noto Serif KR" w:eastAsia="Noto Serif KR"/>
           <w:b/>
           <w:i w:val="0"/>
           <w:sz w:val="21"/>
@@ -3336,7 +3351,7 @@
       </w:r>
       <w:r>
         <w:rPr>
-          <w:rFonts w:ascii="Arial Unicode MS" w:hAnsi="Arial Unicode MS" w:eastAsia="Arial Unicode MS"/>
+          <w:rFonts w:ascii="Noto Serif KR" w:hAnsi="Noto Serif KR" w:eastAsia="Noto Serif KR"/>
           <w:b w:val="0"/>
           <w:i w:val="0"/>
           <w:sz w:val="21"/>
@@ -3351,7 +3366,7 @@
       </w:pPr>
       <w:r>
         <w:rPr>
-          <w:rFonts w:ascii="Arial Unicode MS" w:hAnsi="Arial Unicode MS" w:eastAsia="Arial Unicode MS"/>
+          <w:rFonts w:ascii="Noto Serif KR" w:hAnsi="Noto Serif KR" w:eastAsia="Noto Serif KR"/>
           <w:b w:val="0"/>
           <w:i w:val="0"/>
           <w:sz w:val="20"/>
@@ -3366,7 +3381,7 @@
       </w:pPr>
       <w:r>
         <w:rPr>
-          <w:rFonts w:ascii="Arial Unicode MS" w:hAnsi="Arial Unicode MS" w:eastAsia="Arial Unicode MS"/>
+          <w:rFonts w:ascii="Noto Serif KR" w:hAnsi="Noto Serif KR" w:eastAsia="Noto Serif KR"/>
           <w:b w:val="0"/>
           <w:i w:val="0"/>
           <w:sz w:val="20"/>
@@ -3381,7 +3396,7 @@
       </w:pPr>
       <w:r>
         <w:rPr>
-          <w:rFonts w:ascii="Arial Unicode MS" w:hAnsi="Arial Unicode MS" w:eastAsia="Arial Unicode MS"/>
+          <w:rFonts w:ascii="Noto Serif KR" w:hAnsi="Noto Serif KR" w:eastAsia="Noto Serif KR"/>
           <w:b w:val="0"/>
           <w:i w:val="0"/>
           <w:sz w:val="20"/>
@@ -3396,7 +3411,7 @@
       </w:pPr>
       <w:r>
         <w:rPr>
-          <w:rFonts w:ascii="Arial Unicode MS" w:hAnsi="Arial Unicode MS" w:eastAsia="Arial Unicode MS"/>
+          <w:rFonts w:ascii="Noto Serif KR" w:hAnsi="Noto Serif KR" w:eastAsia="Noto Serif KR"/>
           <w:b w:val="0"/>
           <w:i w:val="0"/>
           <w:sz w:val="20"/>
@@ -3410,7 +3425,7 @@
       </w:pPr>
       <w:r>
         <w:rPr>
-          <w:rFonts w:ascii="Arial Unicode MS" w:hAnsi="Arial Unicode MS" w:eastAsia="Arial Unicode MS"/>
+          <w:rFonts w:ascii="Noto Serif KR" w:hAnsi="Noto Serif KR" w:eastAsia="Noto Serif KR"/>
           <w:b w:val="0"/>
           <w:i/>
           <w:color w:val="666666"/>
@@ -3442,7 +3457,7 @@
           <w:p>
             <w:r>
               <w:rPr>
-                <w:rFonts w:ascii="Arial Unicode MS" w:hAnsi="Arial Unicode MS" w:eastAsia="Arial Unicode MS"/>
+                <w:rFonts w:ascii="Noto Serif KR" w:hAnsi="Noto Serif KR" w:eastAsia="Noto Serif KR"/>
                 <w:b w:val="0"/>
                 <w:i w:val="0"/>
                 <w:sz w:val="20"/>
@@ -3459,7 +3474,7 @@
       </w:pPr>
       <w:r>
         <w:rPr>
-          <w:rFonts w:ascii="Arial Unicode MS" w:hAnsi="Arial Unicode MS" w:eastAsia="Arial Unicode MS"/>
+          <w:rFonts w:ascii="Noto Serif KR" w:hAnsi="Noto Serif KR" w:eastAsia="Noto Serif KR"/>
           <w:b/>
           <w:i w:val="0"/>
           <w:sz w:val="26"/>
@@ -3473,7 +3488,7 @@
       </w:pPr>
       <w:r>
         <w:rPr>
-          <w:rFonts w:ascii="Arial Unicode MS" w:hAnsi="Arial Unicode MS" w:eastAsia="Arial Unicode MS"/>
+          <w:rFonts w:ascii="Noto Serif KR" w:hAnsi="Noto Serif KR" w:eastAsia="Noto Serif KR"/>
           <w:b w:val="0"/>
           <w:i w:val="0"/>
           <w:sz w:val="20"/>
@@ -3481,7 +3496,7 @@
       </w:r>
       <w:r>
         <w:rPr>
-          <w:rFonts w:ascii="Arial Unicode MS" w:hAnsi="Arial Unicode MS" w:eastAsia="Arial Unicode MS"/>
+          <w:rFonts w:ascii="Noto Serif KR" w:hAnsi="Noto Serif KR" w:eastAsia="Noto Serif KR"/>
           <w:b/>
           <w:i w:val="0"/>
           <w:sz w:val="21"/>
@@ -3490,12 +3505,12 @@
       </w:r>
       <w:r>
         <w:rPr>
-          <w:rFonts w:ascii="Arial Unicode MS" w:hAnsi="Arial Unicode MS" w:eastAsia="Arial Unicode MS"/>
+          <w:rFonts w:ascii="Noto Serif KR" w:hAnsi="Noto Serif KR" w:eastAsia="Noto Serif KR"/>
           <w:b w:val="0"/>
           <w:i w:val="0"/>
           <w:sz w:val="21"/>
         </w:rPr>
-        <w:t>Have you tested whether the offering works under actual conditions in the initial target country?</w:t>
+        <w:t>Have you tested whether the offering works as intended in the real environment of the initial target country?</w:t>
       </w:r>
     </w:p>
     <w:p>
@@ -3505,7 +3520,7 @@
       </w:pPr>
       <w:r>
         <w:rPr>
-          <w:rFonts w:ascii="Arial Unicode MS" w:hAnsi="Arial Unicode MS" w:eastAsia="Arial Unicode MS"/>
+          <w:rFonts w:ascii="Noto Serif KR" w:hAnsi="Noto Serif KR" w:eastAsia="Noto Serif KR"/>
           <w:b w:val="0"/>
           <w:i w:val="0"/>
           <w:sz w:val="20"/>
@@ -3520,7 +3535,7 @@
       </w:pPr>
       <w:r>
         <w:rPr>
-          <w:rFonts w:ascii="Arial Unicode MS" w:hAnsi="Arial Unicode MS" w:eastAsia="Arial Unicode MS"/>
+          <w:rFonts w:ascii="Noto Serif KR" w:hAnsi="Noto Serif KR" w:eastAsia="Noto Serif KR"/>
           <w:b w:val="0"/>
           <w:i w:val="0"/>
           <w:sz w:val="20"/>
@@ -3535,7 +3550,7 @@
       </w:pPr>
       <w:r>
         <w:rPr>
-          <w:rFonts w:ascii="Arial Unicode MS" w:hAnsi="Arial Unicode MS" w:eastAsia="Arial Unicode MS"/>
+          <w:rFonts w:ascii="Noto Serif KR" w:hAnsi="Noto Serif KR" w:eastAsia="Noto Serif KR"/>
           <w:b w:val="0"/>
           <w:i w:val="0"/>
           <w:sz w:val="20"/>
@@ -3550,7 +3565,7 @@
       </w:pPr>
       <w:r>
         <w:rPr>
-          <w:rFonts w:ascii="Arial Unicode MS" w:hAnsi="Arial Unicode MS" w:eastAsia="Arial Unicode MS"/>
+          <w:rFonts w:ascii="Noto Serif KR" w:hAnsi="Noto Serif KR" w:eastAsia="Noto Serif KR"/>
           <w:b w:val="0"/>
           <w:i w:val="0"/>
           <w:sz w:val="20"/>
@@ -3564,7 +3579,7 @@
       </w:pPr>
       <w:r>
         <w:rPr>
-          <w:rFonts w:ascii="Arial Unicode MS" w:hAnsi="Arial Unicode MS" w:eastAsia="Arial Unicode MS"/>
+          <w:rFonts w:ascii="Noto Serif KR" w:hAnsi="Noto Serif KR" w:eastAsia="Noto Serif KR"/>
           <w:b w:val="0"/>
           <w:i/>
           <w:color w:val="666666"/>
@@ -3596,7 +3611,7 @@
           <w:p>
             <w:r>
               <w:rPr>
-                <w:rFonts w:ascii="Arial Unicode MS" w:hAnsi="Arial Unicode MS" w:eastAsia="Arial Unicode MS"/>
+                <w:rFonts w:ascii="Noto Serif KR" w:hAnsi="Noto Serif KR" w:eastAsia="Noto Serif KR"/>
                 <w:b w:val="0"/>
                 <w:i w:val="0"/>
                 <w:sz w:val="20"/>
@@ -3613,7 +3628,7 @@
       </w:pPr>
       <w:r>
         <w:rPr>
-          <w:rFonts w:ascii="Arial Unicode MS" w:hAnsi="Arial Unicode MS" w:eastAsia="Arial Unicode MS"/>
+          <w:rFonts w:ascii="Noto Serif KR" w:hAnsi="Noto Serif KR" w:eastAsia="Noto Serif KR"/>
           <w:b w:val="0"/>
           <w:i w:val="0"/>
           <w:sz w:val="20"/>
@@ -3621,7 +3636,7 @@
       </w:r>
       <w:r>
         <w:rPr>
-          <w:rFonts w:ascii="Arial Unicode MS" w:hAnsi="Arial Unicode MS" w:eastAsia="Arial Unicode MS"/>
+          <w:rFonts w:ascii="Noto Serif KR" w:hAnsi="Noto Serif KR" w:eastAsia="Noto Serif KR"/>
           <w:b/>
           <w:i w:val="0"/>
           <w:sz w:val="21"/>
@@ -3630,7 +3645,7 @@
       </w:r>
       <w:r>
         <w:rPr>
-          <w:rFonts w:ascii="Arial Unicode MS" w:hAnsi="Arial Unicode MS" w:eastAsia="Arial Unicode MS"/>
+          <w:rFonts w:ascii="Noto Serif KR" w:hAnsi="Noto Serif KR" w:eastAsia="Noto Serif KR"/>
           <w:b w:val="0"/>
           <w:i w:val="0"/>
           <w:sz w:val="21"/>
@@ -3645,7 +3660,7 @@
       </w:pPr>
       <w:r>
         <w:rPr>
-          <w:rFonts w:ascii="Arial Unicode MS" w:hAnsi="Arial Unicode MS" w:eastAsia="Arial Unicode MS"/>
+          <w:rFonts w:ascii="Noto Serif KR" w:hAnsi="Noto Serif KR" w:eastAsia="Noto Serif KR"/>
           <w:b w:val="0"/>
           <w:i w:val="0"/>
           <w:sz w:val="20"/>
@@ -3660,7 +3675,7 @@
       </w:pPr>
       <w:r>
         <w:rPr>
-          <w:rFonts w:ascii="Arial Unicode MS" w:hAnsi="Arial Unicode MS" w:eastAsia="Arial Unicode MS"/>
+          <w:rFonts w:ascii="Noto Serif KR" w:hAnsi="Noto Serif KR" w:eastAsia="Noto Serif KR"/>
           <w:b w:val="0"/>
           <w:i w:val="0"/>
           <w:sz w:val="20"/>
@@ -3675,7 +3690,7 @@
       </w:pPr>
       <w:r>
         <w:rPr>
-          <w:rFonts w:ascii="Arial Unicode MS" w:hAnsi="Arial Unicode MS" w:eastAsia="Arial Unicode MS"/>
+          <w:rFonts w:ascii="Noto Serif KR" w:hAnsi="Noto Serif KR" w:eastAsia="Noto Serif KR"/>
           <w:b w:val="0"/>
           <w:i w:val="0"/>
           <w:sz w:val="20"/>
@@ -3690,7 +3705,7 @@
       </w:pPr>
       <w:r>
         <w:rPr>
-          <w:rFonts w:ascii="Arial Unicode MS" w:hAnsi="Arial Unicode MS" w:eastAsia="Arial Unicode MS"/>
+          <w:rFonts w:ascii="Noto Serif KR" w:hAnsi="Noto Serif KR" w:eastAsia="Noto Serif KR"/>
           <w:b w:val="0"/>
           <w:i w:val="0"/>
           <w:sz w:val="20"/>
@@ -3704,7 +3719,7 @@
       </w:pPr>
       <w:r>
         <w:rPr>
-          <w:rFonts w:ascii="Arial Unicode MS" w:hAnsi="Arial Unicode MS" w:eastAsia="Arial Unicode MS"/>
+          <w:rFonts w:ascii="Noto Serif KR" w:hAnsi="Noto Serif KR" w:eastAsia="Noto Serif KR"/>
           <w:b w:val="0"/>
           <w:i/>
           <w:color w:val="666666"/>
@@ -3736,7 +3751,7 @@
           <w:p>
             <w:r>
               <w:rPr>
-                <w:rFonts w:ascii="Arial Unicode MS" w:hAnsi="Arial Unicode MS" w:eastAsia="Arial Unicode MS"/>
+                <w:rFonts w:ascii="Noto Serif KR" w:hAnsi="Noto Serif KR" w:eastAsia="Noto Serif KR"/>
                 <w:b w:val="0"/>
                 <w:i w:val="0"/>
                 <w:sz w:val="20"/>
@@ -3753,7 +3768,7 @@
       </w:pPr>
       <w:r>
         <w:rPr>
-          <w:rFonts w:ascii="Arial Unicode MS" w:hAnsi="Arial Unicode MS" w:eastAsia="Arial Unicode MS"/>
+          <w:rFonts w:ascii="Noto Serif KR" w:hAnsi="Noto Serif KR" w:eastAsia="Noto Serif KR"/>
           <w:b w:val="0"/>
           <w:i w:val="0"/>
           <w:sz w:val="20"/>
@@ -3761,7 +3776,7 @@
       </w:r>
       <w:r>
         <w:rPr>
-          <w:rFonts w:ascii="Arial Unicode MS" w:hAnsi="Arial Unicode MS" w:eastAsia="Arial Unicode MS"/>
+          <w:rFonts w:ascii="Noto Serif KR" w:hAnsi="Noto Serif KR" w:eastAsia="Noto Serif KR"/>
           <w:b/>
           <w:i w:val="0"/>
           <w:sz w:val="21"/>
@@ -3770,12 +3785,12 @@
       </w:r>
       <w:r>
         <w:rPr>
-          <w:rFonts w:ascii="Arial Unicode MS" w:hAnsi="Arial Unicode MS" w:eastAsia="Arial Unicode MS"/>
+          <w:rFonts w:ascii="Noto Serif KR" w:hAnsi="Noto Serif KR" w:eastAsia="Noto Serif KR"/>
           <w:b w:val="0"/>
           <w:i w:val="0"/>
           <w:sz w:val="21"/>
         </w:rPr>
-        <w:t>Have you identified which local promotion message or product demonstration actually generated inquiries?</w:t>
+        <w:t>Have you confirmed which local marketing messages or product demonstrations led to real inquiries?</w:t>
       </w:r>
     </w:p>
     <w:p>
@@ -3785,7 +3800,7 @@
       </w:pPr>
       <w:r>
         <w:rPr>
-          <w:rFonts w:ascii="Arial Unicode MS" w:hAnsi="Arial Unicode MS" w:eastAsia="Arial Unicode MS"/>
+          <w:rFonts w:ascii="Noto Serif KR" w:hAnsi="Noto Serif KR" w:eastAsia="Noto Serif KR"/>
           <w:b w:val="0"/>
           <w:i w:val="0"/>
           <w:sz w:val="20"/>
@@ -3800,7 +3815,7 @@
       </w:pPr>
       <w:r>
         <w:rPr>
-          <w:rFonts w:ascii="Arial Unicode MS" w:hAnsi="Arial Unicode MS" w:eastAsia="Arial Unicode MS"/>
+          <w:rFonts w:ascii="Noto Serif KR" w:hAnsi="Noto Serif KR" w:eastAsia="Noto Serif KR"/>
           <w:b w:val="0"/>
           <w:i w:val="0"/>
           <w:sz w:val="20"/>
@@ -3815,7 +3830,7 @@
       </w:pPr>
       <w:r>
         <w:rPr>
-          <w:rFonts w:ascii="Arial Unicode MS" w:hAnsi="Arial Unicode MS" w:eastAsia="Arial Unicode MS"/>
+          <w:rFonts w:ascii="Noto Serif KR" w:hAnsi="Noto Serif KR" w:eastAsia="Noto Serif KR"/>
           <w:b w:val="0"/>
           <w:i w:val="0"/>
           <w:sz w:val="20"/>
@@ -3830,7 +3845,7 @@
       </w:pPr>
       <w:r>
         <w:rPr>
-          <w:rFonts w:ascii="Arial Unicode MS" w:hAnsi="Arial Unicode MS" w:eastAsia="Arial Unicode MS"/>
+          <w:rFonts w:ascii="Noto Serif KR" w:hAnsi="Noto Serif KR" w:eastAsia="Noto Serif KR"/>
           <w:b w:val="0"/>
           <w:i w:val="0"/>
           <w:sz w:val="20"/>
@@ -3844,7 +3859,7 @@
       </w:pPr>
       <w:r>
         <w:rPr>
-          <w:rFonts w:ascii="Arial Unicode MS" w:hAnsi="Arial Unicode MS" w:eastAsia="Arial Unicode MS"/>
+          <w:rFonts w:ascii="Noto Serif KR" w:hAnsi="Noto Serif KR" w:eastAsia="Noto Serif KR"/>
           <w:b w:val="0"/>
           <w:i/>
           <w:color w:val="666666"/>
@@ -3876,7 +3891,7 @@
           <w:p>
             <w:r>
               <w:rPr>
-                <w:rFonts w:ascii="Arial Unicode MS" w:hAnsi="Arial Unicode MS" w:eastAsia="Arial Unicode MS"/>
+                <w:rFonts w:ascii="Noto Serif KR" w:hAnsi="Noto Serif KR" w:eastAsia="Noto Serif KR"/>
                 <w:b w:val="0"/>
                 <w:i w:val="0"/>
                 <w:sz w:val="20"/>
@@ -3893,7 +3908,7 @@
       </w:pPr>
       <w:r>
         <w:rPr>
-          <w:rFonts w:ascii="Arial Unicode MS" w:hAnsi="Arial Unicode MS" w:eastAsia="Arial Unicode MS"/>
+          <w:rFonts w:ascii="Noto Serif KR" w:hAnsi="Noto Serif KR" w:eastAsia="Noto Serif KR"/>
           <w:b w:val="0"/>
           <w:i w:val="0"/>
           <w:sz w:val="20"/>
@@ -3901,7 +3916,7 @@
       </w:r>
       <w:r>
         <w:rPr>
-          <w:rFonts w:ascii="Arial Unicode MS" w:hAnsi="Arial Unicode MS" w:eastAsia="Arial Unicode MS"/>
+          <w:rFonts w:ascii="Noto Serif KR" w:hAnsi="Noto Serif KR" w:eastAsia="Noto Serif KR"/>
           <w:b/>
           <w:i w:val="0"/>
           <w:sz w:val="21"/>
@@ -3910,7 +3925,7 @@
       </w:r>
       <w:r>
         <w:rPr>
-          <w:rFonts w:ascii="Arial Unicode MS" w:hAnsi="Arial Unicode MS" w:eastAsia="Arial Unicode MS"/>
+          <w:rFonts w:ascii="Noto Serif KR" w:hAnsi="Noto Serif KR" w:eastAsia="Noto Serif KR"/>
           <w:b w:val="0"/>
           <w:i w:val="0"/>
           <w:sz w:val="21"/>
@@ -3925,7 +3940,7 @@
       </w:pPr>
       <w:r>
         <w:rPr>
-          <w:rFonts w:ascii="Arial Unicode MS" w:hAnsi="Arial Unicode MS" w:eastAsia="Arial Unicode MS"/>
+          <w:rFonts w:ascii="Noto Serif KR" w:hAnsi="Noto Serif KR" w:eastAsia="Noto Serif KR"/>
           <w:b w:val="0"/>
           <w:i w:val="0"/>
           <w:sz w:val="20"/>
@@ -3940,7 +3955,7 @@
       </w:pPr>
       <w:r>
         <w:rPr>
-          <w:rFonts w:ascii="Arial Unicode MS" w:hAnsi="Arial Unicode MS" w:eastAsia="Arial Unicode MS"/>
+          <w:rFonts w:ascii="Noto Serif KR" w:hAnsi="Noto Serif KR" w:eastAsia="Noto Serif KR"/>
           <w:b w:val="0"/>
           <w:i w:val="0"/>
           <w:sz w:val="20"/>
@@ -3955,7 +3970,7 @@
       </w:pPr>
       <w:r>
         <w:rPr>
-          <w:rFonts w:ascii="Arial Unicode MS" w:hAnsi="Arial Unicode MS" w:eastAsia="Arial Unicode MS"/>
+          <w:rFonts w:ascii="Noto Serif KR" w:hAnsi="Noto Serif KR" w:eastAsia="Noto Serif KR"/>
           <w:b w:val="0"/>
           <w:i w:val="0"/>
           <w:sz w:val="20"/>
@@ -3970,7 +3985,7 @@
       </w:pPr>
       <w:r>
         <w:rPr>
-          <w:rFonts w:ascii="Arial Unicode MS" w:hAnsi="Arial Unicode MS" w:eastAsia="Arial Unicode MS"/>
+          <w:rFonts w:ascii="Noto Serif KR" w:hAnsi="Noto Serif KR" w:eastAsia="Noto Serif KR"/>
           <w:b w:val="0"/>
           <w:i w:val="0"/>
           <w:sz w:val="20"/>
@@ -3984,7 +3999,7 @@
       </w:pPr>
       <w:r>
         <w:rPr>
-          <w:rFonts w:ascii="Arial Unicode MS" w:hAnsi="Arial Unicode MS" w:eastAsia="Arial Unicode MS"/>
+          <w:rFonts w:ascii="Noto Serif KR" w:hAnsi="Noto Serif KR" w:eastAsia="Noto Serif KR"/>
           <w:b w:val="0"/>
           <w:i/>
           <w:color w:val="666666"/>
@@ -4016,7 +4031,7 @@
           <w:p>
             <w:r>
               <w:rPr>
-                <w:rFonts w:ascii="Arial Unicode MS" w:hAnsi="Arial Unicode MS" w:eastAsia="Arial Unicode MS"/>
+                <w:rFonts w:ascii="Noto Serif KR" w:hAnsi="Noto Serif KR" w:eastAsia="Noto Serif KR"/>
                 <w:b w:val="0"/>
                 <w:i w:val="0"/>
                 <w:sz w:val="20"/>
@@ -4033,7 +4048,7 @@
       </w:pPr>
       <w:r>
         <w:rPr>
-          <w:rFonts w:ascii="Arial Unicode MS" w:hAnsi="Arial Unicode MS" w:eastAsia="Arial Unicode MS"/>
+          <w:rFonts w:ascii="Noto Serif KR" w:hAnsi="Noto Serif KR" w:eastAsia="Noto Serif KR"/>
           <w:b w:val="0"/>
           <w:i w:val="0"/>
           <w:sz w:val="20"/>
@@ -4041,7 +4056,7 @@
       </w:r>
       <w:r>
         <w:rPr>
-          <w:rFonts w:ascii="Arial Unicode MS" w:hAnsi="Arial Unicode MS" w:eastAsia="Arial Unicode MS"/>
+          <w:rFonts w:ascii="Noto Serif KR" w:hAnsi="Noto Serif KR" w:eastAsia="Noto Serif KR"/>
           <w:b/>
           <w:i w:val="0"/>
           <w:sz w:val="21"/>
@@ -4050,7 +4065,7 @@
       </w:r>
       <w:r>
         <w:rPr>
-          <w:rFonts w:ascii="Arial Unicode MS" w:hAnsi="Arial Unicode MS" w:eastAsia="Arial Unicode MS"/>
+          <w:rFonts w:ascii="Noto Serif KR" w:hAnsi="Noto Serif KR" w:eastAsia="Noto Serif KR"/>
           <w:b w:val="0"/>
           <w:i w:val="0"/>
           <w:sz w:val="21"/>
@@ -4065,7 +4080,7 @@
       </w:pPr>
       <w:r>
         <w:rPr>
-          <w:rFonts w:ascii="Arial Unicode MS" w:hAnsi="Arial Unicode MS" w:eastAsia="Arial Unicode MS"/>
+          <w:rFonts w:ascii="Noto Serif KR" w:hAnsi="Noto Serif KR" w:eastAsia="Noto Serif KR"/>
           <w:b w:val="0"/>
           <w:i w:val="0"/>
           <w:sz w:val="20"/>
@@ -4080,7 +4095,7 @@
       </w:pPr>
       <w:r>
         <w:rPr>
-          <w:rFonts w:ascii="Arial Unicode MS" w:hAnsi="Arial Unicode MS" w:eastAsia="Arial Unicode MS"/>
+          <w:rFonts w:ascii="Noto Serif KR" w:hAnsi="Noto Serif KR" w:eastAsia="Noto Serif KR"/>
           <w:b w:val="0"/>
           <w:i w:val="0"/>
           <w:sz w:val="20"/>
@@ -4095,7 +4110,7 @@
       </w:pPr>
       <w:r>
         <w:rPr>
-          <w:rFonts w:ascii="Arial Unicode MS" w:hAnsi="Arial Unicode MS" w:eastAsia="Arial Unicode MS"/>
+          <w:rFonts w:ascii="Noto Serif KR" w:hAnsi="Noto Serif KR" w:eastAsia="Noto Serif KR"/>
           <w:b w:val="0"/>
           <w:i w:val="0"/>
           <w:sz w:val="20"/>
@@ -4110,7 +4125,7 @@
       </w:pPr>
       <w:r>
         <w:rPr>
-          <w:rFonts w:ascii="Arial Unicode MS" w:hAnsi="Arial Unicode MS" w:eastAsia="Arial Unicode MS"/>
+          <w:rFonts w:ascii="Noto Serif KR" w:hAnsi="Noto Serif KR" w:eastAsia="Noto Serif KR"/>
           <w:b w:val="0"/>
           <w:i w:val="0"/>
           <w:sz w:val="20"/>
@@ -4124,7 +4139,7 @@
       </w:pPr>
       <w:r>
         <w:rPr>
-          <w:rFonts w:ascii="Arial Unicode MS" w:hAnsi="Arial Unicode MS" w:eastAsia="Arial Unicode MS"/>
+          <w:rFonts w:ascii="Noto Serif KR" w:hAnsi="Noto Serif KR" w:eastAsia="Noto Serif KR"/>
           <w:b w:val="0"/>
           <w:i/>
           <w:color w:val="666666"/>
@@ -4156,7 +4171,7 @@
           <w:p>
             <w:r>
               <w:rPr>
-                <w:rFonts w:ascii="Arial Unicode MS" w:hAnsi="Arial Unicode MS" w:eastAsia="Arial Unicode MS"/>
+                <w:rFonts w:ascii="Noto Serif KR" w:hAnsi="Noto Serif KR" w:eastAsia="Noto Serif KR"/>
                 <w:b w:val="0"/>
                 <w:i w:val="0"/>
                 <w:sz w:val="20"/>
@@ -4173,7 +4188,7 @@
       </w:pPr>
       <w:r>
         <w:rPr>
-          <w:rFonts w:ascii="Arial Unicode MS" w:hAnsi="Arial Unicode MS" w:eastAsia="Arial Unicode MS"/>
+          <w:rFonts w:ascii="Noto Serif KR" w:hAnsi="Noto Serif KR" w:eastAsia="Noto Serif KR"/>
           <w:b/>
           <w:i w:val="0"/>
           <w:sz w:val="26"/>
@@ -4187,7 +4202,7 @@
       </w:pPr>
       <w:r>
         <w:rPr>
-          <w:rFonts w:ascii="Arial Unicode MS" w:hAnsi="Arial Unicode MS" w:eastAsia="Arial Unicode MS"/>
+          <w:rFonts w:ascii="Noto Serif KR" w:hAnsi="Noto Serif KR" w:eastAsia="Noto Serif KR"/>
           <w:b w:val="0"/>
           <w:i w:val="0"/>
           <w:sz w:val="20"/>
@@ -4195,7 +4210,7 @@
       </w:r>
       <w:r>
         <w:rPr>
-          <w:rFonts w:ascii="Arial Unicode MS" w:hAnsi="Arial Unicode MS" w:eastAsia="Arial Unicode MS"/>
+          <w:rFonts w:ascii="Noto Serif KR" w:hAnsi="Noto Serif KR" w:eastAsia="Noto Serif KR"/>
           <w:b/>
           <w:i w:val="0"/>
           <w:sz w:val="21"/>
@@ -4204,12 +4219,12 @@
       </w:r>
       <w:r>
         <w:rPr>
-          <w:rFonts w:ascii="Arial Unicode MS" w:hAnsi="Arial Unicode MS" w:eastAsia="Arial Unicode MS"/>
+          <w:rFonts w:ascii="Noto Serif KR" w:hAnsi="Noto Serif KR" w:eastAsia="Noto Serif KR"/>
           <w:b w:val="0"/>
           <w:i w:val="0"/>
           <w:sz w:val="21"/>
         </w:rPr>
-        <w:t>Is the local partner actually performing its assigned role?</w:t>
+        <w:t>Is the local partner performing the role it agreed to take on?</w:t>
       </w:r>
     </w:p>
     <w:p>
@@ -4219,7 +4234,7 @@
       </w:pPr>
       <w:r>
         <w:rPr>
-          <w:rFonts w:ascii="Arial Unicode MS" w:hAnsi="Arial Unicode MS" w:eastAsia="Arial Unicode MS"/>
+          <w:rFonts w:ascii="Noto Serif KR" w:hAnsi="Noto Serif KR" w:eastAsia="Noto Serif KR"/>
           <w:b w:val="0"/>
           <w:i w:val="0"/>
           <w:sz w:val="20"/>
@@ -4234,7 +4249,7 @@
       </w:pPr>
       <w:r>
         <w:rPr>
-          <w:rFonts w:ascii="Arial Unicode MS" w:hAnsi="Arial Unicode MS" w:eastAsia="Arial Unicode MS"/>
+          <w:rFonts w:ascii="Noto Serif KR" w:hAnsi="Noto Serif KR" w:eastAsia="Noto Serif KR"/>
           <w:b w:val="0"/>
           <w:i w:val="0"/>
           <w:sz w:val="20"/>
@@ -4249,7 +4264,7 @@
       </w:pPr>
       <w:r>
         <w:rPr>
-          <w:rFonts w:ascii="Arial Unicode MS" w:hAnsi="Arial Unicode MS" w:eastAsia="Arial Unicode MS"/>
+          <w:rFonts w:ascii="Noto Serif KR" w:hAnsi="Noto Serif KR" w:eastAsia="Noto Serif KR"/>
           <w:b w:val="0"/>
           <w:i w:val="0"/>
           <w:sz w:val="20"/>
@@ -4264,7 +4279,7 @@
       </w:pPr>
       <w:r>
         <w:rPr>
-          <w:rFonts w:ascii="Arial Unicode MS" w:hAnsi="Arial Unicode MS" w:eastAsia="Arial Unicode MS"/>
+          <w:rFonts w:ascii="Noto Serif KR" w:hAnsi="Noto Serif KR" w:eastAsia="Noto Serif KR"/>
           <w:b w:val="0"/>
           <w:i w:val="0"/>
           <w:sz w:val="20"/>
@@ -4278,7 +4293,7 @@
       </w:pPr>
       <w:r>
         <w:rPr>
-          <w:rFonts w:ascii="Arial Unicode MS" w:hAnsi="Arial Unicode MS" w:eastAsia="Arial Unicode MS"/>
+          <w:rFonts w:ascii="Noto Serif KR" w:hAnsi="Noto Serif KR" w:eastAsia="Noto Serif KR"/>
           <w:b w:val="0"/>
           <w:i/>
           <w:color w:val="666666"/>
@@ -4310,7 +4325,7 @@
           <w:p>
             <w:r>
               <w:rPr>
-                <w:rFonts w:ascii="Arial Unicode MS" w:hAnsi="Arial Unicode MS" w:eastAsia="Arial Unicode MS"/>
+                <w:rFonts w:ascii="Noto Serif KR" w:hAnsi="Noto Serif KR" w:eastAsia="Noto Serif KR"/>
                 <w:b w:val="0"/>
                 <w:i w:val="0"/>
                 <w:sz w:val="20"/>
@@ -4327,7 +4342,7 @@
       </w:pPr>
       <w:r>
         <w:rPr>
-          <w:rFonts w:ascii="Arial Unicode MS" w:hAnsi="Arial Unicode MS" w:eastAsia="Arial Unicode MS"/>
+          <w:rFonts w:ascii="Noto Serif KR" w:hAnsi="Noto Serif KR" w:eastAsia="Noto Serif KR"/>
           <w:b w:val="0"/>
           <w:i w:val="0"/>
           <w:sz w:val="20"/>
@@ -4335,7 +4350,7 @@
       </w:r>
       <w:r>
         <w:rPr>
-          <w:rFonts w:ascii="Arial Unicode MS" w:hAnsi="Arial Unicode MS" w:eastAsia="Arial Unicode MS"/>
+          <w:rFonts w:ascii="Noto Serif KR" w:hAnsi="Noto Serif KR" w:eastAsia="Noto Serif KR"/>
           <w:b/>
           <w:i w:val="0"/>
           <w:sz w:val="21"/>
@@ -4344,7 +4359,7 @@
       </w:r>
       <w:r>
         <w:rPr>
-          <w:rFonts w:ascii="Arial Unicode MS" w:hAnsi="Arial Unicode MS" w:eastAsia="Arial Unicode MS"/>
+          <w:rFonts w:ascii="Noto Serif KR" w:hAnsi="Noto Serif KR" w:eastAsia="Noto Serif KR"/>
           <w:b w:val="0"/>
           <w:i w:val="0"/>
           <w:sz w:val="21"/>
@@ -4359,7 +4374,7 @@
       </w:pPr>
       <w:r>
         <w:rPr>
-          <w:rFonts w:ascii="Arial Unicode MS" w:hAnsi="Arial Unicode MS" w:eastAsia="Arial Unicode MS"/>
+          <w:rFonts w:ascii="Noto Serif KR" w:hAnsi="Noto Serif KR" w:eastAsia="Noto Serif KR"/>
           <w:b w:val="0"/>
           <w:i w:val="0"/>
           <w:sz w:val="20"/>
@@ -4374,7 +4389,7 @@
       </w:pPr>
       <w:r>
         <w:rPr>
-          <w:rFonts w:ascii="Arial Unicode MS" w:hAnsi="Arial Unicode MS" w:eastAsia="Arial Unicode MS"/>
+          <w:rFonts w:ascii="Noto Serif KR" w:hAnsi="Noto Serif KR" w:eastAsia="Noto Serif KR"/>
           <w:b w:val="0"/>
           <w:i w:val="0"/>
           <w:sz w:val="20"/>
@@ -4389,7 +4404,7 @@
       </w:pPr>
       <w:r>
         <w:rPr>
-          <w:rFonts w:ascii="Arial Unicode MS" w:hAnsi="Arial Unicode MS" w:eastAsia="Arial Unicode MS"/>
+          <w:rFonts w:ascii="Noto Serif KR" w:hAnsi="Noto Serif KR" w:eastAsia="Noto Serif KR"/>
           <w:b w:val="0"/>
           <w:i w:val="0"/>
           <w:sz w:val="20"/>
@@ -4404,7 +4419,7 @@
       </w:pPr>
       <w:r>
         <w:rPr>
-          <w:rFonts w:ascii="Arial Unicode MS" w:hAnsi="Arial Unicode MS" w:eastAsia="Arial Unicode MS"/>
+          <w:rFonts w:ascii="Noto Serif KR" w:hAnsi="Noto Serif KR" w:eastAsia="Noto Serif KR"/>
           <w:b w:val="0"/>
           <w:i w:val="0"/>
           <w:sz w:val="20"/>
@@ -4418,7 +4433,7 @@
       </w:pPr>
       <w:r>
         <w:rPr>
-          <w:rFonts w:ascii="Arial Unicode MS" w:hAnsi="Arial Unicode MS" w:eastAsia="Arial Unicode MS"/>
+          <w:rFonts w:ascii="Noto Serif KR" w:hAnsi="Noto Serif KR" w:eastAsia="Noto Serif KR"/>
           <w:b w:val="0"/>
           <w:i/>
           <w:color w:val="666666"/>
@@ -4450,7 +4465,7 @@
           <w:p>
             <w:r>
               <w:rPr>
-                <w:rFonts w:ascii="Arial Unicode MS" w:hAnsi="Arial Unicode MS" w:eastAsia="Arial Unicode MS"/>
+                <w:rFonts w:ascii="Noto Serif KR" w:hAnsi="Noto Serif KR" w:eastAsia="Noto Serif KR"/>
                 <w:b w:val="0"/>
                 <w:i w:val="0"/>
                 <w:sz w:val="20"/>
@@ -4467,7 +4482,7 @@
       </w:pPr>
       <w:r>
         <w:rPr>
-          <w:rFonts w:ascii="Arial Unicode MS" w:hAnsi="Arial Unicode MS" w:eastAsia="Arial Unicode MS"/>
+          <w:rFonts w:ascii="Noto Serif KR" w:hAnsi="Noto Serif KR" w:eastAsia="Noto Serif KR"/>
           <w:b w:val="0"/>
           <w:i w:val="0"/>
           <w:sz w:val="20"/>
@@ -4475,7 +4490,7 @@
       </w:r>
       <w:r>
         <w:rPr>
-          <w:rFonts w:ascii="Arial Unicode MS" w:hAnsi="Arial Unicode MS" w:eastAsia="Arial Unicode MS"/>
+          <w:rFonts w:ascii="Noto Serif KR" w:hAnsi="Noto Serif KR" w:eastAsia="Noto Serif KR"/>
           <w:b/>
           <w:i w:val="0"/>
           <w:sz w:val="21"/>
@@ -4484,7 +4499,7 @@
       </w:r>
       <w:r>
         <w:rPr>
-          <w:rFonts w:ascii="Arial Unicode MS" w:hAnsi="Arial Unicode MS" w:eastAsia="Arial Unicode MS"/>
+          <w:rFonts w:ascii="Noto Serif KR" w:hAnsi="Noto Serif KR" w:eastAsia="Noto Serif KR"/>
           <w:b w:val="0"/>
           <w:i w:val="0"/>
           <w:sz w:val="21"/>
@@ -4499,7 +4514,7 @@
       </w:pPr>
       <w:r>
         <w:rPr>
-          <w:rFonts w:ascii="Arial Unicode MS" w:hAnsi="Arial Unicode MS" w:eastAsia="Arial Unicode MS"/>
+          <w:rFonts w:ascii="Noto Serif KR" w:hAnsi="Noto Serif KR" w:eastAsia="Noto Serif KR"/>
           <w:b w:val="0"/>
           <w:i w:val="0"/>
           <w:sz w:val="20"/>
@@ -4514,7 +4529,7 @@
       </w:pPr>
       <w:r>
         <w:rPr>
-          <w:rFonts w:ascii="Arial Unicode MS" w:hAnsi="Arial Unicode MS" w:eastAsia="Arial Unicode MS"/>
+          <w:rFonts w:ascii="Noto Serif KR" w:hAnsi="Noto Serif KR" w:eastAsia="Noto Serif KR"/>
           <w:b w:val="0"/>
           <w:i w:val="0"/>
           <w:sz w:val="20"/>
@@ -4529,7 +4544,7 @@
       </w:pPr>
       <w:r>
         <w:rPr>
-          <w:rFonts w:ascii="Arial Unicode MS" w:hAnsi="Arial Unicode MS" w:eastAsia="Arial Unicode MS"/>
+          <w:rFonts w:ascii="Noto Serif KR" w:hAnsi="Noto Serif KR" w:eastAsia="Noto Serif KR"/>
           <w:b w:val="0"/>
           <w:i w:val="0"/>
           <w:sz w:val="20"/>
@@ -4544,7 +4559,7 @@
       </w:pPr>
       <w:r>
         <w:rPr>
-          <w:rFonts w:ascii="Arial Unicode MS" w:hAnsi="Arial Unicode MS" w:eastAsia="Arial Unicode MS"/>
+          <w:rFonts w:ascii="Noto Serif KR" w:hAnsi="Noto Serif KR" w:eastAsia="Noto Serif KR"/>
           <w:b w:val="0"/>
           <w:i w:val="0"/>
           <w:sz w:val="20"/>
@@ -4558,7 +4573,7 @@
       </w:pPr>
       <w:r>
         <w:rPr>
-          <w:rFonts w:ascii="Arial Unicode MS" w:hAnsi="Arial Unicode MS" w:eastAsia="Arial Unicode MS"/>
+          <w:rFonts w:ascii="Noto Serif KR" w:hAnsi="Noto Serif KR" w:eastAsia="Noto Serif KR"/>
           <w:b w:val="0"/>
           <w:i/>
           <w:color w:val="666666"/>
@@ -4590,7 +4605,7 @@
           <w:p>
             <w:r>
               <w:rPr>
-                <w:rFonts w:ascii="Arial Unicode MS" w:hAnsi="Arial Unicode MS" w:eastAsia="Arial Unicode MS"/>
+                <w:rFonts w:ascii="Noto Serif KR" w:hAnsi="Noto Serif KR" w:eastAsia="Noto Serif KR"/>
                 <w:b w:val="0"/>
                 <w:i w:val="0"/>
                 <w:sz w:val="20"/>
@@ -4607,7 +4622,7 @@
       </w:pPr>
       <w:r>
         <w:rPr>
-          <w:rFonts w:ascii="Arial Unicode MS" w:hAnsi="Arial Unicode MS" w:eastAsia="Arial Unicode MS"/>
+          <w:rFonts w:ascii="Noto Serif KR" w:hAnsi="Noto Serif KR" w:eastAsia="Noto Serif KR"/>
           <w:b w:val="0"/>
           <w:i w:val="0"/>
           <w:sz w:val="20"/>
@@ -4615,7 +4630,7 @@
       </w:r>
       <w:r>
         <w:rPr>
-          <w:rFonts w:ascii="Arial Unicode MS" w:hAnsi="Arial Unicode MS" w:eastAsia="Arial Unicode MS"/>
+          <w:rFonts w:ascii="Noto Serif KR" w:hAnsi="Noto Serif KR" w:eastAsia="Noto Serif KR"/>
           <w:b/>
           <w:i w:val="0"/>
           <w:sz w:val="21"/>
@@ -4624,7 +4639,7 @@
       </w:r>
       <w:r>
         <w:rPr>
-          <w:rFonts w:ascii="Arial Unicode MS" w:hAnsi="Arial Unicode MS" w:eastAsia="Arial Unicode MS"/>
+          <w:rFonts w:ascii="Noto Serif KR" w:hAnsi="Noto Serif KR" w:eastAsia="Noto Serif KR"/>
           <w:b w:val="0"/>
           <w:i w:val="0"/>
           <w:sz w:val="21"/>
@@ -4639,7 +4654,7 @@
       </w:pPr>
       <w:r>
         <w:rPr>
-          <w:rFonts w:ascii="Arial Unicode MS" w:hAnsi="Arial Unicode MS" w:eastAsia="Arial Unicode MS"/>
+          <w:rFonts w:ascii="Noto Serif KR" w:hAnsi="Noto Serif KR" w:eastAsia="Noto Serif KR"/>
           <w:b w:val="0"/>
           <w:i w:val="0"/>
           <w:sz w:val="20"/>
@@ -4654,7 +4669,7 @@
       </w:pPr>
       <w:r>
         <w:rPr>
-          <w:rFonts w:ascii="Arial Unicode MS" w:hAnsi="Arial Unicode MS" w:eastAsia="Arial Unicode MS"/>
+          <w:rFonts w:ascii="Noto Serif KR" w:hAnsi="Noto Serif KR" w:eastAsia="Noto Serif KR"/>
           <w:b w:val="0"/>
           <w:i w:val="0"/>
           <w:sz w:val="20"/>
@@ -4669,7 +4684,7 @@
       </w:pPr>
       <w:r>
         <w:rPr>
-          <w:rFonts w:ascii="Arial Unicode MS" w:hAnsi="Arial Unicode MS" w:eastAsia="Arial Unicode MS"/>
+          <w:rFonts w:ascii="Noto Serif KR" w:hAnsi="Noto Serif KR" w:eastAsia="Noto Serif KR"/>
           <w:b w:val="0"/>
           <w:i w:val="0"/>
           <w:sz w:val="20"/>
@@ -4684,7 +4699,7 @@
       </w:pPr>
       <w:r>
         <w:rPr>
-          <w:rFonts w:ascii="Arial Unicode MS" w:hAnsi="Arial Unicode MS" w:eastAsia="Arial Unicode MS"/>
+          <w:rFonts w:ascii="Noto Serif KR" w:hAnsi="Noto Serif KR" w:eastAsia="Noto Serif KR"/>
           <w:b w:val="0"/>
           <w:i w:val="0"/>
           <w:sz w:val="20"/>
@@ -4698,7 +4713,7 @@
       </w:pPr>
       <w:r>
         <w:rPr>
-          <w:rFonts w:ascii="Arial Unicode MS" w:hAnsi="Arial Unicode MS" w:eastAsia="Arial Unicode MS"/>
+          <w:rFonts w:ascii="Noto Serif KR" w:hAnsi="Noto Serif KR" w:eastAsia="Noto Serif KR"/>
           <w:b w:val="0"/>
           <w:i/>
           <w:color w:val="666666"/>
@@ -4730,7 +4745,7 @@
           <w:p>
             <w:r>
               <w:rPr>
-                <w:rFonts w:ascii="Arial Unicode MS" w:hAnsi="Arial Unicode MS" w:eastAsia="Arial Unicode MS"/>
+                <w:rFonts w:ascii="Noto Serif KR" w:hAnsi="Noto Serif KR" w:eastAsia="Noto Serif KR"/>
                 <w:b w:val="0"/>
                 <w:i w:val="0"/>
                 <w:sz w:val="20"/>
@@ -4747,7 +4762,7 @@
       </w:pPr>
       <w:r>
         <w:rPr>
-          <w:rFonts w:ascii="Arial Unicode MS" w:hAnsi="Arial Unicode MS" w:eastAsia="Arial Unicode MS"/>
+          <w:rFonts w:ascii="Noto Serif KR" w:hAnsi="Noto Serif KR" w:eastAsia="Noto Serif KR"/>
           <w:b w:val="0"/>
           <w:i w:val="0"/>
           <w:sz w:val="20"/>
@@ -4755,7 +4770,7 @@
       </w:r>
       <w:r>
         <w:rPr>
-          <w:rFonts w:ascii="Arial Unicode MS" w:hAnsi="Arial Unicode MS" w:eastAsia="Arial Unicode MS"/>
+          <w:rFonts w:ascii="Noto Serif KR" w:hAnsi="Noto Serif KR" w:eastAsia="Noto Serif KR"/>
           <w:b/>
           <w:i w:val="0"/>
           <w:sz w:val="21"/>
@@ -4764,7 +4779,7 @@
       </w:r>
       <w:r>
         <w:rPr>
-          <w:rFonts w:ascii="Arial Unicode MS" w:hAnsi="Arial Unicode MS" w:eastAsia="Arial Unicode MS"/>
+          <w:rFonts w:ascii="Noto Serif KR" w:hAnsi="Noto Serif KR" w:eastAsia="Noto Serif KR"/>
           <w:b w:val="0"/>
           <w:i w:val="0"/>
           <w:sz w:val="21"/>
@@ -4779,7 +4794,7 @@
       </w:pPr>
       <w:r>
         <w:rPr>
-          <w:rFonts w:ascii="Arial Unicode MS" w:hAnsi="Arial Unicode MS" w:eastAsia="Arial Unicode MS"/>
+          <w:rFonts w:ascii="Noto Serif KR" w:hAnsi="Noto Serif KR" w:eastAsia="Noto Serif KR"/>
           <w:b w:val="0"/>
           <w:i w:val="0"/>
           <w:sz w:val="20"/>
@@ -4794,7 +4809,7 @@
       </w:pPr>
       <w:r>
         <w:rPr>
-          <w:rFonts w:ascii="Arial Unicode MS" w:hAnsi="Arial Unicode MS" w:eastAsia="Arial Unicode MS"/>
+          <w:rFonts w:ascii="Noto Serif KR" w:hAnsi="Noto Serif KR" w:eastAsia="Noto Serif KR"/>
           <w:b w:val="0"/>
           <w:i w:val="0"/>
           <w:sz w:val="20"/>
@@ -4809,7 +4824,7 @@
       </w:pPr>
       <w:r>
         <w:rPr>
-          <w:rFonts w:ascii="Arial Unicode MS" w:hAnsi="Arial Unicode MS" w:eastAsia="Arial Unicode MS"/>
+          <w:rFonts w:ascii="Noto Serif KR" w:hAnsi="Noto Serif KR" w:eastAsia="Noto Serif KR"/>
           <w:b w:val="0"/>
           <w:i w:val="0"/>
           <w:sz w:val="20"/>
@@ -4824,7 +4839,7 @@
       </w:pPr>
       <w:r>
         <w:rPr>
-          <w:rFonts w:ascii="Arial Unicode MS" w:hAnsi="Arial Unicode MS" w:eastAsia="Arial Unicode MS"/>
+          <w:rFonts w:ascii="Noto Serif KR" w:hAnsi="Noto Serif KR" w:eastAsia="Noto Serif KR"/>
           <w:b w:val="0"/>
           <w:i w:val="0"/>
           <w:sz w:val="20"/>
@@ -4838,7 +4853,7 @@
       </w:pPr>
       <w:r>
         <w:rPr>
-          <w:rFonts w:ascii="Arial Unicode MS" w:hAnsi="Arial Unicode MS" w:eastAsia="Arial Unicode MS"/>
+          <w:rFonts w:ascii="Noto Serif KR" w:hAnsi="Noto Serif KR" w:eastAsia="Noto Serif KR"/>
           <w:b w:val="0"/>
           <w:i/>
           <w:color w:val="666666"/>
@@ -4870,7 +4885,7 @@
           <w:p>
             <w:r>
               <w:rPr>
-                <w:rFonts w:ascii="Arial Unicode MS" w:hAnsi="Arial Unicode MS" w:eastAsia="Arial Unicode MS"/>
+                <w:rFonts w:ascii="Noto Serif KR" w:hAnsi="Noto Serif KR" w:eastAsia="Noto Serif KR"/>
                 <w:b w:val="0"/>
                 <w:i w:val="0"/>
                 <w:sz w:val="20"/>
@@ -4888,7 +4903,7 @@
       </w:pPr>
       <w:r>
         <w:rPr>
-          <w:rFonts w:ascii="Arial Unicode MS" w:hAnsi="Arial Unicode MS" w:eastAsia="Arial Unicode MS"/>
+          <w:rFonts w:ascii="Noto Serif KR" w:hAnsi="Noto Serif KR" w:eastAsia="Noto Serif KR"/>
           <w:b/>
           <w:i w:val="0"/>
           <w:sz w:val="34"/>
@@ -4902,7 +4917,7 @@
       </w:pPr>
       <w:r>
         <w:rPr>
-          <w:rFonts w:ascii="Arial Unicode MS" w:hAnsi="Arial Unicode MS" w:eastAsia="Arial Unicode MS"/>
+          <w:rFonts w:ascii="Noto Serif KR" w:hAnsi="Noto Serif KR" w:eastAsia="Noto Serif KR"/>
           <w:b w:val="0"/>
           <w:i w:val="0"/>
           <w:color w:val="666666"/>
@@ -4917,7 +4932,7 @@
       </w:pPr>
       <w:r>
         <w:rPr>
-          <w:rFonts w:ascii="Arial Unicode MS" w:hAnsi="Arial Unicode MS" w:eastAsia="Arial Unicode MS"/>
+          <w:rFonts w:ascii="Noto Serif KR" w:hAnsi="Noto Serif KR" w:eastAsia="Noto Serif KR"/>
           <w:b/>
           <w:i w:val="0"/>
           <w:sz w:val="26"/>
@@ -4931,7 +4946,7 @@
       </w:pPr>
       <w:r>
         <w:rPr>
-          <w:rFonts w:ascii="Arial Unicode MS" w:hAnsi="Arial Unicode MS" w:eastAsia="Arial Unicode MS"/>
+          <w:rFonts w:ascii="Noto Serif KR" w:hAnsi="Noto Serif KR" w:eastAsia="Noto Serif KR"/>
           <w:b w:val="0"/>
           <w:i w:val="0"/>
           <w:sz w:val="20"/>
@@ -4939,7 +4954,7 @@
       </w:r>
       <w:r>
         <w:rPr>
-          <w:rFonts w:ascii="Arial Unicode MS" w:hAnsi="Arial Unicode MS" w:eastAsia="Arial Unicode MS"/>
+          <w:rFonts w:ascii="Noto Serif KR" w:hAnsi="Noto Serif KR" w:eastAsia="Noto Serif KR"/>
           <w:b/>
           <w:i w:val="0"/>
           <w:sz w:val="21"/>
@@ -4948,7 +4963,7 @@
       </w:r>
       <w:r>
         <w:rPr>
-          <w:rFonts w:ascii="Arial Unicode MS" w:hAnsi="Arial Unicode MS" w:eastAsia="Arial Unicode MS"/>
+          <w:rFonts w:ascii="Noto Serif KR" w:hAnsi="Noto Serif KR" w:eastAsia="Noto Serif KR"/>
           <w:b w:val="0"/>
           <w:i w:val="0"/>
           <w:sz w:val="21"/>
@@ -4963,7 +4978,7 @@
       </w:pPr>
       <w:r>
         <w:rPr>
-          <w:rFonts w:ascii="Arial Unicode MS" w:hAnsi="Arial Unicode MS" w:eastAsia="Arial Unicode MS"/>
+          <w:rFonts w:ascii="Noto Serif KR" w:hAnsi="Noto Serif KR" w:eastAsia="Noto Serif KR"/>
           <w:b w:val="0"/>
           <w:i w:val="0"/>
           <w:sz w:val="20"/>
@@ -4978,7 +4993,7 @@
       </w:pPr>
       <w:r>
         <w:rPr>
-          <w:rFonts w:ascii="Arial Unicode MS" w:hAnsi="Arial Unicode MS" w:eastAsia="Arial Unicode MS"/>
+          <w:rFonts w:ascii="Noto Serif KR" w:hAnsi="Noto Serif KR" w:eastAsia="Noto Serif KR"/>
           <w:b w:val="0"/>
           <w:i w:val="0"/>
           <w:sz w:val="20"/>
@@ -4993,7 +5008,7 @@
       </w:pPr>
       <w:r>
         <w:rPr>
-          <w:rFonts w:ascii="Arial Unicode MS" w:hAnsi="Arial Unicode MS" w:eastAsia="Arial Unicode MS"/>
+          <w:rFonts w:ascii="Noto Serif KR" w:hAnsi="Noto Serif KR" w:eastAsia="Noto Serif KR"/>
           <w:b w:val="0"/>
           <w:i w:val="0"/>
           <w:sz w:val="20"/>
@@ -5008,7 +5023,7 @@
       </w:pPr>
       <w:r>
         <w:rPr>
-          <w:rFonts w:ascii="Arial Unicode MS" w:hAnsi="Arial Unicode MS" w:eastAsia="Arial Unicode MS"/>
+          <w:rFonts w:ascii="Noto Serif KR" w:hAnsi="Noto Serif KR" w:eastAsia="Noto Serif KR"/>
           <w:b w:val="0"/>
           <w:i w:val="0"/>
           <w:sz w:val="20"/>
@@ -5022,7 +5037,7 @@
       </w:pPr>
       <w:r>
         <w:rPr>
-          <w:rFonts w:ascii="Arial Unicode MS" w:hAnsi="Arial Unicode MS" w:eastAsia="Arial Unicode MS"/>
+          <w:rFonts w:ascii="Noto Serif KR" w:hAnsi="Noto Serif KR" w:eastAsia="Noto Serif KR"/>
           <w:b w:val="0"/>
           <w:i/>
           <w:color w:val="666666"/>
@@ -5054,7 +5069,7 @@
           <w:p>
             <w:r>
               <w:rPr>
-                <w:rFonts w:ascii="Arial Unicode MS" w:hAnsi="Arial Unicode MS" w:eastAsia="Arial Unicode MS"/>
+                <w:rFonts w:ascii="Noto Serif KR" w:hAnsi="Noto Serif KR" w:eastAsia="Noto Serif KR"/>
                 <w:b w:val="0"/>
                 <w:i w:val="0"/>
                 <w:sz w:val="20"/>
@@ -5071,7 +5086,7 @@
       </w:pPr>
       <w:r>
         <w:rPr>
-          <w:rFonts w:ascii="Arial Unicode MS" w:hAnsi="Arial Unicode MS" w:eastAsia="Arial Unicode MS"/>
+          <w:rFonts w:ascii="Noto Serif KR" w:hAnsi="Noto Serif KR" w:eastAsia="Noto Serif KR"/>
           <w:b w:val="0"/>
           <w:i w:val="0"/>
           <w:sz w:val="20"/>
@@ -5079,7 +5094,7 @@
       </w:r>
       <w:r>
         <w:rPr>
-          <w:rFonts w:ascii="Arial Unicode MS" w:hAnsi="Arial Unicode MS" w:eastAsia="Arial Unicode MS"/>
+          <w:rFonts w:ascii="Noto Serif KR" w:hAnsi="Noto Serif KR" w:eastAsia="Noto Serif KR"/>
           <w:b/>
           <w:i w:val="0"/>
           <w:sz w:val="21"/>
@@ -5088,7 +5103,7 @@
       </w:r>
       <w:r>
         <w:rPr>
-          <w:rFonts w:ascii="Arial Unicode MS" w:hAnsi="Arial Unicode MS" w:eastAsia="Arial Unicode MS"/>
+          <w:rFonts w:ascii="Noto Serif KR" w:hAnsi="Noto Serif KR" w:eastAsia="Noto Serif KR"/>
           <w:b w:val="0"/>
           <w:i w:val="0"/>
           <w:sz w:val="21"/>
@@ -5103,7 +5118,7 @@
       </w:pPr>
       <w:r>
         <w:rPr>
-          <w:rFonts w:ascii="Arial Unicode MS" w:hAnsi="Arial Unicode MS" w:eastAsia="Arial Unicode MS"/>
+          <w:rFonts w:ascii="Noto Serif KR" w:hAnsi="Noto Serif KR" w:eastAsia="Noto Serif KR"/>
           <w:b w:val="0"/>
           <w:i w:val="0"/>
           <w:sz w:val="20"/>
@@ -5118,7 +5133,7 @@
       </w:pPr>
       <w:r>
         <w:rPr>
-          <w:rFonts w:ascii="Arial Unicode MS" w:hAnsi="Arial Unicode MS" w:eastAsia="Arial Unicode MS"/>
+          <w:rFonts w:ascii="Noto Serif KR" w:hAnsi="Noto Serif KR" w:eastAsia="Noto Serif KR"/>
           <w:b w:val="0"/>
           <w:i w:val="0"/>
           <w:sz w:val="20"/>
@@ -5133,7 +5148,7 @@
       </w:pPr>
       <w:r>
         <w:rPr>
-          <w:rFonts w:ascii="Arial Unicode MS" w:hAnsi="Arial Unicode MS" w:eastAsia="Arial Unicode MS"/>
+          <w:rFonts w:ascii="Noto Serif KR" w:hAnsi="Noto Serif KR" w:eastAsia="Noto Serif KR"/>
           <w:b w:val="0"/>
           <w:i w:val="0"/>
           <w:sz w:val="20"/>
@@ -5148,7 +5163,7 @@
       </w:pPr>
       <w:r>
         <w:rPr>
-          <w:rFonts w:ascii="Arial Unicode MS" w:hAnsi="Arial Unicode MS" w:eastAsia="Arial Unicode MS"/>
+          <w:rFonts w:ascii="Noto Serif KR" w:hAnsi="Noto Serif KR" w:eastAsia="Noto Serif KR"/>
           <w:b w:val="0"/>
           <w:i w:val="0"/>
           <w:sz w:val="20"/>
@@ -5162,7 +5177,7 @@
       </w:pPr>
       <w:r>
         <w:rPr>
-          <w:rFonts w:ascii="Arial Unicode MS" w:hAnsi="Arial Unicode MS" w:eastAsia="Arial Unicode MS"/>
+          <w:rFonts w:ascii="Noto Serif KR" w:hAnsi="Noto Serif KR" w:eastAsia="Noto Serif KR"/>
           <w:b w:val="0"/>
           <w:i/>
           <w:color w:val="666666"/>
@@ -5194,7 +5209,7 @@
           <w:p>
             <w:r>
               <w:rPr>
-                <w:rFonts w:ascii="Arial Unicode MS" w:hAnsi="Arial Unicode MS" w:eastAsia="Arial Unicode MS"/>
+                <w:rFonts w:ascii="Noto Serif KR" w:hAnsi="Noto Serif KR" w:eastAsia="Noto Serif KR"/>
                 <w:b w:val="0"/>
                 <w:i w:val="0"/>
                 <w:sz w:val="20"/>
@@ -5211,7 +5226,7 @@
       </w:pPr>
       <w:r>
         <w:rPr>
-          <w:rFonts w:ascii="Arial Unicode MS" w:hAnsi="Arial Unicode MS" w:eastAsia="Arial Unicode MS"/>
+          <w:rFonts w:ascii="Noto Serif KR" w:hAnsi="Noto Serif KR" w:eastAsia="Noto Serif KR"/>
           <w:b w:val="0"/>
           <w:i w:val="0"/>
           <w:sz w:val="20"/>
@@ -5219,7 +5234,7 @@
       </w:r>
       <w:r>
         <w:rPr>
-          <w:rFonts w:ascii="Arial Unicode MS" w:hAnsi="Arial Unicode MS" w:eastAsia="Arial Unicode MS"/>
+          <w:rFonts w:ascii="Noto Serif KR" w:hAnsi="Noto Serif KR" w:eastAsia="Noto Serif KR"/>
           <w:b/>
           <w:i w:val="0"/>
           <w:sz w:val="21"/>
@@ -5228,7 +5243,7 @@
       </w:r>
       <w:r>
         <w:rPr>
-          <w:rFonts w:ascii="Arial Unicode MS" w:hAnsi="Arial Unicode MS" w:eastAsia="Arial Unicode MS"/>
+          <w:rFonts w:ascii="Noto Serif KR" w:hAnsi="Noto Serif KR" w:eastAsia="Noto Serif KR"/>
           <w:b w:val="0"/>
           <w:i w:val="0"/>
           <w:sz w:val="21"/>
@@ -5243,7 +5258,7 @@
       </w:pPr>
       <w:r>
         <w:rPr>
-          <w:rFonts w:ascii="Arial Unicode MS" w:hAnsi="Arial Unicode MS" w:eastAsia="Arial Unicode MS"/>
+          <w:rFonts w:ascii="Noto Serif KR" w:hAnsi="Noto Serif KR" w:eastAsia="Noto Serif KR"/>
           <w:b w:val="0"/>
           <w:i w:val="0"/>
           <w:sz w:val="20"/>
@@ -5258,7 +5273,7 @@
       </w:pPr>
       <w:r>
         <w:rPr>
-          <w:rFonts w:ascii="Arial Unicode MS" w:hAnsi="Arial Unicode MS" w:eastAsia="Arial Unicode MS"/>
+          <w:rFonts w:ascii="Noto Serif KR" w:hAnsi="Noto Serif KR" w:eastAsia="Noto Serif KR"/>
           <w:b w:val="0"/>
           <w:i w:val="0"/>
           <w:sz w:val="20"/>
@@ -5273,7 +5288,7 @@
       </w:pPr>
       <w:r>
         <w:rPr>
-          <w:rFonts w:ascii="Arial Unicode MS" w:hAnsi="Arial Unicode MS" w:eastAsia="Arial Unicode MS"/>
+          <w:rFonts w:ascii="Noto Serif KR" w:hAnsi="Noto Serif KR" w:eastAsia="Noto Serif KR"/>
           <w:b w:val="0"/>
           <w:i w:val="0"/>
           <w:sz w:val="20"/>
@@ -5288,7 +5303,7 @@
       </w:pPr>
       <w:r>
         <w:rPr>
-          <w:rFonts w:ascii="Arial Unicode MS" w:hAnsi="Arial Unicode MS" w:eastAsia="Arial Unicode MS"/>
+          <w:rFonts w:ascii="Noto Serif KR" w:hAnsi="Noto Serif KR" w:eastAsia="Noto Serif KR"/>
           <w:b w:val="0"/>
           <w:i w:val="0"/>
           <w:sz w:val="20"/>
@@ -5302,7 +5317,7 @@
       </w:pPr>
       <w:r>
         <w:rPr>
-          <w:rFonts w:ascii="Arial Unicode MS" w:hAnsi="Arial Unicode MS" w:eastAsia="Arial Unicode MS"/>
+          <w:rFonts w:ascii="Noto Serif KR" w:hAnsi="Noto Serif KR" w:eastAsia="Noto Serif KR"/>
           <w:b w:val="0"/>
           <w:i/>
           <w:color w:val="666666"/>
@@ -5334,7 +5349,7 @@
           <w:p>
             <w:r>
               <w:rPr>
-                <w:rFonts w:ascii="Arial Unicode MS" w:hAnsi="Arial Unicode MS" w:eastAsia="Arial Unicode MS"/>
+                <w:rFonts w:ascii="Noto Serif KR" w:hAnsi="Noto Serif KR" w:eastAsia="Noto Serif KR"/>
                 <w:b w:val="0"/>
                 <w:i w:val="0"/>
                 <w:sz w:val="20"/>
@@ -5351,7 +5366,7 @@
       </w:pPr>
       <w:r>
         <w:rPr>
-          <w:rFonts w:ascii="Arial Unicode MS" w:hAnsi="Arial Unicode MS" w:eastAsia="Arial Unicode MS"/>
+          <w:rFonts w:ascii="Noto Serif KR" w:hAnsi="Noto Serif KR" w:eastAsia="Noto Serif KR"/>
           <w:b w:val="0"/>
           <w:i w:val="0"/>
           <w:sz w:val="20"/>
@@ -5359,7 +5374,7 @@
       </w:r>
       <w:r>
         <w:rPr>
-          <w:rFonts w:ascii="Arial Unicode MS" w:hAnsi="Arial Unicode MS" w:eastAsia="Arial Unicode MS"/>
+          <w:rFonts w:ascii="Noto Serif KR" w:hAnsi="Noto Serif KR" w:eastAsia="Noto Serif KR"/>
           <w:b/>
           <w:i w:val="0"/>
           <w:sz w:val="21"/>
@@ -5368,7 +5383,7 @@
       </w:r>
       <w:r>
         <w:rPr>
-          <w:rFonts w:ascii="Arial Unicode MS" w:hAnsi="Arial Unicode MS" w:eastAsia="Arial Unicode MS"/>
+          <w:rFonts w:ascii="Noto Serif KR" w:hAnsi="Noto Serif KR" w:eastAsia="Noto Serif KR"/>
           <w:b w:val="0"/>
           <w:i w:val="0"/>
           <w:sz w:val="21"/>
@@ -5383,7 +5398,7 @@
       </w:pPr>
       <w:r>
         <w:rPr>
-          <w:rFonts w:ascii="Arial Unicode MS" w:hAnsi="Arial Unicode MS" w:eastAsia="Arial Unicode MS"/>
+          <w:rFonts w:ascii="Noto Serif KR" w:hAnsi="Noto Serif KR" w:eastAsia="Noto Serif KR"/>
           <w:b w:val="0"/>
           <w:i w:val="0"/>
           <w:sz w:val="20"/>
@@ -5398,7 +5413,7 @@
       </w:pPr>
       <w:r>
         <w:rPr>
-          <w:rFonts w:ascii="Arial Unicode MS" w:hAnsi="Arial Unicode MS" w:eastAsia="Arial Unicode MS"/>
+          <w:rFonts w:ascii="Noto Serif KR" w:hAnsi="Noto Serif KR" w:eastAsia="Noto Serif KR"/>
           <w:b w:val="0"/>
           <w:i w:val="0"/>
           <w:sz w:val="20"/>
@@ -5413,7 +5428,7 @@
       </w:pPr>
       <w:r>
         <w:rPr>
-          <w:rFonts w:ascii="Arial Unicode MS" w:hAnsi="Arial Unicode MS" w:eastAsia="Arial Unicode MS"/>
+          <w:rFonts w:ascii="Noto Serif KR" w:hAnsi="Noto Serif KR" w:eastAsia="Noto Serif KR"/>
           <w:b w:val="0"/>
           <w:i w:val="0"/>
           <w:sz w:val="20"/>
@@ -5428,7 +5443,7 @@
       </w:pPr>
       <w:r>
         <w:rPr>
-          <w:rFonts w:ascii="Arial Unicode MS" w:hAnsi="Arial Unicode MS" w:eastAsia="Arial Unicode MS"/>
+          <w:rFonts w:ascii="Noto Serif KR" w:hAnsi="Noto Serif KR" w:eastAsia="Noto Serif KR"/>
           <w:b w:val="0"/>
           <w:i w:val="0"/>
           <w:sz w:val="20"/>
@@ -5442,7 +5457,7 @@
       </w:pPr>
       <w:r>
         <w:rPr>
-          <w:rFonts w:ascii="Arial Unicode MS" w:hAnsi="Arial Unicode MS" w:eastAsia="Arial Unicode MS"/>
+          <w:rFonts w:ascii="Noto Serif KR" w:hAnsi="Noto Serif KR" w:eastAsia="Noto Serif KR"/>
           <w:b w:val="0"/>
           <w:i/>
           <w:color w:val="666666"/>
@@ -5474,7 +5489,7 @@
           <w:p>
             <w:r>
               <w:rPr>
-                <w:rFonts w:ascii="Arial Unicode MS" w:hAnsi="Arial Unicode MS" w:eastAsia="Arial Unicode MS"/>
+                <w:rFonts w:ascii="Noto Serif KR" w:hAnsi="Noto Serif KR" w:eastAsia="Noto Serif KR"/>
                 <w:b w:val="0"/>
                 <w:i w:val="0"/>
                 <w:sz w:val="20"/>
@@ -5491,7 +5506,7 @@
       </w:pPr>
       <w:r>
         <w:rPr>
-          <w:rFonts w:ascii="Arial Unicode MS" w:hAnsi="Arial Unicode MS" w:eastAsia="Arial Unicode MS"/>
+          <w:rFonts w:ascii="Noto Serif KR" w:hAnsi="Noto Serif KR" w:eastAsia="Noto Serif KR"/>
           <w:b/>
           <w:i w:val="0"/>
           <w:sz w:val="26"/>
@@ -5505,7 +5520,7 @@
       </w:pPr>
       <w:r>
         <w:rPr>
-          <w:rFonts w:ascii="Arial Unicode MS" w:hAnsi="Arial Unicode MS" w:eastAsia="Arial Unicode MS"/>
+          <w:rFonts w:ascii="Noto Serif KR" w:hAnsi="Noto Serif KR" w:eastAsia="Noto Serif KR"/>
           <w:b w:val="0"/>
           <w:i w:val="0"/>
           <w:sz w:val="20"/>
@@ -5513,7 +5528,7 @@
       </w:r>
       <w:r>
         <w:rPr>
-          <w:rFonts w:ascii="Arial Unicode MS" w:hAnsi="Arial Unicode MS" w:eastAsia="Arial Unicode MS"/>
+          <w:rFonts w:ascii="Noto Serif KR" w:hAnsi="Noto Serif KR" w:eastAsia="Noto Serif KR"/>
           <w:b/>
           <w:i w:val="0"/>
           <w:sz w:val="21"/>
@@ -5522,7 +5537,7 @@
       </w:r>
       <w:r>
         <w:rPr>
-          <w:rFonts w:ascii="Arial Unicode MS" w:hAnsi="Arial Unicode MS" w:eastAsia="Arial Unicode MS"/>
+          <w:rFonts w:ascii="Noto Serif KR" w:hAnsi="Noto Serif KR" w:eastAsia="Noto Serif KR"/>
           <w:b w:val="0"/>
           <w:i w:val="0"/>
           <w:sz w:val="21"/>
@@ -5537,7 +5552,7 @@
       </w:pPr>
       <w:r>
         <w:rPr>
-          <w:rFonts w:ascii="Arial Unicode MS" w:hAnsi="Arial Unicode MS" w:eastAsia="Arial Unicode MS"/>
+          <w:rFonts w:ascii="Noto Serif KR" w:hAnsi="Noto Serif KR" w:eastAsia="Noto Serif KR"/>
           <w:b w:val="0"/>
           <w:i w:val="0"/>
           <w:sz w:val="20"/>
@@ -5552,7 +5567,7 @@
       </w:pPr>
       <w:r>
         <w:rPr>
-          <w:rFonts w:ascii="Arial Unicode MS" w:hAnsi="Arial Unicode MS" w:eastAsia="Arial Unicode MS"/>
+          <w:rFonts w:ascii="Noto Serif KR" w:hAnsi="Noto Serif KR" w:eastAsia="Noto Serif KR"/>
           <w:b w:val="0"/>
           <w:i w:val="0"/>
           <w:sz w:val="20"/>
@@ -5567,7 +5582,7 @@
       </w:pPr>
       <w:r>
         <w:rPr>
-          <w:rFonts w:ascii="Arial Unicode MS" w:hAnsi="Arial Unicode MS" w:eastAsia="Arial Unicode MS"/>
+          <w:rFonts w:ascii="Noto Serif KR" w:hAnsi="Noto Serif KR" w:eastAsia="Noto Serif KR"/>
           <w:b w:val="0"/>
           <w:i w:val="0"/>
           <w:sz w:val="20"/>
@@ -5582,7 +5597,7 @@
       </w:pPr>
       <w:r>
         <w:rPr>
-          <w:rFonts w:ascii="Arial Unicode MS" w:hAnsi="Arial Unicode MS" w:eastAsia="Arial Unicode MS"/>
+          <w:rFonts w:ascii="Noto Serif KR" w:hAnsi="Noto Serif KR" w:eastAsia="Noto Serif KR"/>
           <w:b w:val="0"/>
           <w:i w:val="0"/>
           <w:sz w:val="20"/>
@@ -5596,7 +5611,7 @@
       </w:pPr>
       <w:r>
         <w:rPr>
-          <w:rFonts w:ascii="Arial Unicode MS" w:hAnsi="Arial Unicode MS" w:eastAsia="Arial Unicode MS"/>
+          <w:rFonts w:ascii="Noto Serif KR" w:hAnsi="Noto Serif KR" w:eastAsia="Noto Serif KR"/>
           <w:b w:val="0"/>
           <w:i/>
           <w:color w:val="666666"/>
@@ -5628,7 +5643,7 @@
           <w:p>
             <w:r>
               <w:rPr>
-                <w:rFonts w:ascii="Arial Unicode MS" w:hAnsi="Arial Unicode MS" w:eastAsia="Arial Unicode MS"/>
+                <w:rFonts w:ascii="Noto Serif KR" w:hAnsi="Noto Serif KR" w:eastAsia="Noto Serif KR"/>
                 <w:b w:val="0"/>
                 <w:i w:val="0"/>
                 <w:sz w:val="20"/>
@@ -5645,7 +5660,7 @@
       </w:pPr>
       <w:r>
         <w:rPr>
-          <w:rFonts w:ascii="Arial Unicode MS" w:hAnsi="Arial Unicode MS" w:eastAsia="Arial Unicode MS"/>
+          <w:rFonts w:ascii="Noto Serif KR" w:hAnsi="Noto Serif KR" w:eastAsia="Noto Serif KR"/>
           <w:b w:val="0"/>
           <w:i w:val="0"/>
           <w:sz w:val="20"/>
@@ -5653,7 +5668,7 @@
       </w:r>
       <w:r>
         <w:rPr>
-          <w:rFonts w:ascii="Arial Unicode MS" w:hAnsi="Arial Unicode MS" w:eastAsia="Arial Unicode MS"/>
+          <w:rFonts w:ascii="Noto Serif KR" w:hAnsi="Noto Serif KR" w:eastAsia="Noto Serif KR"/>
           <w:b/>
           <w:i w:val="0"/>
           <w:sz w:val="21"/>
@@ -5662,7 +5677,7 @@
       </w:r>
       <w:r>
         <w:rPr>
-          <w:rFonts w:ascii="Arial Unicode MS" w:hAnsi="Arial Unicode MS" w:eastAsia="Arial Unicode MS"/>
+          <w:rFonts w:ascii="Noto Serif KR" w:hAnsi="Noto Serif KR" w:eastAsia="Noto Serif KR"/>
           <w:b w:val="0"/>
           <w:i w:val="0"/>
           <w:sz w:val="21"/>
@@ -5677,7 +5692,7 @@
       </w:pPr>
       <w:r>
         <w:rPr>
-          <w:rFonts w:ascii="Arial Unicode MS" w:hAnsi="Arial Unicode MS" w:eastAsia="Arial Unicode MS"/>
+          <w:rFonts w:ascii="Noto Serif KR" w:hAnsi="Noto Serif KR" w:eastAsia="Noto Serif KR"/>
           <w:b w:val="0"/>
           <w:i w:val="0"/>
           <w:sz w:val="20"/>
@@ -5692,7 +5707,7 @@
       </w:pPr>
       <w:r>
         <w:rPr>
-          <w:rFonts w:ascii="Arial Unicode MS" w:hAnsi="Arial Unicode MS" w:eastAsia="Arial Unicode MS"/>
+          <w:rFonts w:ascii="Noto Serif KR" w:hAnsi="Noto Serif KR" w:eastAsia="Noto Serif KR"/>
           <w:b w:val="0"/>
           <w:i w:val="0"/>
           <w:sz w:val="20"/>
@@ -5707,7 +5722,7 @@
       </w:pPr>
       <w:r>
         <w:rPr>
-          <w:rFonts w:ascii="Arial Unicode MS" w:hAnsi="Arial Unicode MS" w:eastAsia="Arial Unicode MS"/>
+          <w:rFonts w:ascii="Noto Serif KR" w:hAnsi="Noto Serif KR" w:eastAsia="Noto Serif KR"/>
           <w:b w:val="0"/>
           <w:i w:val="0"/>
           <w:sz w:val="20"/>
@@ -5722,7 +5737,7 @@
       </w:pPr>
       <w:r>
         <w:rPr>
-          <w:rFonts w:ascii="Arial Unicode MS" w:hAnsi="Arial Unicode MS" w:eastAsia="Arial Unicode MS"/>
+          <w:rFonts w:ascii="Noto Serif KR" w:hAnsi="Noto Serif KR" w:eastAsia="Noto Serif KR"/>
           <w:b w:val="0"/>
           <w:i w:val="0"/>
           <w:sz w:val="20"/>
@@ -5736,7 +5751,7 @@
       </w:pPr>
       <w:r>
         <w:rPr>
-          <w:rFonts w:ascii="Arial Unicode MS" w:hAnsi="Arial Unicode MS" w:eastAsia="Arial Unicode MS"/>
+          <w:rFonts w:ascii="Noto Serif KR" w:hAnsi="Noto Serif KR" w:eastAsia="Noto Serif KR"/>
           <w:b w:val="0"/>
           <w:i/>
           <w:color w:val="666666"/>
@@ -5768,7 +5783,7 @@
           <w:p>
             <w:r>
               <w:rPr>
-                <w:rFonts w:ascii="Arial Unicode MS" w:hAnsi="Arial Unicode MS" w:eastAsia="Arial Unicode MS"/>
+                <w:rFonts w:ascii="Noto Serif KR" w:hAnsi="Noto Serif KR" w:eastAsia="Noto Serif KR"/>
                 <w:b w:val="0"/>
                 <w:i w:val="0"/>
                 <w:sz w:val="20"/>
@@ -5785,7 +5800,7 @@
       </w:pPr>
       <w:r>
         <w:rPr>
-          <w:rFonts w:ascii="Arial Unicode MS" w:hAnsi="Arial Unicode MS" w:eastAsia="Arial Unicode MS"/>
+          <w:rFonts w:ascii="Noto Serif KR" w:hAnsi="Noto Serif KR" w:eastAsia="Noto Serif KR"/>
           <w:b w:val="0"/>
           <w:i w:val="0"/>
           <w:sz w:val="20"/>
@@ -5793,7 +5808,7 @@
       </w:r>
       <w:r>
         <w:rPr>
-          <w:rFonts w:ascii="Arial Unicode MS" w:hAnsi="Arial Unicode MS" w:eastAsia="Arial Unicode MS"/>
+          <w:rFonts w:ascii="Noto Serif KR" w:hAnsi="Noto Serif KR" w:eastAsia="Noto Serif KR"/>
           <w:b/>
           <w:i w:val="0"/>
           <w:sz w:val="21"/>
@@ -5802,7 +5817,7 @@
       </w:r>
       <w:r>
         <w:rPr>
-          <w:rFonts w:ascii="Arial Unicode MS" w:hAnsi="Arial Unicode MS" w:eastAsia="Arial Unicode MS"/>
+          <w:rFonts w:ascii="Noto Serif KR" w:hAnsi="Noto Serif KR" w:eastAsia="Noto Serif KR"/>
           <w:b w:val="0"/>
           <w:i w:val="0"/>
           <w:sz w:val="21"/>
@@ -5817,7 +5832,7 @@
       </w:pPr>
       <w:r>
         <w:rPr>
-          <w:rFonts w:ascii="Arial Unicode MS" w:hAnsi="Arial Unicode MS" w:eastAsia="Arial Unicode MS"/>
+          <w:rFonts w:ascii="Noto Serif KR" w:hAnsi="Noto Serif KR" w:eastAsia="Noto Serif KR"/>
           <w:b w:val="0"/>
           <w:i w:val="0"/>
           <w:sz w:val="20"/>
@@ -5832,7 +5847,7 @@
       </w:pPr>
       <w:r>
         <w:rPr>
-          <w:rFonts w:ascii="Arial Unicode MS" w:hAnsi="Arial Unicode MS" w:eastAsia="Arial Unicode MS"/>
+          <w:rFonts w:ascii="Noto Serif KR" w:hAnsi="Noto Serif KR" w:eastAsia="Noto Serif KR"/>
           <w:b w:val="0"/>
           <w:i w:val="0"/>
           <w:sz w:val="20"/>
@@ -5847,7 +5862,7 @@
       </w:pPr>
       <w:r>
         <w:rPr>
-          <w:rFonts w:ascii="Arial Unicode MS" w:hAnsi="Arial Unicode MS" w:eastAsia="Arial Unicode MS"/>
+          <w:rFonts w:ascii="Noto Serif KR" w:hAnsi="Noto Serif KR" w:eastAsia="Noto Serif KR"/>
           <w:b w:val="0"/>
           <w:i w:val="0"/>
           <w:sz w:val="20"/>
@@ -5862,7 +5877,7 @@
       </w:pPr>
       <w:r>
         <w:rPr>
-          <w:rFonts w:ascii="Arial Unicode MS" w:hAnsi="Arial Unicode MS" w:eastAsia="Arial Unicode MS"/>
+          <w:rFonts w:ascii="Noto Serif KR" w:hAnsi="Noto Serif KR" w:eastAsia="Noto Serif KR"/>
           <w:b w:val="0"/>
           <w:i w:val="0"/>
           <w:sz w:val="20"/>
@@ -5876,7 +5891,7 @@
       </w:pPr>
       <w:r>
         <w:rPr>
-          <w:rFonts w:ascii="Arial Unicode MS" w:hAnsi="Arial Unicode MS" w:eastAsia="Arial Unicode MS"/>
+          <w:rFonts w:ascii="Noto Serif KR" w:hAnsi="Noto Serif KR" w:eastAsia="Noto Serif KR"/>
           <w:b w:val="0"/>
           <w:i/>
           <w:color w:val="666666"/>
@@ -5908,7 +5923,7 @@
           <w:p>
             <w:r>
               <w:rPr>
-                <w:rFonts w:ascii="Arial Unicode MS" w:hAnsi="Arial Unicode MS" w:eastAsia="Arial Unicode MS"/>
+                <w:rFonts w:ascii="Noto Serif KR" w:hAnsi="Noto Serif KR" w:eastAsia="Noto Serif KR"/>
                 <w:b w:val="0"/>
                 <w:i w:val="0"/>
                 <w:sz w:val="20"/>
@@ -5925,7 +5940,7 @@
       </w:pPr>
       <w:r>
         <w:rPr>
-          <w:rFonts w:ascii="Arial Unicode MS" w:hAnsi="Arial Unicode MS" w:eastAsia="Arial Unicode MS"/>
+          <w:rFonts w:ascii="Noto Serif KR" w:hAnsi="Noto Serif KR" w:eastAsia="Noto Serif KR"/>
           <w:b w:val="0"/>
           <w:i w:val="0"/>
           <w:sz w:val="20"/>
@@ -5933,7 +5948,7 @@
       </w:r>
       <w:r>
         <w:rPr>
-          <w:rFonts w:ascii="Arial Unicode MS" w:hAnsi="Arial Unicode MS" w:eastAsia="Arial Unicode MS"/>
+          <w:rFonts w:ascii="Noto Serif KR" w:hAnsi="Noto Serif KR" w:eastAsia="Noto Serif KR"/>
           <w:b/>
           <w:i w:val="0"/>
           <w:sz w:val="21"/>
@@ -5942,7 +5957,7 @@
       </w:r>
       <w:r>
         <w:rPr>
-          <w:rFonts w:ascii="Arial Unicode MS" w:hAnsi="Arial Unicode MS" w:eastAsia="Arial Unicode MS"/>
+          <w:rFonts w:ascii="Noto Serif KR" w:hAnsi="Noto Serif KR" w:eastAsia="Noto Serif KR"/>
           <w:b w:val="0"/>
           <w:i w:val="0"/>
           <w:sz w:val="21"/>
@@ -5957,7 +5972,7 @@
       </w:pPr>
       <w:r>
         <w:rPr>
-          <w:rFonts w:ascii="Arial Unicode MS" w:hAnsi="Arial Unicode MS" w:eastAsia="Arial Unicode MS"/>
+          <w:rFonts w:ascii="Noto Serif KR" w:hAnsi="Noto Serif KR" w:eastAsia="Noto Serif KR"/>
           <w:b w:val="0"/>
           <w:i w:val="0"/>
           <w:sz w:val="20"/>
@@ -5972,7 +5987,7 @@
       </w:pPr>
       <w:r>
         <w:rPr>
-          <w:rFonts w:ascii="Arial Unicode MS" w:hAnsi="Arial Unicode MS" w:eastAsia="Arial Unicode MS"/>
+          <w:rFonts w:ascii="Noto Serif KR" w:hAnsi="Noto Serif KR" w:eastAsia="Noto Serif KR"/>
           <w:b w:val="0"/>
           <w:i w:val="0"/>
           <w:sz w:val="20"/>
@@ -5987,7 +6002,7 @@
       </w:pPr>
       <w:r>
         <w:rPr>
-          <w:rFonts w:ascii="Arial Unicode MS" w:hAnsi="Arial Unicode MS" w:eastAsia="Arial Unicode MS"/>
+          <w:rFonts w:ascii="Noto Serif KR" w:hAnsi="Noto Serif KR" w:eastAsia="Noto Serif KR"/>
           <w:b w:val="0"/>
           <w:i w:val="0"/>
           <w:sz w:val="20"/>
@@ -6002,7 +6017,7 @@
       </w:pPr>
       <w:r>
         <w:rPr>
-          <w:rFonts w:ascii="Arial Unicode MS" w:hAnsi="Arial Unicode MS" w:eastAsia="Arial Unicode MS"/>
+          <w:rFonts w:ascii="Noto Serif KR" w:hAnsi="Noto Serif KR" w:eastAsia="Noto Serif KR"/>
           <w:b w:val="0"/>
           <w:i w:val="0"/>
           <w:sz w:val="20"/>
@@ -6016,7 +6031,7 @@
       </w:pPr>
       <w:r>
         <w:rPr>
-          <w:rFonts w:ascii="Arial Unicode MS" w:hAnsi="Arial Unicode MS" w:eastAsia="Arial Unicode MS"/>
+          <w:rFonts w:ascii="Noto Serif KR" w:hAnsi="Noto Serif KR" w:eastAsia="Noto Serif KR"/>
           <w:b w:val="0"/>
           <w:i/>
           <w:color w:val="666666"/>
@@ -6048,7 +6063,7 @@
           <w:p>
             <w:r>
               <w:rPr>
-                <w:rFonts w:ascii="Arial Unicode MS" w:hAnsi="Arial Unicode MS" w:eastAsia="Arial Unicode MS"/>
+                <w:rFonts w:ascii="Noto Serif KR" w:hAnsi="Noto Serif KR" w:eastAsia="Noto Serif KR"/>
                 <w:b w:val="0"/>
                 <w:i w:val="0"/>
                 <w:sz w:val="20"/>
@@ -6065,7 +6080,7 @@
       </w:pPr>
       <w:r>
         <w:rPr>
-          <w:rFonts w:ascii="Arial Unicode MS" w:hAnsi="Arial Unicode MS" w:eastAsia="Arial Unicode MS"/>
+          <w:rFonts w:ascii="Noto Serif KR" w:hAnsi="Noto Serif KR" w:eastAsia="Noto Serif KR"/>
           <w:b/>
           <w:i w:val="0"/>
           <w:sz w:val="26"/>
@@ -6079,7 +6094,7 @@
       </w:pPr>
       <w:r>
         <w:rPr>
-          <w:rFonts w:ascii="Arial Unicode MS" w:hAnsi="Arial Unicode MS" w:eastAsia="Arial Unicode MS"/>
+          <w:rFonts w:ascii="Noto Serif KR" w:hAnsi="Noto Serif KR" w:eastAsia="Noto Serif KR"/>
           <w:b w:val="0"/>
           <w:i w:val="0"/>
           <w:sz w:val="20"/>
@@ -6087,7 +6102,7 @@
       </w:r>
       <w:r>
         <w:rPr>
-          <w:rFonts w:ascii="Arial Unicode MS" w:hAnsi="Arial Unicode MS" w:eastAsia="Arial Unicode MS"/>
+          <w:rFonts w:ascii="Noto Serif KR" w:hAnsi="Noto Serif KR" w:eastAsia="Noto Serif KR"/>
           <w:b/>
           <w:i w:val="0"/>
           <w:sz w:val="21"/>
@@ -6096,7 +6111,7 @@
       </w:r>
       <w:r>
         <w:rPr>
-          <w:rFonts w:ascii="Arial Unicode MS" w:hAnsi="Arial Unicode MS" w:eastAsia="Arial Unicode MS"/>
+          <w:rFonts w:ascii="Noto Serif KR" w:hAnsi="Noto Serif KR" w:eastAsia="Noto Serif KR"/>
           <w:b w:val="0"/>
           <w:i w:val="0"/>
           <w:sz w:val="21"/>
@@ -6111,7 +6126,7 @@
       </w:pPr>
       <w:r>
         <w:rPr>
-          <w:rFonts w:ascii="Arial Unicode MS" w:hAnsi="Arial Unicode MS" w:eastAsia="Arial Unicode MS"/>
+          <w:rFonts w:ascii="Noto Serif KR" w:hAnsi="Noto Serif KR" w:eastAsia="Noto Serif KR"/>
           <w:b w:val="0"/>
           <w:i w:val="0"/>
           <w:sz w:val="20"/>
@@ -6126,7 +6141,7 @@
       </w:pPr>
       <w:r>
         <w:rPr>
-          <w:rFonts w:ascii="Arial Unicode MS" w:hAnsi="Arial Unicode MS" w:eastAsia="Arial Unicode MS"/>
+          <w:rFonts w:ascii="Noto Serif KR" w:hAnsi="Noto Serif KR" w:eastAsia="Noto Serif KR"/>
           <w:b w:val="0"/>
           <w:i w:val="0"/>
           <w:sz w:val="20"/>
@@ -6141,7 +6156,7 @@
       </w:pPr>
       <w:r>
         <w:rPr>
-          <w:rFonts w:ascii="Arial Unicode MS" w:hAnsi="Arial Unicode MS" w:eastAsia="Arial Unicode MS"/>
+          <w:rFonts w:ascii="Noto Serif KR" w:hAnsi="Noto Serif KR" w:eastAsia="Noto Serif KR"/>
           <w:b w:val="0"/>
           <w:i w:val="0"/>
           <w:sz w:val="20"/>
@@ -6156,7 +6171,7 @@
       </w:pPr>
       <w:r>
         <w:rPr>
-          <w:rFonts w:ascii="Arial Unicode MS" w:hAnsi="Arial Unicode MS" w:eastAsia="Arial Unicode MS"/>
+          <w:rFonts w:ascii="Noto Serif KR" w:hAnsi="Noto Serif KR" w:eastAsia="Noto Serif KR"/>
           <w:b w:val="0"/>
           <w:i w:val="0"/>
           <w:sz w:val="20"/>
@@ -6170,7 +6185,7 @@
       </w:pPr>
       <w:r>
         <w:rPr>
-          <w:rFonts w:ascii="Arial Unicode MS" w:hAnsi="Arial Unicode MS" w:eastAsia="Arial Unicode MS"/>
+          <w:rFonts w:ascii="Noto Serif KR" w:hAnsi="Noto Serif KR" w:eastAsia="Noto Serif KR"/>
           <w:b w:val="0"/>
           <w:i/>
           <w:color w:val="666666"/>
@@ -6202,7 +6217,7 @@
           <w:p>
             <w:r>
               <w:rPr>
-                <w:rFonts w:ascii="Arial Unicode MS" w:hAnsi="Arial Unicode MS" w:eastAsia="Arial Unicode MS"/>
+                <w:rFonts w:ascii="Noto Serif KR" w:hAnsi="Noto Serif KR" w:eastAsia="Noto Serif KR"/>
                 <w:b w:val="0"/>
                 <w:i w:val="0"/>
                 <w:sz w:val="20"/>
@@ -6219,7 +6234,7 @@
       </w:pPr>
       <w:r>
         <w:rPr>
-          <w:rFonts w:ascii="Arial Unicode MS" w:hAnsi="Arial Unicode MS" w:eastAsia="Arial Unicode MS"/>
+          <w:rFonts w:ascii="Noto Serif KR" w:hAnsi="Noto Serif KR" w:eastAsia="Noto Serif KR"/>
           <w:b w:val="0"/>
           <w:i w:val="0"/>
           <w:sz w:val="20"/>
@@ -6227,7 +6242,7 @@
       </w:r>
       <w:r>
         <w:rPr>
-          <w:rFonts w:ascii="Arial Unicode MS" w:hAnsi="Arial Unicode MS" w:eastAsia="Arial Unicode MS"/>
+          <w:rFonts w:ascii="Noto Serif KR" w:hAnsi="Noto Serif KR" w:eastAsia="Noto Serif KR"/>
           <w:b/>
           <w:i w:val="0"/>
           <w:sz w:val="21"/>
@@ -6236,7 +6251,7 @@
       </w:r>
       <w:r>
         <w:rPr>
-          <w:rFonts w:ascii="Arial Unicode MS" w:hAnsi="Arial Unicode MS" w:eastAsia="Arial Unicode MS"/>
+          <w:rFonts w:ascii="Noto Serif KR" w:hAnsi="Noto Serif KR" w:eastAsia="Noto Serif KR"/>
           <w:b w:val="0"/>
           <w:i w:val="0"/>
           <w:sz w:val="21"/>
@@ -6251,7 +6266,7 @@
       </w:pPr>
       <w:r>
         <w:rPr>
-          <w:rFonts w:ascii="Arial Unicode MS" w:hAnsi="Arial Unicode MS" w:eastAsia="Arial Unicode MS"/>
+          <w:rFonts w:ascii="Noto Serif KR" w:hAnsi="Noto Serif KR" w:eastAsia="Noto Serif KR"/>
           <w:b w:val="0"/>
           <w:i w:val="0"/>
           <w:sz w:val="20"/>
@@ -6266,7 +6281,7 @@
       </w:pPr>
       <w:r>
         <w:rPr>
-          <w:rFonts w:ascii="Arial Unicode MS" w:hAnsi="Arial Unicode MS" w:eastAsia="Arial Unicode MS"/>
+          <w:rFonts w:ascii="Noto Serif KR" w:hAnsi="Noto Serif KR" w:eastAsia="Noto Serif KR"/>
           <w:b w:val="0"/>
           <w:i w:val="0"/>
           <w:sz w:val="20"/>
@@ -6281,7 +6296,7 @@
       </w:pPr>
       <w:r>
         <w:rPr>
-          <w:rFonts w:ascii="Arial Unicode MS" w:hAnsi="Arial Unicode MS" w:eastAsia="Arial Unicode MS"/>
+          <w:rFonts w:ascii="Noto Serif KR" w:hAnsi="Noto Serif KR" w:eastAsia="Noto Serif KR"/>
           <w:b w:val="0"/>
           <w:i w:val="0"/>
           <w:sz w:val="20"/>
@@ -6296,7 +6311,7 @@
       </w:pPr>
       <w:r>
         <w:rPr>
-          <w:rFonts w:ascii="Arial Unicode MS" w:hAnsi="Arial Unicode MS" w:eastAsia="Arial Unicode MS"/>
+          <w:rFonts w:ascii="Noto Serif KR" w:hAnsi="Noto Serif KR" w:eastAsia="Noto Serif KR"/>
           <w:b w:val="0"/>
           <w:i w:val="0"/>
           <w:sz w:val="20"/>
@@ -6310,7 +6325,7 @@
       </w:pPr>
       <w:r>
         <w:rPr>
-          <w:rFonts w:ascii="Arial Unicode MS" w:hAnsi="Arial Unicode MS" w:eastAsia="Arial Unicode MS"/>
+          <w:rFonts w:ascii="Noto Serif KR" w:hAnsi="Noto Serif KR" w:eastAsia="Noto Serif KR"/>
           <w:b w:val="0"/>
           <w:i/>
           <w:color w:val="666666"/>
@@ -6342,7 +6357,7 @@
           <w:p>
             <w:r>
               <w:rPr>
-                <w:rFonts w:ascii="Arial Unicode MS" w:hAnsi="Arial Unicode MS" w:eastAsia="Arial Unicode MS"/>
+                <w:rFonts w:ascii="Noto Serif KR" w:hAnsi="Noto Serif KR" w:eastAsia="Noto Serif KR"/>
                 <w:b w:val="0"/>
                 <w:i w:val="0"/>
                 <w:sz w:val="20"/>
@@ -6359,7 +6374,7 @@
       </w:pPr>
       <w:r>
         <w:rPr>
-          <w:rFonts w:ascii="Arial Unicode MS" w:hAnsi="Arial Unicode MS" w:eastAsia="Arial Unicode MS"/>
+          <w:rFonts w:ascii="Noto Serif KR" w:hAnsi="Noto Serif KR" w:eastAsia="Noto Serif KR"/>
           <w:b w:val="0"/>
           <w:i w:val="0"/>
           <w:sz w:val="20"/>
@@ -6367,7 +6382,7 @@
       </w:r>
       <w:r>
         <w:rPr>
-          <w:rFonts w:ascii="Arial Unicode MS" w:hAnsi="Arial Unicode MS" w:eastAsia="Arial Unicode MS"/>
+          <w:rFonts w:ascii="Noto Serif KR" w:hAnsi="Noto Serif KR" w:eastAsia="Noto Serif KR"/>
           <w:b/>
           <w:i w:val="0"/>
           <w:sz w:val="21"/>
@@ -6376,7 +6391,7 @@
       </w:r>
       <w:r>
         <w:rPr>
-          <w:rFonts w:ascii="Arial Unicode MS" w:hAnsi="Arial Unicode MS" w:eastAsia="Arial Unicode MS"/>
+          <w:rFonts w:ascii="Noto Serif KR" w:hAnsi="Noto Serif KR" w:eastAsia="Noto Serif KR"/>
           <w:b w:val="0"/>
           <w:i w:val="0"/>
           <w:sz w:val="21"/>
@@ -6391,7 +6406,7 @@
       </w:pPr>
       <w:r>
         <w:rPr>
-          <w:rFonts w:ascii="Arial Unicode MS" w:hAnsi="Arial Unicode MS" w:eastAsia="Arial Unicode MS"/>
+          <w:rFonts w:ascii="Noto Serif KR" w:hAnsi="Noto Serif KR" w:eastAsia="Noto Serif KR"/>
           <w:b w:val="0"/>
           <w:i w:val="0"/>
           <w:sz w:val="20"/>
@@ -6406,7 +6421,7 @@
       </w:pPr>
       <w:r>
         <w:rPr>
-          <w:rFonts w:ascii="Arial Unicode MS" w:hAnsi="Arial Unicode MS" w:eastAsia="Arial Unicode MS"/>
+          <w:rFonts w:ascii="Noto Serif KR" w:hAnsi="Noto Serif KR" w:eastAsia="Noto Serif KR"/>
           <w:b w:val="0"/>
           <w:i w:val="0"/>
           <w:sz w:val="20"/>
@@ -6421,7 +6436,7 @@
       </w:pPr>
       <w:r>
         <w:rPr>
-          <w:rFonts w:ascii="Arial Unicode MS" w:hAnsi="Arial Unicode MS" w:eastAsia="Arial Unicode MS"/>
+          <w:rFonts w:ascii="Noto Serif KR" w:hAnsi="Noto Serif KR" w:eastAsia="Noto Serif KR"/>
           <w:b w:val="0"/>
           <w:i w:val="0"/>
           <w:sz w:val="20"/>
@@ -6436,7 +6451,7 @@
       </w:pPr>
       <w:r>
         <w:rPr>
-          <w:rFonts w:ascii="Arial Unicode MS" w:hAnsi="Arial Unicode MS" w:eastAsia="Arial Unicode MS"/>
+          <w:rFonts w:ascii="Noto Serif KR" w:hAnsi="Noto Serif KR" w:eastAsia="Noto Serif KR"/>
           <w:b w:val="0"/>
           <w:i w:val="0"/>
           <w:sz w:val="20"/>
@@ -6450,7 +6465,7 @@
       </w:pPr>
       <w:r>
         <w:rPr>
-          <w:rFonts w:ascii="Arial Unicode MS" w:hAnsi="Arial Unicode MS" w:eastAsia="Arial Unicode MS"/>
+          <w:rFonts w:ascii="Noto Serif KR" w:hAnsi="Noto Serif KR" w:eastAsia="Noto Serif KR"/>
           <w:b w:val="0"/>
           <w:i/>
           <w:color w:val="666666"/>
@@ -6482,7 +6497,7 @@
           <w:p>
             <w:r>
               <w:rPr>
-                <w:rFonts w:ascii="Arial Unicode MS" w:hAnsi="Arial Unicode MS" w:eastAsia="Arial Unicode MS"/>
+                <w:rFonts w:ascii="Noto Serif KR" w:hAnsi="Noto Serif KR" w:eastAsia="Noto Serif KR"/>
                 <w:b w:val="0"/>
                 <w:i w:val="0"/>
                 <w:sz w:val="20"/>
@@ -6499,7 +6514,7 @@
       </w:pPr>
       <w:r>
         <w:rPr>
-          <w:rFonts w:ascii="Arial Unicode MS" w:hAnsi="Arial Unicode MS" w:eastAsia="Arial Unicode MS"/>
+          <w:rFonts w:ascii="Noto Serif KR" w:hAnsi="Noto Serif KR" w:eastAsia="Noto Serif KR"/>
           <w:b w:val="0"/>
           <w:i w:val="0"/>
           <w:sz w:val="20"/>
@@ -6507,7 +6522,7 @@
       </w:r>
       <w:r>
         <w:rPr>
-          <w:rFonts w:ascii="Arial Unicode MS" w:hAnsi="Arial Unicode MS" w:eastAsia="Arial Unicode MS"/>
+          <w:rFonts w:ascii="Noto Serif KR" w:hAnsi="Noto Serif KR" w:eastAsia="Noto Serif KR"/>
           <w:b/>
           <w:i w:val="0"/>
           <w:sz w:val="21"/>
@@ -6516,7 +6531,7 @@
       </w:r>
       <w:r>
         <w:rPr>
-          <w:rFonts w:ascii="Arial Unicode MS" w:hAnsi="Arial Unicode MS" w:eastAsia="Arial Unicode MS"/>
+          <w:rFonts w:ascii="Noto Serif KR" w:hAnsi="Noto Serif KR" w:eastAsia="Noto Serif KR"/>
           <w:b w:val="0"/>
           <w:i w:val="0"/>
           <w:sz w:val="21"/>
@@ -6531,7 +6546,7 @@
       </w:pPr>
       <w:r>
         <w:rPr>
-          <w:rFonts w:ascii="Arial Unicode MS" w:hAnsi="Arial Unicode MS" w:eastAsia="Arial Unicode MS"/>
+          <w:rFonts w:ascii="Noto Serif KR" w:hAnsi="Noto Serif KR" w:eastAsia="Noto Serif KR"/>
           <w:b w:val="0"/>
           <w:i w:val="0"/>
           <w:sz w:val="20"/>
@@ -6546,7 +6561,7 @@
       </w:pPr>
       <w:r>
         <w:rPr>
-          <w:rFonts w:ascii="Arial Unicode MS" w:hAnsi="Arial Unicode MS" w:eastAsia="Arial Unicode MS"/>
+          <w:rFonts w:ascii="Noto Serif KR" w:hAnsi="Noto Serif KR" w:eastAsia="Noto Serif KR"/>
           <w:b w:val="0"/>
           <w:i w:val="0"/>
           <w:sz w:val="20"/>
@@ -6561,7 +6576,7 @@
       </w:pPr>
       <w:r>
         <w:rPr>
-          <w:rFonts w:ascii="Arial Unicode MS" w:hAnsi="Arial Unicode MS" w:eastAsia="Arial Unicode MS"/>
+          <w:rFonts w:ascii="Noto Serif KR" w:hAnsi="Noto Serif KR" w:eastAsia="Noto Serif KR"/>
           <w:b w:val="0"/>
           <w:i w:val="0"/>
           <w:sz w:val="20"/>
@@ -6576,7 +6591,7 @@
       </w:pPr>
       <w:r>
         <w:rPr>
-          <w:rFonts w:ascii="Arial Unicode MS" w:hAnsi="Arial Unicode MS" w:eastAsia="Arial Unicode MS"/>
+          <w:rFonts w:ascii="Noto Serif KR" w:hAnsi="Noto Serif KR" w:eastAsia="Noto Serif KR"/>
           <w:b w:val="0"/>
           <w:i w:val="0"/>
           <w:sz w:val="20"/>
@@ -6590,7 +6605,7 @@
       </w:pPr>
       <w:r>
         <w:rPr>
-          <w:rFonts w:ascii="Arial Unicode MS" w:hAnsi="Arial Unicode MS" w:eastAsia="Arial Unicode MS"/>
+          <w:rFonts w:ascii="Noto Serif KR" w:hAnsi="Noto Serif KR" w:eastAsia="Noto Serif KR"/>
           <w:b w:val="0"/>
           <w:i/>
           <w:color w:val="666666"/>
@@ -6622,7 +6637,7 @@
           <w:p>
             <w:r>
               <w:rPr>
-                <w:rFonts w:ascii="Arial Unicode MS" w:hAnsi="Arial Unicode MS" w:eastAsia="Arial Unicode MS"/>
+                <w:rFonts w:ascii="Noto Serif KR" w:hAnsi="Noto Serif KR" w:eastAsia="Noto Serif KR"/>
                 <w:b w:val="0"/>
                 <w:i w:val="0"/>
                 <w:sz w:val="20"/>
@@ -6639,7 +6654,7 @@
       </w:pPr>
       <w:r>
         <w:rPr>
-          <w:rFonts w:ascii="Arial Unicode MS" w:hAnsi="Arial Unicode MS" w:eastAsia="Arial Unicode MS"/>
+          <w:rFonts w:ascii="Noto Serif KR" w:hAnsi="Noto Serif KR" w:eastAsia="Noto Serif KR"/>
           <w:b/>
           <w:i w:val="0"/>
           <w:sz w:val="26"/>
@@ -6653,7 +6668,7 @@
       </w:pPr>
       <w:r>
         <w:rPr>
-          <w:rFonts w:ascii="Arial Unicode MS" w:hAnsi="Arial Unicode MS" w:eastAsia="Arial Unicode MS"/>
+          <w:rFonts w:ascii="Noto Serif KR" w:hAnsi="Noto Serif KR" w:eastAsia="Noto Serif KR"/>
           <w:b w:val="0"/>
           <w:i w:val="0"/>
           <w:sz w:val="20"/>
@@ -6661,7 +6676,7 @@
       </w:r>
       <w:r>
         <w:rPr>
-          <w:rFonts w:ascii="Arial Unicode MS" w:hAnsi="Arial Unicode MS" w:eastAsia="Arial Unicode MS"/>
+          <w:rFonts w:ascii="Noto Serif KR" w:hAnsi="Noto Serif KR" w:eastAsia="Noto Serif KR"/>
           <w:b/>
           <w:i w:val="0"/>
           <w:sz w:val="21"/>
@@ -6670,7 +6685,7 @@
       </w:r>
       <w:r>
         <w:rPr>
-          <w:rFonts w:ascii="Arial Unicode MS" w:hAnsi="Arial Unicode MS" w:eastAsia="Arial Unicode MS"/>
+          <w:rFonts w:ascii="Noto Serif KR" w:hAnsi="Noto Serif KR" w:eastAsia="Noto Serif KR"/>
           <w:b w:val="0"/>
           <w:i w:val="0"/>
           <w:sz w:val="21"/>
@@ -6685,7 +6700,7 @@
       </w:pPr>
       <w:r>
         <w:rPr>
-          <w:rFonts w:ascii="Arial Unicode MS" w:hAnsi="Arial Unicode MS" w:eastAsia="Arial Unicode MS"/>
+          <w:rFonts w:ascii="Noto Serif KR" w:hAnsi="Noto Serif KR" w:eastAsia="Noto Serif KR"/>
           <w:b w:val="0"/>
           <w:i w:val="0"/>
           <w:sz w:val="20"/>
@@ -6700,7 +6715,7 @@
       </w:pPr>
       <w:r>
         <w:rPr>
-          <w:rFonts w:ascii="Arial Unicode MS" w:hAnsi="Arial Unicode MS" w:eastAsia="Arial Unicode MS"/>
+          <w:rFonts w:ascii="Noto Serif KR" w:hAnsi="Noto Serif KR" w:eastAsia="Noto Serif KR"/>
           <w:b w:val="0"/>
           <w:i w:val="0"/>
           <w:sz w:val="20"/>
@@ -6715,7 +6730,7 @@
       </w:pPr>
       <w:r>
         <w:rPr>
-          <w:rFonts w:ascii="Arial Unicode MS" w:hAnsi="Arial Unicode MS" w:eastAsia="Arial Unicode MS"/>
+          <w:rFonts w:ascii="Noto Serif KR" w:hAnsi="Noto Serif KR" w:eastAsia="Noto Serif KR"/>
           <w:b w:val="0"/>
           <w:i w:val="0"/>
           <w:sz w:val="20"/>
@@ -6730,7 +6745,7 @@
       </w:pPr>
       <w:r>
         <w:rPr>
-          <w:rFonts w:ascii="Arial Unicode MS" w:hAnsi="Arial Unicode MS" w:eastAsia="Arial Unicode MS"/>
+          <w:rFonts w:ascii="Noto Serif KR" w:hAnsi="Noto Serif KR" w:eastAsia="Noto Serif KR"/>
           <w:b w:val="0"/>
           <w:i w:val="0"/>
           <w:sz w:val="20"/>
@@ -6744,7 +6759,7 @@
       </w:pPr>
       <w:r>
         <w:rPr>
-          <w:rFonts w:ascii="Arial Unicode MS" w:hAnsi="Arial Unicode MS" w:eastAsia="Arial Unicode MS"/>
+          <w:rFonts w:ascii="Noto Serif KR" w:hAnsi="Noto Serif KR" w:eastAsia="Noto Serif KR"/>
           <w:b w:val="0"/>
           <w:i/>
           <w:color w:val="666666"/>
@@ -6776,7 +6791,7 @@
           <w:p>
             <w:r>
               <w:rPr>
-                <w:rFonts w:ascii="Arial Unicode MS" w:hAnsi="Arial Unicode MS" w:eastAsia="Arial Unicode MS"/>
+                <w:rFonts w:ascii="Noto Serif KR" w:hAnsi="Noto Serif KR" w:eastAsia="Noto Serif KR"/>
                 <w:b w:val="0"/>
                 <w:i w:val="0"/>
                 <w:sz w:val="20"/>
@@ -6793,7 +6808,7 @@
       </w:pPr>
       <w:r>
         <w:rPr>
-          <w:rFonts w:ascii="Arial Unicode MS" w:hAnsi="Arial Unicode MS" w:eastAsia="Arial Unicode MS"/>
+          <w:rFonts w:ascii="Noto Serif KR" w:hAnsi="Noto Serif KR" w:eastAsia="Noto Serif KR"/>
           <w:b w:val="0"/>
           <w:i w:val="0"/>
           <w:sz w:val="20"/>
@@ -6801,7 +6816,7 @@
       </w:r>
       <w:r>
         <w:rPr>
-          <w:rFonts w:ascii="Arial Unicode MS" w:hAnsi="Arial Unicode MS" w:eastAsia="Arial Unicode MS"/>
+          <w:rFonts w:ascii="Noto Serif KR" w:hAnsi="Noto Serif KR" w:eastAsia="Noto Serif KR"/>
           <w:b/>
           <w:i w:val="0"/>
           <w:sz w:val="21"/>
@@ -6810,7 +6825,7 @@
       </w:r>
       <w:r>
         <w:rPr>
-          <w:rFonts w:ascii="Arial Unicode MS" w:hAnsi="Arial Unicode MS" w:eastAsia="Arial Unicode MS"/>
+          <w:rFonts w:ascii="Noto Serif KR" w:hAnsi="Noto Serif KR" w:eastAsia="Noto Serif KR"/>
           <w:b w:val="0"/>
           <w:i w:val="0"/>
           <w:sz w:val="21"/>
@@ -6825,7 +6840,7 @@
       </w:pPr>
       <w:r>
         <w:rPr>
-          <w:rFonts w:ascii="Arial Unicode MS" w:hAnsi="Arial Unicode MS" w:eastAsia="Arial Unicode MS"/>
+          <w:rFonts w:ascii="Noto Serif KR" w:hAnsi="Noto Serif KR" w:eastAsia="Noto Serif KR"/>
           <w:b w:val="0"/>
           <w:i w:val="0"/>
           <w:sz w:val="20"/>
@@ -6840,7 +6855,7 @@
       </w:pPr>
       <w:r>
         <w:rPr>
-          <w:rFonts w:ascii="Arial Unicode MS" w:hAnsi="Arial Unicode MS" w:eastAsia="Arial Unicode MS"/>
+          <w:rFonts w:ascii="Noto Serif KR" w:hAnsi="Noto Serif KR" w:eastAsia="Noto Serif KR"/>
           <w:b w:val="0"/>
           <w:i w:val="0"/>
           <w:sz w:val="20"/>
@@ -6855,7 +6870,7 @@
       </w:pPr>
       <w:r>
         <w:rPr>
-          <w:rFonts w:ascii="Arial Unicode MS" w:hAnsi="Arial Unicode MS" w:eastAsia="Arial Unicode MS"/>
+          <w:rFonts w:ascii="Noto Serif KR" w:hAnsi="Noto Serif KR" w:eastAsia="Noto Serif KR"/>
           <w:b w:val="0"/>
           <w:i w:val="0"/>
           <w:sz w:val="20"/>
@@ -6870,7 +6885,7 @@
       </w:pPr>
       <w:r>
         <w:rPr>
-          <w:rFonts w:ascii="Arial Unicode MS" w:hAnsi="Arial Unicode MS" w:eastAsia="Arial Unicode MS"/>
+          <w:rFonts w:ascii="Noto Serif KR" w:hAnsi="Noto Serif KR" w:eastAsia="Noto Serif KR"/>
           <w:b w:val="0"/>
           <w:i w:val="0"/>
           <w:sz w:val="20"/>
@@ -6884,7 +6899,7 @@
       </w:pPr>
       <w:r>
         <w:rPr>
-          <w:rFonts w:ascii="Arial Unicode MS" w:hAnsi="Arial Unicode MS" w:eastAsia="Arial Unicode MS"/>
+          <w:rFonts w:ascii="Noto Serif KR" w:hAnsi="Noto Serif KR" w:eastAsia="Noto Serif KR"/>
           <w:b w:val="0"/>
           <w:i/>
           <w:color w:val="666666"/>
@@ -6916,7 +6931,7 @@
           <w:p>
             <w:r>
               <w:rPr>
-                <w:rFonts w:ascii="Arial Unicode MS" w:hAnsi="Arial Unicode MS" w:eastAsia="Arial Unicode MS"/>
+                <w:rFonts w:ascii="Noto Serif KR" w:hAnsi="Noto Serif KR" w:eastAsia="Noto Serif KR"/>
                 <w:b w:val="0"/>
                 <w:i w:val="0"/>
                 <w:sz w:val="20"/>
@@ -6933,7 +6948,7 @@
       </w:pPr>
       <w:r>
         <w:rPr>
-          <w:rFonts w:ascii="Arial Unicode MS" w:hAnsi="Arial Unicode MS" w:eastAsia="Arial Unicode MS"/>
+          <w:rFonts w:ascii="Noto Serif KR" w:hAnsi="Noto Serif KR" w:eastAsia="Noto Serif KR"/>
           <w:b w:val="0"/>
           <w:i w:val="0"/>
           <w:sz w:val="20"/>
@@ -6941,7 +6956,7 @@
       </w:r>
       <w:r>
         <w:rPr>
-          <w:rFonts w:ascii="Arial Unicode MS" w:hAnsi="Arial Unicode MS" w:eastAsia="Arial Unicode MS"/>
+          <w:rFonts w:ascii="Noto Serif KR" w:hAnsi="Noto Serif KR" w:eastAsia="Noto Serif KR"/>
           <w:b/>
           <w:i w:val="0"/>
           <w:sz w:val="21"/>
@@ -6950,7 +6965,7 @@
       </w:r>
       <w:r>
         <w:rPr>
-          <w:rFonts w:ascii="Arial Unicode MS" w:hAnsi="Arial Unicode MS" w:eastAsia="Arial Unicode MS"/>
+          <w:rFonts w:ascii="Noto Serif KR" w:hAnsi="Noto Serif KR" w:eastAsia="Noto Serif KR"/>
           <w:b w:val="0"/>
           <w:i w:val="0"/>
           <w:sz w:val="21"/>
@@ -6965,7 +6980,7 @@
       </w:pPr>
       <w:r>
         <w:rPr>
-          <w:rFonts w:ascii="Arial Unicode MS" w:hAnsi="Arial Unicode MS" w:eastAsia="Arial Unicode MS"/>
+          <w:rFonts w:ascii="Noto Serif KR" w:hAnsi="Noto Serif KR" w:eastAsia="Noto Serif KR"/>
           <w:b w:val="0"/>
           <w:i w:val="0"/>
           <w:sz w:val="20"/>
@@ -6980,7 +6995,7 @@
       </w:pPr>
       <w:r>
         <w:rPr>
-          <w:rFonts w:ascii="Arial Unicode MS" w:hAnsi="Arial Unicode MS" w:eastAsia="Arial Unicode MS"/>
+          <w:rFonts w:ascii="Noto Serif KR" w:hAnsi="Noto Serif KR" w:eastAsia="Noto Serif KR"/>
           <w:b w:val="0"/>
           <w:i w:val="0"/>
           <w:sz w:val="20"/>
@@ -6995,7 +7010,7 @@
       </w:pPr>
       <w:r>
         <w:rPr>
-          <w:rFonts w:ascii="Arial Unicode MS" w:hAnsi="Arial Unicode MS" w:eastAsia="Arial Unicode MS"/>
+          <w:rFonts w:ascii="Noto Serif KR" w:hAnsi="Noto Serif KR" w:eastAsia="Noto Serif KR"/>
           <w:b w:val="0"/>
           <w:i w:val="0"/>
           <w:sz w:val="20"/>
@@ -7010,7 +7025,7 @@
       </w:pPr>
       <w:r>
         <w:rPr>
-          <w:rFonts w:ascii="Arial Unicode MS" w:hAnsi="Arial Unicode MS" w:eastAsia="Arial Unicode MS"/>
+          <w:rFonts w:ascii="Noto Serif KR" w:hAnsi="Noto Serif KR" w:eastAsia="Noto Serif KR"/>
           <w:b w:val="0"/>
           <w:i w:val="0"/>
           <w:sz w:val="20"/>
@@ -7024,7 +7039,7 @@
       </w:pPr>
       <w:r>
         <w:rPr>
-          <w:rFonts w:ascii="Arial Unicode MS" w:hAnsi="Arial Unicode MS" w:eastAsia="Arial Unicode MS"/>
+          <w:rFonts w:ascii="Noto Serif KR" w:hAnsi="Noto Serif KR" w:eastAsia="Noto Serif KR"/>
           <w:b w:val="0"/>
           <w:i/>
           <w:color w:val="666666"/>
@@ -7056,7 +7071,7 @@
           <w:p>
             <w:r>
               <w:rPr>
-                <w:rFonts w:ascii="Arial Unicode MS" w:hAnsi="Arial Unicode MS" w:eastAsia="Arial Unicode MS"/>
+                <w:rFonts w:ascii="Noto Serif KR" w:hAnsi="Noto Serif KR" w:eastAsia="Noto Serif KR"/>
                 <w:b w:val="0"/>
                 <w:i w:val="0"/>
                 <w:sz w:val="20"/>

</xml_diff>

<commit_message>
fix: close readiness v5 report and document gaps
</commit_message>
<xml_diff>
--- a/docs/survey/Global Market Entry Readiness Assessment 46 Questions v5.0.docx
+++ b/docs/survey/Global Market Entry Readiness Assessment 46 Questions v5.0.docx
@@ -401,6 +401,7 @@
     </w:p>
     <w:p>
       <w:pPr>
+        <w:keepNext/>
         <w:spacing w:before="160" w:after="100"/>
       </w:pPr>
       <w:r>
@@ -415,6 +416,7 @@
     </w:p>
     <w:p>
       <w:pPr>
+        <w:keepNext/>
         <w:spacing w:before="140" w:after="80"/>
       </w:pPr>
       <w:r>
@@ -446,6 +448,7 @@
     </w:p>
     <w:p>
       <w:pPr>
+        <w:keepNext/>
         <w:spacing w:before="0" w:after="40"/>
         <w:ind w:left="288"/>
       </w:pPr>
@@ -461,6 +464,7 @@
     </w:p>
     <w:p>
       <w:pPr>
+        <w:keepNext/>
         <w:spacing w:before="0" w:after="40"/>
         <w:ind w:left="288"/>
       </w:pPr>
@@ -476,6 +480,7 @@
     </w:p>
     <w:p>
       <w:pPr>
+        <w:keepNext/>
         <w:spacing w:before="0" w:after="40"/>
         <w:ind w:left="288"/>
       </w:pPr>
@@ -491,6 +496,7 @@
     </w:p>
     <w:p>
       <w:pPr>
+        <w:keepNext/>
         <w:spacing w:before="0" w:after="40"/>
         <w:ind w:left="288"/>
       </w:pPr>
@@ -506,6 +512,7 @@
     </w:p>
     <w:p>
       <w:pPr>
+        <w:keepNext/>
         <w:spacing w:before="60" w:after="60"/>
       </w:pPr>
       <w:r>
@@ -529,6 +536,9 @@
         <w:gridCol w:w="10368"/>
       </w:tblGrid>
       <w:tr>
+        <w:trPr>
+          <w:cantSplit/>
+        </w:trPr>
         <w:tc>
           <w:tcPr>
             <w:tcW w:type="dxa" w:w="10368"/>
@@ -555,6 +565,7 @@
     </w:tbl>
     <w:p>
       <w:pPr>
+        <w:keepNext/>
         <w:spacing w:before="140" w:after="80"/>
       </w:pPr>
       <w:r>
@@ -586,6 +597,7 @@
     </w:p>
     <w:p>
       <w:pPr>
+        <w:keepNext/>
         <w:spacing w:before="0" w:after="40"/>
         <w:ind w:left="288"/>
       </w:pPr>
@@ -601,6 +613,7 @@
     </w:p>
     <w:p>
       <w:pPr>
+        <w:keepNext/>
         <w:spacing w:before="0" w:after="40"/>
         <w:ind w:left="288"/>
       </w:pPr>
@@ -616,6 +629,7 @@
     </w:p>
     <w:p>
       <w:pPr>
+        <w:keepNext/>
         <w:spacing w:before="0" w:after="40"/>
         <w:ind w:left="288"/>
       </w:pPr>
@@ -631,6 +645,7 @@
     </w:p>
     <w:p>
       <w:pPr>
+        <w:keepNext/>
         <w:spacing w:before="0" w:after="40"/>
         <w:ind w:left="288"/>
       </w:pPr>
@@ -646,6 +661,7 @@
     </w:p>
     <w:p>
       <w:pPr>
+        <w:keepNext/>
         <w:spacing w:before="60" w:after="60"/>
       </w:pPr>
       <w:r>
@@ -669,6 +685,9 @@
         <w:gridCol w:w="10368"/>
       </w:tblGrid>
       <w:tr>
+        <w:trPr>
+          <w:cantSplit/>
+        </w:trPr>
         <w:tc>
           <w:tcPr>
             <w:tcW w:type="dxa" w:w="10368"/>
@@ -695,6 +714,7 @@
     </w:tbl>
     <w:p>
       <w:pPr>
+        <w:keepNext/>
         <w:spacing w:before="140" w:after="80"/>
       </w:pPr>
       <w:r>
@@ -726,6 +746,7 @@
     </w:p>
     <w:p>
       <w:pPr>
+        <w:keepNext/>
         <w:spacing w:before="0" w:after="40"/>
         <w:ind w:left="288"/>
       </w:pPr>
@@ -741,6 +762,7 @@
     </w:p>
     <w:p>
       <w:pPr>
+        <w:keepNext/>
         <w:spacing w:before="0" w:after="40"/>
         <w:ind w:left="288"/>
       </w:pPr>
@@ -756,6 +778,7 @@
     </w:p>
     <w:p>
       <w:pPr>
+        <w:keepNext/>
         <w:spacing w:before="0" w:after="40"/>
         <w:ind w:left="288"/>
       </w:pPr>
@@ -771,6 +794,7 @@
     </w:p>
     <w:p>
       <w:pPr>
+        <w:keepNext/>
         <w:spacing w:before="0" w:after="40"/>
         <w:ind w:left="288"/>
       </w:pPr>
@@ -786,6 +810,7 @@
     </w:p>
     <w:p>
       <w:pPr>
+        <w:keepNext/>
         <w:spacing w:before="60" w:after="60"/>
       </w:pPr>
       <w:r>
@@ -809,6 +834,9 @@
         <w:gridCol w:w="10368"/>
       </w:tblGrid>
       <w:tr>
+        <w:trPr>
+          <w:cantSplit/>
+        </w:trPr>
         <w:tc>
           <w:tcPr>
             <w:tcW w:type="dxa" w:w="10368"/>
@@ -835,6 +863,7 @@
     </w:tbl>
     <w:p>
       <w:pPr>
+        <w:keepNext/>
         <w:spacing w:before="160" w:after="100"/>
       </w:pPr>
       <w:r>
@@ -849,6 +878,7 @@
     </w:p>
     <w:p>
       <w:pPr>
+        <w:keepNext/>
         <w:spacing w:before="140" w:after="80"/>
       </w:pPr>
       <w:r>
@@ -880,6 +910,7 @@
     </w:p>
     <w:p>
       <w:pPr>
+        <w:keepNext/>
         <w:spacing w:before="0" w:after="40"/>
         <w:ind w:left="288"/>
       </w:pPr>
@@ -895,6 +926,7 @@
     </w:p>
     <w:p>
       <w:pPr>
+        <w:keepNext/>
         <w:spacing w:before="0" w:after="40"/>
         <w:ind w:left="288"/>
       </w:pPr>
@@ -910,6 +942,7 @@
     </w:p>
     <w:p>
       <w:pPr>
+        <w:keepNext/>
         <w:spacing w:before="0" w:after="40"/>
         <w:ind w:left="288"/>
       </w:pPr>
@@ -925,6 +958,7 @@
     </w:p>
     <w:p>
       <w:pPr>
+        <w:keepNext/>
         <w:spacing w:before="0" w:after="40"/>
         <w:ind w:left="288"/>
       </w:pPr>
@@ -940,6 +974,7 @@
     </w:p>
     <w:p>
       <w:pPr>
+        <w:keepNext/>
         <w:spacing w:before="60" w:after="60"/>
       </w:pPr>
       <w:r>
@@ -963,6 +998,9 @@
         <w:gridCol w:w="10368"/>
       </w:tblGrid>
       <w:tr>
+        <w:trPr>
+          <w:cantSplit/>
+        </w:trPr>
         <w:tc>
           <w:tcPr>
             <w:tcW w:type="dxa" w:w="10368"/>
@@ -989,6 +1027,7 @@
     </w:tbl>
     <w:p>
       <w:pPr>
+        <w:keepNext/>
         <w:spacing w:before="140" w:after="80"/>
       </w:pPr>
       <w:r>
@@ -1020,6 +1059,7 @@
     </w:p>
     <w:p>
       <w:pPr>
+        <w:keepNext/>
         <w:spacing w:before="0" w:after="40"/>
         <w:ind w:left="288"/>
       </w:pPr>
@@ -1035,6 +1075,7 @@
     </w:p>
     <w:p>
       <w:pPr>
+        <w:keepNext/>
         <w:spacing w:before="0" w:after="40"/>
         <w:ind w:left="288"/>
       </w:pPr>
@@ -1050,6 +1091,7 @@
     </w:p>
     <w:p>
       <w:pPr>
+        <w:keepNext/>
         <w:spacing w:before="0" w:after="40"/>
         <w:ind w:left="288"/>
       </w:pPr>
@@ -1065,6 +1107,7 @@
     </w:p>
     <w:p>
       <w:pPr>
+        <w:keepNext/>
         <w:spacing w:before="0" w:after="40"/>
         <w:ind w:left="288"/>
       </w:pPr>
@@ -1080,6 +1123,7 @@
     </w:p>
     <w:p>
       <w:pPr>
+        <w:keepNext/>
         <w:spacing w:before="60" w:after="60"/>
       </w:pPr>
       <w:r>
@@ -1103,6 +1147,9 @@
         <w:gridCol w:w="10368"/>
       </w:tblGrid>
       <w:tr>
+        <w:trPr>
+          <w:cantSplit/>
+        </w:trPr>
         <w:tc>
           <w:tcPr>
             <w:tcW w:type="dxa" w:w="10368"/>
@@ -1129,6 +1176,7 @@
     </w:tbl>
     <w:p>
       <w:pPr>
+        <w:keepNext/>
         <w:spacing w:before="140" w:after="80"/>
       </w:pPr>
       <w:r>
@@ -1160,6 +1208,7 @@
     </w:p>
     <w:p>
       <w:pPr>
+        <w:keepNext/>
         <w:spacing w:before="0" w:after="40"/>
         <w:ind w:left="288"/>
       </w:pPr>
@@ -1175,6 +1224,7 @@
     </w:p>
     <w:p>
       <w:pPr>
+        <w:keepNext/>
         <w:spacing w:before="0" w:after="40"/>
         <w:ind w:left="288"/>
       </w:pPr>
@@ -1190,6 +1240,7 @@
     </w:p>
     <w:p>
       <w:pPr>
+        <w:keepNext/>
         <w:spacing w:before="0" w:after="40"/>
         <w:ind w:left="288"/>
       </w:pPr>
@@ -1205,6 +1256,7 @@
     </w:p>
     <w:p>
       <w:pPr>
+        <w:keepNext/>
         <w:spacing w:before="0" w:after="40"/>
         <w:ind w:left="288"/>
       </w:pPr>
@@ -1220,6 +1272,7 @@
     </w:p>
     <w:p>
       <w:pPr>
+        <w:keepNext/>
         <w:spacing w:before="60" w:after="60"/>
       </w:pPr>
       <w:r>
@@ -1243,6 +1296,9 @@
         <w:gridCol w:w="10368"/>
       </w:tblGrid>
       <w:tr>
+        <w:trPr>
+          <w:cantSplit/>
+        </w:trPr>
         <w:tc>
           <w:tcPr>
             <w:tcW w:type="dxa" w:w="10368"/>
@@ -1269,6 +1325,7 @@
     </w:tbl>
     <w:p>
       <w:pPr>
+        <w:keepNext/>
         <w:spacing w:before="140" w:after="80"/>
       </w:pPr>
       <w:r>
@@ -1300,6 +1357,7 @@
     </w:p>
     <w:p>
       <w:pPr>
+        <w:keepNext/>
         <w:spacing w:before="0" w:after="40"/>
         <w:ind w:left="288"/>
       </w:pPr>
@@ -1315,6 +1373,7 @@
     </w:p>
     <w:p>
       <w:pPr>
+        <w:keepNext/>
         <w:spacing w:before="0" w:after="40"/>
         <w:ind w:left="288"/>
       </w:pPr>
@@ -1330,6 +1389,7 @@
     </w:p>
     <w:p>
       <w:pPr>
+        <w:keepNext/>
         <w:spacing w:before="0" w:after="40"/>
         <w:ind w:left="288"/>
       </w:pPr>
@@ -1345,6 +1405,7 @@
     </w:p>
     <w:p>
       <w:pPr>
+        <w:keepNext/>
         <w:spacing w:before="0" w:after="40"/>
         <w:ind w:left="288"/>
       </w:pPr>
@@ -1360,6 +1421,7 @@
     </w:p>
     <w:p>
       <w:pPr>
+        <w:keepNext/>
         <w:spacing w:before="60" w:after="60"/>
       </w:pPr>
       <w:r>
@@ -1383,6 +1445,9 @@
         <w:gridCol w:w="10368"/>
       </w:tblGrid>
       <w:tr>
+        <w:trPr>
+          <w:cantSplit/>
+        </w:trPr>
         <w:tc>
           <w:tcPr>
             <w:tcW w:type="dxa" w:w="10368"/>
@@ -1409,6 +1474,7 @@
     </w:tbl>
     <w:p>
       <w:pPr>
+        <w:keepNext/>
         <w:spacing w:before="160" w:after="100"/>
       </w:pPr>
       <w:r>
@@ -1423,6 +1489,7 @@
     </w:p>
     <w:p>
       <w:pPr>
+        <w:keepNext/>
         <w:spacing w:before="140" w:after="80"/>
       </w:pPr>
       <w:r>
@@ -1454,6 +1521,7 @@
     </w:p>
     <w:p>
       <w:pPr>
+        <w:keepNext/>
         <w:spacing w:before="0" w:after="60"/>
       </w:pPr>
       <w:r>
@@ -1469,6 +1537,7 @@
     </w:p>
     <w:p>
       <w:pPr>
+        <w:keepNext/>
         <w:spacing w:before="0" w:after="40"/>
         <w:ind w:left="288"/>
       </w:pPr>
@@ -1484,6 +1553,7 @@
     </w:p>
     <w:p>
       <w:pPr>
+        <w:keepNext/>
         <w:spacing w:before="0" w:after="40"/>
         <w:ind w:left="288"/>
       </w:pPr>
@@ -1499,6 +1569,7 @@
     </w:p>
     <w:p>
       <w:pPr>
+        <w:keepNext/>
         <w:spacing w:before="0" w:after="40"/>
         <w:ind w:left="288"/>
       </w:pPr>
@@ -1514,6 +1585,7 @@
     </w:p>
     <w:p>
       <w:pPr>
+        <w:keepNext/>
         <w:spacing w:before="0" w:after="40"/>
         <w:ind w:left="288"/>
       </w:pPr>
@@ -1529,6 +1601,7 @@
     </w:p>
     <w:p>
       <w:pPr>
+        <w:keepNext/>
         <w:spacing w:before="60" w:after="60"/>
       </w:pPr>
       <w:r>
@@ -1552,6 +1625,9 @@
         <w:gridCol w:w="10368"/>
       </w:tblGrid>
       <w:tr>
+        <w:trPr>
+          <w:cantSplit/>
+        </w:trPr>
         <w:tc>
           <w:tcPr>
             <w:tcW w:type="dxa" w:w="10368"/>
@@ -1578,6 +1654,7 @@
     </w:tbl>
     <w:p>
       <w:pPr>
+        <w:keepNext/>
         <w:spacing w:before="140" w:after="80"/>
       </w:pPr>
       <w:r>
@@ -1609,6 +1686,7 @@
     </w:p>
     <w:p>
       <w:pPr>
+        <w:keepNext/>
         <w:spacing w:before="0" w:after="40"/>
         <w:ind w:left="288"/>
       </w:pPr>
@@ -1624,6 +1702,7 @@
     </w:p>
     <w:p>
       <w:pPr>
+        <w:keepNext/>
         <w:spacing w:before="0" w:after="40"/>
         <w:ind w:left="288"/>
       </w:pPr>
@@ -1639,6 +1718,7 @@
     </w:p>
     <w:p>
       <w:pPr>
+        <w:keepNext/>
         <w:spacing w:before="0" w:after="40"/>
         <w:ind w:left="288"/>
       </w:pPr>
@@ -1654,6 +1734,7 @@
     </w:p>
     <w:p>
       <w:pPr>
+        <w:keepNext/>
         <w:spacing w:before="0" w:after="40"/>
         <w:ind w:left="288"/>
       </w:pPr>
@@ -1669,6 +1750,7 @@
     </w:p>
     <w:p>
       <w:pPr>
+        <w:keepNext/>
         <w:spacing w:before="60" w:after="60"/>
       </w:pPr>
       <w:r>
@@ -1692,6 +1774,9 @@
         <w:gridCol w:w="10368"/>
       </w:tblGrid>
       <w:tr>
+        <w:trPr>
+          <w:cantSplit/>
+        </w:trPr>
         <w:tc>
           <w:tcPr>
             <w:tcW w:type="dxa" w:w="10368"/>
@@ -1718,6 +1803,7 @@
     </w:tbl>
     <w:p>
       <w:pPr>
+        <w:keepNext/>
         <w:spacing w:before="140" w:after="80"/>
       </w:pPr>
       <w:r>
@@ -1749,6 +1835,7 @@
     </w:p>
     <w:p>
       <w:pPr>
+        <w:keepNext/>
         <w:spacing w:before="0" w:after="40"/>
         <w:ind w:left="288"/>
       </w:pPr>
@@ -1764,6 +1851,7 @@
     </w:p>
     <w:p>
       <w:pPr>
+        <w:keepNext/>
         <w:spacing w:before="0" w:after="40"/>
         <w:ind w:left="288"/>
       </w:pPr>
@@ -1779,6 +1867,7 @@
     </w:p>
     <w:p>
       <w:pPr>
+        <w:keepNext/>
         <w:spacing w:before="0" w:after="40"/>
         <w:ind w:left="288"/>
       </w:pPr>
@@ -1794,6 +1883,7 @@
     </w:p>
     <w:p>
       <w:pPr>
+        <w:keepNext/>
         <w:spacing w:before="0" w:after="40"/>
         <w:ind w:left="288"/>
       </w:pPr>
@@ -1809,6 +1899,7 @@
     </w:p>
     <w:p>
       <w:pPr>
+        <w:keepNext/>
         <w:spacing w:before="60" w:after="60"/>
       </w:pPr>
       <w:r>
@@ -1832,6 +1923,9 @@
         <w:gridCol w:w="10368"/>
       </w:tblGrid>
       <w:tr>
+        <w:trPr>
+          <w:cantSplit/>
+        </w:trPr>
         <w:tc>
           <w:tcPr>
             <w:tcW w:type="dxa" w:w="10368"/>
@@ -1858,6 +1952,7 @@
     </w:tbl>
     <w:p>
       <w:pPr>
+        <w:keepNext/>
         <w:spacing w:before="140" w:after="80"/>
       </w:pPr>
       <w:r>
@@ -1889,6 +1984,7 @@
     </w:p>
     <w:p>
       <w:pPr>
+        <w:keepNext/>
         <w:spacing w:before="0" w:after="40"/>
         <w:ind w:left="288"/>
       </w:pPr>
@@ -1904,6 +2000,7 @@
     </w:p>
     <w:p>
       <w:pPr>
+        <w:keepNext/>
         <w:spacing w:before="0" w:after="40"/>
         <w:ind w:left="288"/>
       </w:pPr>
@@ -1919,6 +2016,7 @@
     </w:p>
     <w:p>
       <w:pPr>
+        <w:keepNext/>
         <w:spacing w:before="0" w:after="40"/>
         <w:ind w:left="288"/>
       </w:pPr>
@@ -1934,6 +2032,7 @@
     </w:p>
     <w:p>
       <w:pPr>
+        <w:keepNext/>
         <w:spacing w:before="0" w:after="40"/>
         <w:ind w:left="288"/>
       </w:pPr>
@@ -1949,6 +2048,7 @@
     </w:p>
     <w:p>
       <w:pPr>
+        <w:keepNext/>
         <w:spacing w:before="60" w:after="60"/>
       </w:pPr>
       <w:r>
@@ -1972,6 +2072,9 @@
         <w:gridCol w:w="10368"/>
       </w:tblGrid>
       <w:tr>
+        <w:trPr>
+          <w:cantSplit/>
+        </w:trPr>
         <w:tc>
           <w:tcPr>
             <w:tcW w:type="dxa" w:w="10368"/>
@@ -1998,6 +2101,7 @@
     </w:tbl>
     <w:p>
       <w:pPr>
+        <w:keepNext/>
         <w:spacing w:before="160" w:after="100"/>
       </w:pPr>
       <w:r>
@@ -2012,6 +2116,7 @@
     </w:p>
     <w:p>
       <w:pPr>
+        <w:keepNext/>
         <w:spacing w:before="140" w:after="80"/>
       </w:pPr>
       <w:r>
@@ -2043,6 +2148,7 @@
     </w:p>
     <w:p>
       <w:pPr>
+        <w:keepNext/>
         <w:spacing w:before="0" w:after="40"/>
         <w:ind w:left="288"/>
       </w:pPr>
@@ -2058,6 +2164,7 @@
     </w:p>
     <w:p>
       <w:pPr>
+        <w:keepNext/>
         <w:spacing w:before="0" w:after="40"/>
         <w:ind w:left="288"/>
       </w:pPr>
@@ -2073,6 +2180,7 @@
     </w:p>
     <w:p>
       <w:pPr>
+        <w:keepNext/>
         <w:spacing w:before="0" w:after="40"/>
         <w:ind w:left="288"/>
       </w:pPr>
@@ -2088,6 +2196,7 @@
     </w:p>
     <w:p>
       <w:pPr>
+        <w:keepNext/>
         <w:spacing w:before="0" w:after="40"/>
         <w:ind w:left="288"/>
       </w:pPr>
@@ -2103,6 +2212,7 @@
     </w:p>
     <w:p>
       <w:pPr>
+        <w:keepNext/>
         <w:spacing w:before="60" w:after="60"/>
       </w:pPr>
       <w:r>
@@ -2126,6 +2236,9 @@
         <w:gridCol w:w="10368"/>
       </w:tblGrid>
       <w:tr>
+        <w:trPr>
+          <w:cantSplit/>
+        </w:trPr>
         <w:tc>
           <w:tcPr>
             <w:tcW w:type="dxa" w:w="10368"/>
@@ -2152,6 +2265,7 @@
     </w:tbl>
     <w:p>
       <w:pPr>
+        <w:keepNext/>
         <w:spacing w:before="140" w:after="80"/>
       </w:pPr>
       <w:r>
@@ -2183,6 +2297,7 @@
     </w:p>
     <w:p>
       <w:pPr>
+        <w:keepNext/>
         <w:spacing w:before="0" w:after="40"/>
         <w:ind w:left="288"/>
       </w:pPr>
@@ -2198,6 +2313,7 @@
     </w:p>
     <w:p>
       <w:pPr>
+        <w:keepNext/>
         <w:spacing w:before="0" w:after="40"/>
         <w:ind w:left="288"/>
       </w:pPr>
@@ -2213,6 +2329,7 @@
     </w:p>
     <w:p>
       <w:pPr>
+        <w:keepNext/>
         <w:spacing w:before="0" w:after="40"/>
         <w:ind w:left="288"/>
       </w:pPr>
@@ -2228,6 +2345,7 @@
     </w:p>
     <w:p>
       <w:pPr>
+        <w:keepNext/>
         <w:spacing w:before="0" w:after="40"/>
         <w:ind w:left="288"/>
       </w:pPr>
@@ -2243,6 +2361,7 @@
     </w:p>
     <w:p>
       <w:pPr>
+        <w:keepNext/>
         <w:spacing w:before="60" w:after="60"/>
       </w:pPr>
       <w:r>
@@ -2266,6 +2385,9 @@
         <w:gridCol w:w="10368"/>
       </w:tblGrid>
       <w:tr>
+        <w:trPr>
+          <w:cantSplit/>
+        </w:trPr>
         <w:tc>
           <w:tcPr>
             <w:tcW w:type="dxa" w:w="10368"/>
@@ -2322,6 +2444,7 @@
     </w:p>
     <w:p>
       <w:pPr>
+        <w:keepNext/>
         <w:spacing w:before="160" w:after="100"/>
       </w:pPr>
       <w:r>
@@ -2336,6 +2459,7 @@
     </w:p>
     <w:p>
       <w:pPr>
+        <w:keepNext/>
         <w:spacing w:before="140" w:after="80"/>
       </w:pPr>
       <w:r>
@@ -2367,6 +2491,7 @@
     </w:p>
     <w:p>
       <w:pPr>
+        <w:keepNext/>
         <w:spacing w:before="0" w:after="40"/>
         <w:ind w:left="288"/>
       </w:pPr>
@@ -2382,6 +2507,7 @@
     </w:p>
     <w:p>
       <w:pPr>
+        <w:keepNext/>
         <w:spacing w:before="0" w:after="40"/>
         <w:ind w:left="288"/>
       </w:pPr>
@@ -2397,6 +2523,7 @@
     </w:p>
     <w:p>
       <w:pPr>
+        <w:keepNext/>
         <w:spacing w:before="0" w:after="40"/>
         <w:ind w:left="288"/>
       </w:pPr>
@@ -2412,6 +2539,7 @@
     </w:p>
     <w:p>
       <w:pPr>
+        <w:keepNext/>
         <w:spacing w:before="0" w:after="40"/>
         <w:ind w:left="288"/>
       </w:pPr>
@@ -2427,6 +2555,7 @@
     </w:p>
     <w:p>
       <w:pPr>
+        <w:keepNext/>
         <w:spacing w:before="60" w:after="60"/>
       </w:pPr>
       <w:r>
@@ -2450,6 +2579,9 @@
         <w:gridCol w:w="10368"/>
       </w:tblGrid>
       <w:tr>
+        <w:trPr>
+          <w:cantSplit/>
+        </w:trPr>
         <w:tc>
           <w:tcPr>
             <w:tcW w:type="dxa" w:w="10368"/>
@@ -2476,6 +2608,7 @@
     </w:tbl>
     <w:p>
       <w:pPr>
+        <w:keepNext/>
         <w:spacing w:before="140" w:after="80"/>
       </w:pPr>
       <w:r>
@@ -2507,6 +2640,7 @@
     </w:p>
     <w:p>
       <w:pPr>
+        <w:keepNext/>
         <w:spacing w:before="0" w:after="40"/>
         <w:ind w:left="288"/>
       </w:pPr>
@@ -2522,6 +2656,7 @@
     </w:p>
     <w:p>
       <w:pPr>
+        <w:keepNext/>
         <w:spacing w:before="0" w:after="40"/>
         <w:ind w:left="288"/>
       </w:pPr>
@@ -2537,6 +2672,7 @@
     </w:p>
     <w:p>
       <w:pPr>
+        <w:keepNext/>
         <w:spacing w:before="0" w:after="40"/>
         <w:ind w:left="288"/>
       </w:pPr>
@@ -2552,6 +2688,7 @@
     </w:p>
     <w:p>
       <w:pPr>
+        <w:keepNext/>
         <w:spacing w:before="0" w:after="40"/>
         <w:ind w:left="288"/>
       </w:pPr>
@@ -2567,6 +2704,7 @@
     </w:p>
     <w:p>
       <w:pPr>
+        <w:keepNext/>
         <w:spacing w:before="60" w:after="60"/>
       </w:pPr>
       <w:r>
@@ -2590,6 +2728,9 @@
         <w:gridCol w:w="10368"/>
       </w:tblGrid>
       <w:tr>
+        <w:trPr>
+          <w:cantSplit/>
+        </w:trPr>
         <w:tc>
           <w:tcPr>
             <w:tcW w:type="dxa" w:w="10368"/>
@@ -2616,6 +2757,7 @@
     </w:tbl>
     <w:p>
       <w:pPr>
+        <w:keepNext/>
         <w:spacing w:before="140" w:after="80"/>
       </w:pPr>
       <w:r>
@@ -2647,6 +2789,7 @@
     </w:p>
     <w:p>
       <w:pPr>
+        <w:keepNext/>
         <w:spacing w:before="0" w:after="40"/>
         <w:ind w:left="288"/>
       </w:pPr>
@@ -2662,6 +2805,7 @@
     </w:p>
     <w:p>
       <w:pPr>
+        <w:keepNext/>
         <w:spacing w:before="0" w:after="40"/>
         <w:ind w:left="288"/>
       </w:pPr>
@@ -2677,6 +2821,7 @@
     </w:p>
     <w:p>
       <w:pPr>
+        <w:keepNext/>
         <w:spacing w:before="0" w:after="40"/>
         <w:ind w:left="288"/>
       </w:pPr>
@@ -2692,6 +2837,7 @@
     </w:p>
     <w:p>
       <w:pPr>
+        <w:keepNext/>
         <w:spacing w:before="0" w:after="40"/>
         <w:ind w:left="288"/>
       </w:pPr>
@@ -2707,6 +2853,7 @@
     </w:p>
     <w:p>
       <w:pPr>
+        <w:keepNext/>
         <w:spacing w:before="60" w:after="60"/>
       </w:pPr>
       <w:r>
@@ -2730,6 +2877,9 @@
         <w:gridCol w:w="10368"/>
       </w:tblGrid>
       <w:tr>
+        <w:trPr>
+          <w:cantSplit/>
+        </w:trPr>
         <w:tc>
           <w:tcPr>
             <w:tcW w:type="dxa" w:w="10368"/>
@@ -2756,6 +2906,7 @@
     </w:tbl>
     <w:p>
       <w:pPr>
+        <w:keepNext/>
         <w:spacing w:before="140" w:after="80"/>
       </w:pPr>
       <w:r>
@@ -2787,6 +2938,7 @@
     </w:p>
     <w:p>
       <w:pPr>
+        <w:keepNext/>
         <w:spacing w:before="0" w:after="40"/>
         <w:ind w:left="288"/>
       </w:pPr>
@@ -2802,6 +2954,7 @@
     </w:p>
     <w:p>
       <w:pPr>
+        <w:keepNext/>
         <w:spacing w:before="0" w:after="40"/>
         <w:ind w:left="288"/>
       </w:pPr>
@@ -2817,6 +2970,7 @@
     </w:p>
     <w:p>
       <w:pPr>
+        <w:keepNext/>
         <w:spacing w:before="0" w:after="40"/>
         <w:ind w:left="288"/>
       </w:pPr>
@@ -2832,6 +2986,7 @@
     </w:p>
     <w:p>
       <w:pPr>
+        <w:keepNext/>
         <w:spacing w:before="0" w:after="40"/>
         <w:ind w:left="288"/>
       </w:pPr>
@@ -2847,6 +3002,7 @@
     </w:p>
     <w:p>
       <w:pPr>
+        <w:keepNext/>
         <w:spacing w:before="60" w:after="60"/>
       </w:pPr>
       <w:r>
@@ -2870,6 +3026,9 @@
         <w:gridCol w:w="10368"/>
       </w:tblGrid>
       <w:tr>
+        <w:trPr>
+          <w:cantSplit/>
+        </w:trPr>
         <w:tc>
           <w:tcPr>
             <w:tcW w:type="dxa" w:w="10368"/>
@@ -2896,6 +3055,7 @@
     </w:tbl>
     <w:p>
       <w:pPr>
+        <w:keepNext/>
         <w:spacing w:before="160" w:after="100"/>
       </w:pPr>
       <w:r>
@@ -2910,6 +3070,7 @@
     </w:p>
     <w:p>
       <w:pPr>
+        <w:keepNext/>
         <w:spacing w:before="140" w:after="80"/>
       </w:pPr>
       <w:r>
@@ -2941,6 +3102,7 @@
     </w:p>
     <w:p>
       <w:pPr>
+        <w:keepNext/>
         <w:spacing w:before="0" w:after="40"/>
         <w:ind w:left="288"/>
       </w:pPr>
@@ -2956,6 +3118,7 @@
     </w:p>
     <w:p>
       <w:pPr>
+        <w:keepNext/>
         <w:spacing w:before="0" w:after="40"/>
         <w:ind w:left="288"/>
       </w:pPr>
@@ -2971,6 +3134,7 @@
     </w:p>
     <w:p>
       <w:pPr>
+        <w:keepNext/>
         <w:spacing w:before="0" w:after="40"/>
         <w:ind w:left="288"/>
       </w:pPr>
@@ -2986,6 +3150,7 @@
     </w:p>
     <w:p>
       <w:pPr>
+        <w:keepNext/>
         <w:spacing w:before="0" w:after="40"/>
         <w:ind w:left="288"/>
       </w:pPr>
@@ -3001,6 +3166,7 @@
     </w:p>
     <w:p>
       <w:pPr>
+        <w:keepNext/>
         <w:spacing w:before="60" w:after="60"/>
       </w:pPr>
       <w:r>
@@ -3024,6 +3190,9 @@
         <w:gridCol w:w="10368"/>
       </w:tblGrid>
       <w:tr>
+        <w:trPr>
+          <w:cantSplit/>
+        </w:trPr>
         <w:tc>
           <w:tcPr>
             <w:tcW w:type="dxa" w:w="10368"/>
@@ -3050,6 +3219,7 @@
     </w:tbl>
     <w:p>
       <w:pPr>
+        <w:keepNext/>
         <w:spacing w:before="140" w:after="80"/>
       </w:pPr>
       <w:r>
@@ -3081,6 +3251,7 @@
     </w:p>
     <w:p>
       <w:pPr>
+        <w:keepNext/>
         <w:spacing w:before="0" w:after="40"/>
         <w:ind w:left="288"/>
       </w:pPr>
@@ -3096,6 +3267,7 @@
     </w:p>
     <w:p>
       <w:pPr>
+        <w:keepNext/>
         <w:spacing w:before="0" w:after="40"/>
         <w:ind w:left="288"/>
       </w:pPr>
@@ -3111,6 +3283,7 @@
     </w:p>
     <w:p>
       <w:pPr>
+        <w:keepNext/>
         <w:spacing w:before="0" w:after="40"/>
         <w:ind w:left="288"/>
       </w:pPr>
@@ -3126,6 +3299,7 @@
     </w:p>
     <w:p>
       <w:pPr>
+        <w:keepNext/>
         <w:spacing w:before="0" w:after="40"/>
         <w:ind w:left="288"/>
       </w:pPr>
@@ -3141,6 +3315,7 @@
     </w:p>
     <w:p>
       <w:pPr>
+        <w:keepNext/>
         <w:spacing w:before="60" w:after="60"/>
       </w:pPr>
       <w:r>
@@ -3164,6 +3339,9 @@
         <w:gridCol w:w="10368"/>
       </w:tblGrid>
       <w:tr>
+        <w:trPr>
+          <w:cantSplit/>
+        </w:trPr>
         <w:tc>
           <w:tcPr>
             <w:tcW w:type="dxa" w:w="10368"/>
@@ -3190,6 +3368,7 @@
     </w:tbl>
     <w:p>
       <w:pPr>
+        <w:keepNext/>
         <w:spacing w:before="140" w:after="80"/>
       </w:pPr>
       <w:r>
@@ -3221,6 +3400,7 @@
     </w:p>
     <w:p>
       <w:pPr>
+        <w:keepNext/>
         <w:spacing w:before="0" w:after="40"/>
         <w:ind w:left="288"/>
       </w:pPr>
@@ -3236,6 +3416,7 @@
     </w:p>
     <w:p>
       <w:pPr>
+        <w:keepNext/>
         <w:spacing w:before="0" w:after="40"/>
         <w:ind w:left="288"/>
       </w:pPr>
@@ -3251,6 +3432,7 @@
     </w:p>
     <w:p>
       <w:pPr>
+        <w:keepNext/>
         <w:spacing w:before="0" w:after="40"/>
         <w:ind w:left="288"/>
       </w:pPr>
@@ -3266,6 +3448,7 @@
     </w:p>
     <w:p>
       <w:pPr>
+        <w:keepNext/>
         <w:spacing w:before="0" w:after="40"/>
         <w:ind w:left="288"/>
       </w:pPr>
@@ -3281,6 +3464,7 @@
     </w:p>
     <w:p>
       <w:pPr>
+        <w:keepNext/>
         <w:spacing w:before="60" w:after="60"/>
       </w:pPr>
       <w:r>
@@ -3304,6 +3488,9 @@
         <w:gridCol w:w="10368"/>
       </w:tblGrid>
       <w:tr>
+        <w:trPr>
+          <w:cantSplit/>
+        </w:trPr>
         <w:tc>
           <w:tcPr>
             <w:tcW w:type="dxa" w:w="10368"/>
@@ -3330,6 +3517,7 @@
     </w:tbl>
     <w:p>
       <w:pPr>
+        <w:keepNext/>
         <w:spacing w:before="140" w:after="80"/>
       </w:pPr>
       <w:r>
@@ -3361,6 +3549,7 @@
     </w:p>
     <w:p>
       <w:pPr>
+        <w:keepNext/>
         <w:spacing w:before="0" w:after="40"/>
         <w:ind w:left="288"/>
       </w:pPr>
@@ -3376,6 +3565,7 @@
     </w:p>
     <w:p>
       <w:pPr>
+        <w:keepNext/>
         <w:spacing w:before="0" w:after="40"/>
         <w:ind w:left="288"/>
       </w:pPr>
@@ -3391,6 +3581,7 @@
     </w:p>
     <w:p>
       <w:pPr>
+        <w:keepNext/>
         <w:spacing w:before="0" w:after="40"/>
         <w:ind w:left="288"/>
       </w:pPr>
@@ -3406,6 +3597,7 @@
     </w:p>
     <w:p>
       <w:pPr>
+        <w:keepNext/>
         <w:spacing w:before="0" w:after="40"/>
         <w:ind w:left="288"/>
       </w:pPr>
@@ -3421,6 +3613,7 @@
     </w:p>
     <w:p>
       <w:pPr>
+        <w:keepNext/>
         <w:spacing w:before="60" w:after="60"/>
       </w:pPr>
       <w:r>
@@ -3444,6 +3637,9 @@
         <w:gridCol w:w="10368"/>
       </w:tblGrid>
       <w:tr>
+        <w:trPr>
+          <w:cantSplit/>
+        </w:trPr>
         <w:tc>
           <w:tcPr>
             <w:tcW w:type="dxa" w:w="10368"/>
@@ -3470,6 +3666,7 @@
     </w:tbl>
     <w:p>
       <w:pPr>
+        <w:keepNext/>
         <w:spacing w:before="160" w:after="100"/>
       </w:pPr>
       <w:r>
@@ -3484,6 +3681,7 @@
     </w:p>
     <w:p>
       <w:pPr>
+        <w:keepNext/>
         <w:spacing w:before="140" w:after="80"/>
       </w:pPr>
       <w:r>
@@ -3515,6 +3713,7 @@
     </w:p>
     <w:p>
       <w:pPr>
+        <w:keepNext/>
         <w:spacing w:before="0" w:after="40"/>
         <w:ind w:left="288"/>
       </w:pPr>
@@ -3530,6 +3729,7 @@
     </w:p>
     <w:p>
       <w:pPr>
+        <w:keepNext/>
         <w:spacing w:before="0" w:after="40"/>
         <w:ind w:left="288"/>
       </w:pPr>
@@ -3545,6 +3745,7 @@
     </w:p>
     <w:p>
       <w:pPr>
+        <w:keepNext/>
         <w:spacing w:before="0" w:after="40"/>
         <w:ind w:left="288"/>
       </w:pPr>
@@ -3560,6 +3761,7 @@
     </w:p>
     <w:p>
       <w:pPr>
+        <w:keepNext/>
         <w:spacing w:before="0" w:after="40"/>
         <w:ind w:left="288"/>
       </w:pPr>
@@ -3575,6 +3777,7 @@
     </w:p>
     <w:p>
       <w:pPr>
+        <w:keepNext/>
         <w:spacing w:before="60" w:after="60"/>
       </w:pPr>
       <w:r>
@@ -3598,6 +3801,9 @@
         <w:gridCol w:w="10368"/>
       </w:tblGrid>
       <w:tr>
+        <w:trPr>
+          <w:cantSplit/>
+        </w:trPr>
         <w:tc>
           <w:tcPr>
             <w:tcW w:type="dxa" w:w="10368"/>
@@ -3624,6 +3830,7 @@
     </w:tbl>
     <w:p>
       <w:pPr>
+        <w:keepNext/>
         <w:spacing w:before="140" w:after="80"/>
       </w:pPr>
       <w:r>
@@ -3655,6 +3862,7 @@
     </w:p>
     <w:p>
       <w:pPr>
+        <w:keepNext/>
         <w:spacing w:before="0" w:after="40"/>
         <w:ind w:left="288"/>
       </w:pPr>
@@ -3670,6 +3878,7 @@
     </w:p>
     <w:p>
       <w:pPr>
+        <w:keepNext/>
         <w:spacing w:before="0" w:after="40"/>
         <w:ind w:left="288"/>
       </w:pPr>
@@ -3685,6 +3894,7 @@
     </w:p>
     <w:p>
       <w:pPr>
+        <w:keepNext/>
         <w:spacing w:before="0" w:after="40"/>
         <w:ind w:left="288"/>
       </w:pPr>
@@ -3700,6 +3910,7 @@
     </w:p>
     <w:p>
       <w:pPr>
+        <w:keepNext/>
         <w:spacing w:before="0" w:after="40"/>
         <w:ind w:left="288"/>
       </w:pPr>
@@ -3715,6 +3926,7 @@
     </w:p>
     <w:p>
       <w:pPr>
+        <w:keepNext/>
         <w:spacing w:before="60" w:after="60"/>
       </w:pPr>
       <w:r>
@@ -3738,6 +3950,9 @@
         <w:gridCol w:w="10368"/>
       </w:tblGrid>
       <w:tr>
+        <w:trPr>
+          <w:cantSplit/>
+        </w:trPr>
         <w:tc>
           <w:tcPr>
             <w:tcW w:type="dxa" w:w="10368"/>
@@ -3764,6 +3979,7 @@
     </w:tbl>
     <w:p>
       <w:pPr>
+        <w:keepNext/>
         <w:spacing w:before="140" w:after="80"/>
       </w:pPr>
       <w:r>
@@ -3795,6 +4011,7 @@
     </w:p>
     <w:p>
       <w:pPr>
+        <w:keepNext/>
         <w:spacing w:before="0" w:after="40"/>
         <w:ind w:left="288"/>
       </w:pPr>
@@ -3810,6 +4027,7 @@
     </w:p>
     <w:p>
       <w:pPr>
+        <w:keepNext/>
         <w:spacing w:before="0" w:after="40"/>
         <w:ind w:left="288"/>
       </w:pPr>
@@ -3825,6 +4043,7 @@
     </w:p>
     <w:p>
       <w:pPr>
+        <w:keepNext/>
         <w:spacing w:before="0" w:after="40"/>
         <w:ind w:left="288"/>
       </w:pPr>
@@ -3840,6 +4059,7 @@
     </w:p>
     <w:p>
       <w:pPr>
+        <w:keepNext/>
         <w:spacing w:before="0" w:after="40"/>
         <w:ind w:left="288"/>
       </w:pPr>
@@ -3855,6 +4075,7 @@
     </w:p>
     <w:p>
       <w:pPr>
+        <w:keepNext/>
         <w:spacing w:before="60" w:after="60"/>
       </w:pPr>
       <w:r>
@@ -3878,6 +4099,9 @@
         <w:gridCol w:w="10368"/>
       </w:tblGrid>
       <w:tr>
+        <w:trPr>
+          <w:cantSplit/>
+        </w:trPr>
         <w:tc>
           <w:tcPr>
             <w:tcW w:type="dxa" w:w="10368"/>
@@ -3904,6 +4128,7 @@
     </w:tbl>
     <w:p>
       <w:pPr>
+        <w:keepNext/>
         <w:spacing w:before="140" w:after="80"/>
       </w:pPr>
       <w:r>
@@ -3935,6 +4160,7 @@
     </w:p>
     <w:p>
       <w:pPr>
+        <w:keepNext/>
         <w:spacing w:before="0" w:after="40"/>
         <w:ind w:left="288"/>
       </w:pPr>
@@ -3950,6 +4176,7 @@
     </w:p>
     <w:p>
       <w:pPr>
+        <w:keepNext/>
         <w:spacing w:before="0" w:after="40"/>
         <w:ind w:left="288"/>
       </w:pPr>
@@ -3965,6 +4192,7 @@
     </w:p>
     <w:p>
       <w:pPr>
+        <w:keepNext/>
         <w:spacing w:before="0" w:after="40"/>
         <w:ind w:left="288"/>
       </w:pPr>
@@ -3980,6 +4208,7 @@
     </w:p>
     <w:p>
       <w:pPr>
+        <w:keepNext/>
         <w:spacing w:before="0" w:after="40"/>
         <w:ind w:left="288"/>
       </w:pPr>
@@ -3995,6 +4224,7 @@
     </w:p>
     <w:p>
       <w:pPr>
+        <w:keepNext/>
         <w:spacing w:before="60" w:after="60"/>
       </w:pPr>
       <w:r>
@@ -4018,6 +4248,9 @@
         <w:gridCol w:w="10368"/>
       </w:tblGrid>
       <w:tr>
+        <w:trPr>
+          <w:cantSplit/>
+        </w:trPr>
         <w:tc>
           <w:tcPr>
             <w:tcW w:type="dxa" w:w="10368"/>
@@ -4044,6 +4277,7 @@
     </w:tbl>
     <w:p>
       <w:pPr>
+        <w:keepNext/>
         <w:spacing w:before="140" w:after="80"/>
       </w:pPr>
       <w:r>
@@ -4075,6 +4309,7 @@
     </w:p>
     <w:p>
       <w:pPr>
+        <w:keepNext/>
         <w:spacing w:before="0" w:after="40"/>
         <w:ind w:left="288"/>
       </w:pPr>
@@ -4090,6 +4325,7 @@
     </w:p>
     <w:p>
       <w:pPr>
+        <w:keepNext/>
         <w:spacing w:before="0" w:after="40"/>
         <w:ind w:left="288"/>
       </w:pPr>
@@ -4105,6 +4341,7 @@
     </w:p>
     <w:p>
       <w:pPr>
+        <w:keepNext/>
         <w:spacing w:before="0" w:after="40"/>
         <w:ind w:left="288"/>
       </w:pPr>
@@ -4120,6 +4357,7 @@
     </w:p>
     <w:p>
       <w:pPr>
+        <w:keepNext/>
         <w:spacing w:before="0" w:after="40"/>
         <w:ind w:left="288"/>
       </w:pPr>
@@ -4135,6 +4373,7 @@
     </w:p>
     <w:p>
       <w:pPr>
+        <w:keepNext/>
         <w:spacing w:before="60" w:after="60"/>
       </w:pPr>
       <w:r>
@@ -4158,6 +4397,9 @@
         <w:gridCol w:w="10368"/>
       </w:tblGrid>
       <w:tr>
+        <w:trPr>
+          <w:cantSplit/>
+        </w:trPr>
         <w:tc>
           <w:tcPr>
             <w:tcW w:type="dxa" w:w="10368"/>
@@ -4184,6 +4426,7 @@
     </w:tbl>
     <w:p>
       <w:pPr>
+        <w:keepNext/>
         <w:spacing w:before="160" w:after="100"/>
       </w:pPr>
       <w:r>
@@ -4198,6 +4441,7 @@
     </w:p>
     <w:p>
       <w:pPr>
+        <w:keepNext/>
         <w:spacing w:before="140" w:after="80"/>
       </w:pPr>
       <w:r>
@@ -4229,6 +4473,7 @@
     </w:p>
     <w:p>
       <w:pPr>
+        <w:keepNext/>
         <w:spacing w:before="0" w:after="40"/>
         <w:ind w:left="288"/>
       </w:pPr>
@@ -4244,6 +4489,7 @@
     </w:p>
     <w:p>
       <w:pPr>
+        <w:keepNext/>
         <w:spacing w:before="0" w:after="40"/>
         <w:ind w:left="288"/>
       </w:pPr>
@@ -4259,6 +4505,7 @@
     </w:p>
     <w:p>
       <w:pPr>
+        <w:keepNext/>
         <w:spacing w:before="0" w:after="40"/>
         <w:ind w:left="288"/>
       </w:pPr>
@@ -4274,6 +4521,7 @@
     </w:p>
     <w:p>
       <w:pPr>
+        <w:keepNext/>
         <w:spacing w:before="0" w:after="40"/>
         <w:ind w:left="288"/>
       </w:pPr>
@@ -4289,6 +4537,7 @@
     </w:p>
     <w:p>
       <w:pPr>
+        <w:keepNext/>
         <w:spacing w:before="60" w:after="60"/>
       </w:pPr>
       <w:r>
@@ -4312,6 +4561,9 @@
         <w:gridCol w:w="10368"/>
       </w:tblGrid>
       <w:tr>
+        <w:trPr>
+          <w:cantSplit/>
+        </w:trPr>
         <w:tc>
           <w:tcPr>
             <w:tcW w:type="dxa" w:w="10368"/>
@@ -4338,6 +4590,7 @@
     </w:tbl>
     <w:p>
       <w:pPr>
+        <w:keepNext/>
         <w:spacing w:before="140" w:after="80"/>
       </w:pPr>
       <w:r>
@@ -4369,6 +4622,7 @@
     </w:p>
     <w:p>
       <w:pPr>
+        <w:keepNext/>
         <w:spacing w:before="0" w:after="40"/>
         <w:ind w:left="288"/>
       </w:pPr>
@@ -4384,6 +4638,7 @@
     </w:p>
     <w:p>
       <w:pPr>
+        <w:keepNext/>
         <w:spacing w:before="0" w:after="40"/>
         <w:ind w:left="288"/>
       </w:pPr>
@@ -4399,6 +4654,7 @@
     </w:p>
     <w:p>
       <w:pPr>
+        <w:keepNext/>
         <w:spacing w:before="0" w:after="40"/>
         <w:ind w:left="288"/>
       </w:pPr>
@@ -4414,6 +4670,7 @@
     </w:p>
     <w:p>
       <w:pPr>
+        <w:keepNext/>
         <w:spacing w:before="0" w:after="40"/>
         <w:ind w:left="288"/>
       </w:pPr>
@@ -4429,6 +4686,7 @@
     </w:p>
     <w:p>
       <w:pPr>
+        <w:keepNext/>
         <w:spacing w:before="60" w:after="60"/>
       </w:pPr>
       <w:r>
@@ -4452,6 +4710,9 @@
         <w:gridCol w:w="10368"/>
       </w:tblGrid>
       <w:tr>
+        <w:trPr>
+          <w:cantSplit/>
+        </w:trPr>
         <w:tc>
           <w:tcPr>
             <w:tcW w:type="dxa" w:w="10368"/>
@@ -4478,6 +4739,7 @@
     </w:tbl>
     <w:p>
       <w:pPr>
+        <w:keepNext/>
         <w:spacing w:before="140" w:after="80"/>
       </w:pPr>
       <w:r>
@@ -4509,6 +4771,7 @@
     </w:p>
     <w:p>
       <w:pPr>
+        <w:keepNext/>
         <w:spacing w:before="0" w:after="40"/>
         <w:ind w:left="288"/>
       </w:pPr>
@@ -4524,6 +4787,7 @@
     </w:p>
     <w:p>
       <w:pPr>
+        <w:keepNext/>
         <w:spacing w:before="0" w:after="40"/>
         <w:ind w:left="288"/>
       </w:pPr>
@@ -4539,6 +4803,7 @@
     </w:p>
     <w:p>
       <w:pPr>
+        <w:keepNext/>
         <w:spacing w:before="0" w:after="40"/>
         <w:ind w:left="288"/>
       </w:pPr>
@@ -4554,6 +4819,7 @@
     </w:p>
     <w:p>
       <w:pPr>
+        <w:keepNext/>
         <w:spacing w:before="0" w:after="40"/>
         <w:ind w:left="288"/>
       </w:pPr>
@@ -4569,6 +4835,7 @@
     </w:p>
     <w:p>
       <w:pPr>
+        <w:keepNext/>
         <w:spacing w:before="60" w:after="60"/>
       </w:pPr>
       <w:r>
@@ -4592,6 +4859,9 @@
         <w:gridCol w:w="10368"/>
       </w:tblGrid>
       <w:tr>
+        <w:trPr>
+          <w:cantSplit/>
+        </w:trPr>
         <w:tc>
           <w:tcPr>
             <w:tcW w:type="dxa" w:w="10368"/>
@@ -4618,6 +4888,7 @@
     </w:tbl>
     <w:p>
       <w:pPr>
+        <w:keepNext/>
         <w:spacing w:before="140" w:after="80"/>
       </w:pPr>
       <w:r>
@@ -4649,6 +4920,7 @@
     </w:p>
     <w:p>
       <w:pPr>
+        <w:keepNext/>
         <w:spacing w:before="0" w:after="40"/>
         <w:ind w:left="288"/>
       </w:pPr>
@@ -4664,6 +4936,7 @@
     </w:p>
     <w:p>
       <w:pPr>
+        <w:keepNext/>
         <w:spacing w:before="0" w:after="40"/>
         <w:ind w:left="288"/>
       </w:pPr>
@@ -4679,6 +4952,7 @@
     </w:p>
     <w:p>
       <w:pPr>
+        <w:keepNext/>
         <w:spacing w:before="0" w:after="40"/>
         <w:ind w:left="288"/>
       </w:pPr>
@@ -4694,6 +4968,7 @@
     </w:p>
     <w:p>
       <w:pPr>
+        <w:keepNext/>
         <w:spacing w:before="0" w:after="40"/>
         <w:ind w:left="288"/>
       </w:pPr>
@@ -4709,6 +4984,7 @@
     </w:p>
     <w:p>
       <w:pPr>
+        <w:keepNext/>
         <w:spacing w:before="60" w:after="60"/>
       </w:pPr>
       <w:r>
@@ -4732,6 +5008,9 @@
         <w:gridCol w:w="10368"/>
       </w:tblGrid>
       <w:tr>
+        <w:trPr>
+          <w:cantSplit/>
+        </w:trPr>
         <w:tc>
           <w:tcPr>
             <w:tcW w:type="dxa" w:w="10368"/>
@@ -4758,6 +5037,7 @@
     </w:tbl>
     <w:p>
       <w:pPr>
+        <w:keepNext/>
         <w:spacing w:before="140" w:after="80"/>
       </w:pPr>
       <w:r>
@@ -4789,6 +5069,7 @@
     </w:p>
     <w:p>
       <w:pPr>
+        <w:keepNext/>
         <w:spacing w:before="0" w:after="40"/>
         <w:ind w:left="288"/>
       </w:pPr>
@@ -4804,6 +5085,7 @@
     </w:p>
     <w:p>
       <w:pPr>
+        <w:keepNext/>
         <w:spacing w:before="0" w:after="40"/>
         <w:ind w:left="288"/>
       </w:pPr>
@@ -4819,6 +5101,7 @@
     </w:p>
     <w:p>
       <w:pPr>
+        <w:keepNext/>
         <w:spacing w:before="0" w:after="40"/>
         <w:ind w:left="288"/>
       </w:pPr>
@@ -4834,6 +5117,7 @@
     </w:p>
     <w:p>
       <w:pPr>
+        <w:keepNext/>
         <w:spacing w:before="0" w:after="40"/>
         <w:ind w:left="288"/>
       </w:pPr>
@@ -4849,6 +5133,7 @@
     </w:p>
     <w:p>
       <w:pPr>
+        <w:keepNext/>
         <w:spacing w:before="60" w:after="60"/>
       </w:pPr>
       <w:r>
@@ -4872,6 +5157,9 @@
         <w:gridCol w:w="10368"/>
       </w:tblGrid>
       <w:tr>
+        <w:trPr>
+          <w:cantSplit/>
+        </w:trPr>
         <w:tc>
           <w:tcPr>
             <w:tcW w:type="dxa" w:w="10368"/>
@@ -4928,6 +5216,7 @@
     </w:p>
     <w:p>
       <w:pPr>
+        <w:keepNext/>
         <w:spacing w:before="160" w:after="100"/>
       </w:pPr>
       <w:r>
@@ -4942,6 +5231,7 @@
     </w:p>
     <w:p>
       <w:pPr>
+        <w:keepNext/>
         <w:spacing w:before="140" w:after="80"/>
       </w:pPr>
       <w:r>
@@ -4973,6 +5263,7 @@
     </w:p>
     <w:p>
       <w:pPr>
+        <w:keepNext/>
         <w:spacing w:before="0" w:after="40"/>
         <w:ind w:left="288"/>
       </w:pPr>
@@ -4988,6 +5279,7 @@
     </w:p>
     <w:p>
       <w:pPr>
+        <w:keepNext/>
         <w:spacing w:before="0" w:after="40"/>
         <w:ind w:left="288"/>
       </w:pPr>
@@ -5003,6 +5295,7 @@
     </w:p>
     <w:p>
       <w:pPr>
+        <w:keepNext/>
         <w:spacing w:before="0" w:after="40"/>
         <w:ind w:left="288"/>
       </w:pPr>
@@ -5018,6 +5311,7 @@
     </w:p>
     <w:p>
       <w:pPr>
+        <w:keepNext/>
         <w:spacing w:before="0" w:after="40"/>
         <w:ind w:left="288"/>
       </w:pPr>
@@ -5033,6 +5327,7 @@
     </w:p>
     <w:p>
       <w:pPr>
+        <w:keepNext/>
         <w:spacing w:before="60" w:after="60"/>
       </w:pPr>
       <w:r>
@@ -5056,6 +5351,9 @@
         <w:gridCol w:w="10368"/>
       </w:tblGrid>
       <w:tr>
+        <w:trPr>
+          <w:cantSplit/>
+        </w:trPr>
         <w:tc>
           <w:tcPr>
             <w:tcW w:type="dxa" w:w="10368"/>
@@ -5082,6 +5380,7 @@
     </w:tbl>
     <w:p>
       <w:pPr>
+        <w:keepNext/>
         <w:spacing w:before="140" w:after="80"/>
       </w:pPr>
       <w:r>
@@ -5113,6 +5412,7 @@
     </w:p>
     <w:p>
       <w:pPr>
+        <w:keepNext/>
         <w:spacing w:before="0" w:after="40"/>
         <w:ind w:left="288"/>
       </w:pPr>
@@ -5128,6 +5428,7 @@
     </w:p>
     <w:p>
       <w:pPr>
+        <w:keepNext/>
         <w:spacing w:before="0" w:after="40"/>
         <w:ind w:left="288"/>
       </w:pPr>
@@ -5143,6 +5444,7 @@
     </w:p>
     <w:p>
       <w:pPr>
+        <w:keepNext/>
         <w:spacing w:before="0" w:after="40"/>
         <w:ind w:left="288"/>
       </w:pPr>
@@ -5158,6 +5460,7 @@
     </w:p>
     <w:p>
       <w:pPr>
+        <w:keepNext/>
         <w:spacing w:before="0" w:after="40"/>
         <w:ind w:left="288"/>
       </w:pPr>
@@ -5173,6 +5476,7 @@
     </w:p>
     <w:p>
       <w:pPr>
+        <w:keepNext/>
         <w:spacing w:before="60" w:after="60"/>
       </w:pPr>
       <w:r>
@@ -5196,6 +5500,9 @@
         <w:gridCol w:w="10368"/>
       </w:tblGrid>
       <w:tr>
+        <w:trPr>
+          <w:cantSplit/>
+        </w:trPr>
         <w:tc>
           <w:tcPr>
             <w:tcW w:type="dxa" w:w="10368"/>
@@ -5222,6 +5529,7 @@
     </w:tbl>
     <w:p>
       <w:pPr>
+        <w:keepNext/>
         <w:spacing w:before="140" w:after="80"/>
       </w:pPr>
       <w:r>
@@ -5253,6 +5561,7 @@
     </w:p>
     <w:p>
       <w:pPr>
+        <w:keepNext/>
         <w:spacing w:before="0" w:after="40"/>
         <w:ind w:left="288"/>
       </w:pPr>
@@ -5268,6 +5577,7 @@
     </w:p>
     <w:p>
       <w:pPr>
+        <w:keepNext/>
         <w:spacing w:before="0" w:after="40"/>
         <w:ind w:left="288"/>
       </w:pPr>
@@ -5283,6 +5593,7 @@
     </w:p>
     <w:p>
       <w:pPr>
+        <w:keepNext/>
         <w:spacing w:before="0" w:after="40"/>
         <w:ind w:left="288"/>
       </w:pPr>
@@ -5298,6 +5609,7 @@
     </w:p>
     <w:p>
       <w:pPr>
+        <w:keepNext/>
         <w:spacing w:before="0" w:after="40"/>
         <w:ind w:left="288"/>
       </w:pPr>
@@ -5313,6 +5625,7 @@
     </w:p>
     <w:p>
       <w:pPr>
+        <w:keepNext/>
         <w:spacing w:before="60" w:after="60"/>
       </w:pPr>
       <w:r>
@@ -5336,6 +5649,9 @@
         <w:gridCol w:w="10368"/>
       </w:tblGrid>
       <w:tr>
+        <w:trPr>
+          <w:cantSplit/>
+        </w:trPr>
         <w:tc>
           <w:tcPr>
             <w:tcW w:type="dxa" w:w="10368"/>
@@ -5362,6 +5678,7 @@
     </w:tbl>
     <w:p>
       <w:pPr>
+        <w:keepNext/>
         <w:spacing w:before="140" w:after="80"/>
       </w:pPr>
       <w:r>
@@ -5393,6 +5710,7 @@
     </w:p>
     <w:p>
       <w:pPr>
+        <w:keepNext/>
         <w:spacing w:before="0" w:after="40"/>
         <w:ind w:left="288"/>
       </w:pPr>
@@ -5408,6 +5726,7 @@
     </w:p>
     <w:p>
       <w:pPr>
+        <w:keepNext/>
         <w:spacing w:before="0" w:after="40"/>
         <w:ind w:left="288"/>
       </w:pPr>
@@ -5423,6 +5742,7 @@
     </w:p>
     <w:p>
       <w:pPr>
+        <w:keepNext/>
         <w:spacing w:before="0" w:after="40"/>
         <w:ind w:left="288"/>
       </w:pPr>
@@ -5438,6 +5758,7 @@
     </w:p>
     <w:p>
       <w:pPr>
+        <w:keepNext/>
         <w:spacing w:before="0" w:after="40"/>
         <w:ind w:left="288"/>
       </w:pPr>
@@ -5453,6 +5774,7 @@
     </w:p>
     <w:p>
       <w:pPr>
+        <w:keepNext/>
         <w:spacing w:before="60" w:after="60"/>
       </w:pPr>
       <w:r>
@@ -5476,6 +5798,9 @@
         <w:gridCol w:w="10368"/>
       </w:tblGrid>
       <w:tr>
+        <w:trPr>
+          <w:cantSplit/>
+        </w:trPr>
         <w:tc>
           <w:tcPr>
             <w:tcW w:type="dxa" w:w="10368"/>
@@ -5502,6 +5827,7 @@
     </w:tbl>
     <w:p>
       <w:pPr>
+        <w:keepNext/>
         <w:spacing w:before="160" w:after="100"/>
       </w:pPr>
       <w:r>
@@ -5516,6 +5842,7 @@
     </w:p>
     <w:p>
       <w:pPr>
+        <w:keepNext/>
         <w:spacing w:before="140" w:after="80"/>
       </w:pPr>
       <w:r>
@@ -5547,6 +5874,7 @@
     </w:p>
     <w:p>
       <w:pPr>
+        <w:keepNext/>
         <w:spacing w:before="0" w:after="40"/>
         <w:ind w:left="288"/>
       </w:pPr>
@@ -5562,6 +5890,7 @@
     </w:p>
     <w:p>
       <w:pPr>
+        <w:keepNext/>
         <w:spacing w:before="0" w:after="40"/>
         <w:ind w:left="288"/>
       </w:pPr>
@@ -5577,6 +5906,7 @@
     </w:p>
     <w:p>
       <w:pPr>
+        <w:keepNext/>
         <w:spacing w:before="0" w:after="40"/>
         <w:ind w:left="288"/>
       </w:pPr>
@@ -5592,6 +5922,7 @@
     </w:p>
     <w:p>
       <w:pPr>
+        <w:keepNext/>
         <w:spacing w:before="0" w:after="40"/>
         <w:ind w:left="288"/>
       </w:pPr>
@@ -5607,6 +5938,7 @@
     </w:p>
     <w:p>
       <w:pPr>
+        <w:keepNext/>
         <w:spacing w:before="60" w:after="60"/>
       </w:pPr>
       <w:r>
@@ -5630,6 +5962,9 @@
         <w:gridCol w:w="10368"/>
       </w:tblGrid>
       <w:tr>
+        <w:trPr>
+          <w:cantSplit/>
+        </w:trPr>
         <w:tc>
           <w:tcPr>
             <w:tcW w:type="dxa" w:w="10368"/>
@@ -5656,6 +5991,7 @@
     </w:tbl>
     <w:p>
       <w:pPr>
+        <w:keepNext/>
         <w:spacing w:before="140" w:after="80"/>
       </w:pPr>
       <w:r>
@@ -5687,6 +6023,7 @@
     </w:p>
     <w:p>
       <w:pPr>
+        <w:keepNext/>
         <w:spacing w:before="0" w:after="40"/>
         <w:ind w:left="288"/>
       </w:pPr>
@@ -5702,6 +6039,7 @@
     </w:p>
     <w:p>
       <w:pPr>
+        <w:keepNext/>
         <w:spacing w:before="0" w:after="40"/>
         <w:ind w:left="288"/>
       </w:pPr>
@@ -5717,6 +6055,7 @@
     </w:p>
     <w:p>
       <w:pPr>
+        <w:keepNext/>
         <w:spacing w:before="0" w:after="40"/>
         <w:ind w:left="288"/>
       </w:pPr>
@@ -5732,6 +6071,7 @@
     </w:p>
     <w:p>
       <w:pPr>
+        <w:keepNext/>
         <w:spacing w:before="0" w:after="40"/>
         <w:ind w:left="288"/>
       </w:pPr>
@@ -5747,6 +6087,7 @@
     </w:p>
     <w:p>
       <w:pPr>
+        <w:keepNext/>
         <w:spacing w:before="60" w:after="60"/>
       </w:pPr>
       <w:r>
@@ -5770,6 +6111,9 @@
         <w:gridCol w:w="10368"/>
       </w:tblGrid>
       <w:tr>
+        <w:trPr>
+          <w:cantSplit/>
+        </w:trPr>
         <w:tc>
           <w:tcPr>
             <w:tcW w:type="dxa" w:w="10368"/>
@@ -5796,6 +6140,7 @@
     </w:tbl>
     <w:p>
       <w:pPr>
+        <w:keepNext/>
         <w:spacing w:before="140" w:after="80"/>
       </w:pPr>
       <w:r>
@@ -5827,6 +6172,7 @@
     </w:p>
     <w:p>
       <w:pPr>
+        <w:keepNext/>
         <w:spacing w:before="0" w:after="40"/>
         <w:ind w:left="288"/>
       </w:pPr>
@@ -5842,6 +6188,7 @@
     </w:p>
     <w:p>
       <w:pPr>
+        <w:keepNext/>
         <w:spacing w:before="0" w:after="40"/>
         <w:ind w:left="288"/>
       </w:pPr>
@@ -5857,6 +6204,7 @@
     </w:p>
     <w:p>
       <w:pPr>
+        <w:keepNext/>
         <w:spacing w:before="0" w:after="40"/>
         <w:ind w:left="288"/>
       </w:pPr>
@@ -5872,6 +6220,7 @@
     </w:p>
     <w:p>
       <w:pPr>
+        <w:keepNext/>
         <w:spacing w:before="0" w:after="40"/>
         <w:ind w:left="288"/>
       </w:pPr>
@@ -5887,6 +6236,7 @@
     </w:p>
     <w:p>
       <w:pPr>
+        <w:keepNext/>
         <w:spacing w:before="60" w:after="60"/>
       </w:pPr>
       <w:r>
@@ -5910,6 +6260,9 @@
         <w:gridCol w:w="10368"/>
       </w:tblGrid>
       <w:tr>
+        <w:trPr>
+          <w:cantSplit/>
+        </w:trPr>
         <w:tc>
           <w:tcPr>
             <w:tcW w:type="dxa" w:w="10368"/>
@@ -5936,6 +6289,7 @@
     </w:tbl>
     <w:p>
       <w:pPr>
+        <w:keepNext/>
         <w:spacing w:before="140" w:after="80"/>
       </w:pPr>
       <w:r>
@@ -5967,6 +6321,7 @@
     </w:p>
     <w:p>
       <w:pPr>
+        <w:keepNext/>
         <w:spacing w:before="0" w:after="40"/>
         <w:ind w:left="288"/>
       </w:pPr>
@@ -5982,6 +6337,7 @@
     </w:p>
     <w:p>
       <w:pPr>
+        <w:keepNext/>
         <w:spacing w:before="0" w:after="40"/>
         <w:ind w:left="288"/>
       </w:pPr>
@@ -5997,6 +6353,7 @@
     </w:p>
     <w:p>
       <w:pPr>
+        <w:keepNext/>
         <w:spacing w:before="0" w:after="40"/>
         <w:ind w:left="288"/>
       </w:pPr>
@@ -6012,6 +6369,7 @@
     </w:p>
     <w:p>
       <w:pPr>
+        <w:keepNext/>
         <w:spacing w:before="0" w:after="40"/>
         <w:ind w:left="288"/>
       </w:pPr>
@@ -6027,6 +6385,7 @@
     </w:p>
     <w:p>
       <w:pPr>
+        <w:keepNext/>
         <w:spacing w:before="60" w:after="60"/>
       </w:pPr>
       <w:r>
@@ -6050,6 +6409,9 @@
         <w:gridCol w:w="10368"/>
       </w:tblGrid>
       <w:tr>
+        <w:trPr>
+          <w:cantSplit/>
+        </w:trPr>
         <w:tc>
           <w:tcPr>
             <w:tcW w:type="dxa" w:w="10368"/>
@@ -6076,6 +6438,7 @@
     </w:tbl>
     <w:p>
       <w:pPr>
+        <w:keepNext/>
         <w:spacing w:before="160" w:after="100"/>
       </w:pPr>
       <w:r>
@@ -6090,6 +6453,7 @@
     </w:p>
     <w:p>
       <w:pPr>
+        <w:keepNext/>
         <w:spacing w:before="140" w:after="80"/>
       </w:pPr>
       <w:r>
@@ -6121,6 +6485,7 @@
     </w:p>
     <w:p>
       <w:pPr>
+        <w:keepNext/>
         <w:spacing w:before="0" w:after="40"/>
         <w:ind w:left="288"/>
       </w:pPr>
@@ -6136,6 +6501,7 @@
     </w:p>
     <w:p>
       <w:pPr>
+        <w:keepNext/>
         <w:spacing w:before="0" w:after="40"/>
         <w:ind w:left="288"/>
       </w:pPr>
@@ -6151,6 +6517,7 @@
     </w:p>
     <w:p>
       <w:pPr>
+        <w:keepNext/>
         <w:spacing w:before="0" w:after="40"/>
         <w:ind w:left="288"/>
       </w:pPr>
@@ -6166,6 +6533,7 @@
     </w:p>
     <w:p>
       <w:pPr>
+        <w:keepNext/>
         <w:spacing w:before="0" w:after="40"/>
         <w:ind w:left="288"/>
       </w:pPr>
@@ -6181,6 +6549,7 @@
     </w:p>
     <w:p>
       <w:pPr>
+        <w:keepNext/>
         <w:spacing w:before="60" w:after="60"/>
       </w:pPr>
       <w:r>
@@ -6204,6 +6573,9 @@
         <w:gridCol w:w="10368"/>
       </w:tblGrid>
       <w:tr>
+        <w:trPr>
+          <w:cantSplit/>
+        </w:trPr>
         <w:tc>
           <w:tcPr>
             <w:tcW w:type="dxa" w:w="10368"/>
@@ -6230,6 +6602,7 @@
     </w:tbl>
     <w:p>
       <w:pPr>
+        <w:keepNext/>
         <w:spacing w:before="140" w:after="80"/>
       </w:pPr>
       <w:r>
@@ -6261,6 +6634,7 @@
     </w:p>
     <w:p>
       <w:pPr>
+        <w:keepNext/>
         <w:spacing w:before="0" w:after="40"/>
         <w:ind w:left="288"/>
       </w:pPr>
@@ -6276,6 +6650,7 @@
     </w:p>
     <w:p>
       <w:pPr>
+        <w:keepNext/>
         <w:spacing w:before="0" w:after="40"/>
         <w:ind w:left="288"/>
       </w:pPr>
@@ -6291,6 +6666,7 @@
     </w:p>
     <w:p>
       <w:pPr>
+        <w:keepNext/>
         <w:spacing w:before="0" w:after="40"/>
         <w:ind w:left="288"/>
       </w:pPr>
@@ -6306,6 +6682,7 @@
     </w:p>
     <w:p>
       <w:pPr>
+        <w:keepNext/>
         <w:spacing w:before="0" w:after="40"/>
         <w:ind w:left="288"/>
       </w:pPr>
@@ -6321,6 +6698,7 @@
     </w:p>
     <w:p>
       <w:pPr>
+        <w:keepNext/>
         <w:spacing w:before="60" w:after="60"/>
       </w:pPr>
       <w:r>
@@ -6344,6 +6722,9 @@
         <w:gridCol w:w="10368"/>
       </w:tblGrid>
       <w:tr>
+        <w:trPr>
+          <w:cantSplit/>
+        </w:trPr>
         <w:tc>
           <w:tcPr>
             <w:tcW w:type="dxa" w:w="10368"/>
@@ -6370,6 +6751,7 @@
     </w:tbl>
     <w:p>
       <w:pPr>
+        <w:keepNext/>
         <w:spacing w:before="140" w:after="80"/>
       </w:pPr>
       <w:r>
@@ -6401,6 +6783,7 @@
     </w:p>
     <w:p>
       <w:pPr>
+        <w:keepNext/>
         <w:spacing w:before="0" w:after="40"/>
         <w:ind w:left="288"/>
       </w:pPr>
@@ -6416,6 +6799,7 @@
     </w:p>
     <w:p>
       <w:pPr>
+        <w:keepNext/>
         <w:spacing w:before="0" w:after="40"/>
         <w:ind w:left="288"/>
       </w:pPr>
@@ -6431,6 +6815,7 @@
     </w:p>
     <w:p>
       <w:pPr>
+        <w:keepNext/>
         <w:spacing w:before="0" w:after="40"/>
         <w:ind w:left="288"/>
       </w:pPr>
@@ -6446,6 +6831,7 @@
     </w:p>
     <w:p>
       <w:pPr>
+        <w:keepNext/>
         <w:spacing w:before="0" w:after="40"/>
         <w:ind w:left="288"/>
       </w:pPr>
@@ -6461,6 +6847,7 @@
     </w:p>
     <w:p>
       <w:pPr>
+        <w:keepNext/>
         <w:spacing w:before="60" w:after="60"/>
       </w:pPr>
       <w:r>
@@ -6484,6 +6871,9 @@
         <w:gridCol w:w="10368"/>
       </w:tblGrid>
       <w:tr>
+        <w:trPr>
+          <w:cantSplit/>
+        </w:trPr>
         <w:tc>
           <w:tcPr>
             <w:tcW w:type="dxa" w:w="10368"/>
@@ -6510,6 +6900,7 @@
     </w:tbl>
     <w:p>
       <w:pPr>
+        <w:keepNext/>
         <w:spacing w:before="140" w:after="80"/>
       </w:pPr>
       <w:r>
@@ -6541,6 +6932,7 @@
     </w:p>
     <w:p>
       <w:pPr>
+        <w:keepNext/>
         <w:spacing w:before="0" w:after="40"/>
         <w:ind w:left="288"/>
       </w:pPr>
@@ -6556,6 +6948,7 @@
     </w:p>
     <w:p>
       <w:pPr>
+        <w:keepNext/>
         <w:spacing w:before="0" w:after="40"/>
         <w:ind w:left="288"/>
       </w:pPr>
@@ -6571,6 +6964,7 @@
     </w:p>
     <w:p>
       <w:pPr>
+        <w:keepNext/>
         <w:spacing w:before="0" w:after="40"/>
         <w:ind w:left="288"/>
       </w:pPr>
@@ -6586,6 +6980,7 @@
     </w:p>
     <w:p>
       <w:pPr>
+        <w:keepNext/>
         <w:spacing w:before="0" w:after="40"/>
         <w:ind w:left="288"/>
       </w:pPr>
@@ -6601,6 +6996,7 @@
     </w:p>
     <w:p>
       <w:pPr>
+        <w:keepNext/>
         <w:spacing w:before="60" w:after="60"/>
       </w:pPr>
       <w:r>
@@ -6624,6 +7020,9 @@
         <w:gridCol w:w="10368"/>
       </w:tblGrid>
       <w:tr>
+        <w:trPr>
+          <w:cantSplit/>
+        </w:trPr>
         <w:tc>
           <w:tcPr>
             <w:tcW w:type="dxa" w:w="10368"/>
@@ -6650,6 +7049,7 @@
     </w:tbl>
     <w:p>
       <w:pPr>
+        <w:keepNext/>
         <w:spacing w:before="160" w:after="100"/>
       </w:pPr>
       <w:r>
@@ -6664,6 +7064,7 @@
     </w:p>
     <w:p>
       <w:pPr>
+        <w:keepNext/>
         <w:spacing w:before="140" w:after="80"/>
       </w:pPr>
       <w:r>
@@ -6695,6 +7096,7 @@
     </w:p>
     <w:p>
       <w:pPr>
+        <w:keepNext/>
         <w:spacing w:before="0" w:after="40"/>
         <w:ind w:left="288"/>
       </w:pPr>
@@ -6710,6 +7112,7 @@
     </w:p>
     <w:p>
       <w:pPr>
+        <w:keepNext/>
         <w:spacing w:before="0" w:after="40"/>
         <w:ind w:left="288"/>
       </w:pPr>
@@ -6725,6 +7128,7 @@
     </w:p>
     <w:p>
       <w:pPr>
+        <w:keepNext/>
         <w:spacing w:before="0" w:after="40"/>
         <w:ind w:left="288"/>
       </w:pPr>
@@ -6740,6 +7144,7 @@
     </w:p>
     <w:p>
       <w:pPr>
+        <w:keepNext/>
         <w:spacing w:before="0" w:after="40"/>
         <w:ind w:left="288"/>
       </w:pPr>
@@ -6755,6 +7160,7 @@
     </w:p>
     <w:p>
       <w:pPr>
+        <w:keepNext/>
         <w:spacing w:before="60" w:after="60"/>
       </w:pPr>
       <w:r>
@@ -6778,6 +7184,9 @@
         <w:gridCol w:w="10368"/>
       </w:tblGrid>
       <w:tr>
+        <w:trPr>
+          <w:cantSplit/>
+        </w:trPr>
         <w:tc>
           <w:tcPr>
             <w:tcW w:type="dxa" w:w="10368"/>
@@ -6804,6 +7213,7 @@
     </w:tbl>
     <w:p>
       <w:pPr>
+        <w:keepNext/>
         <w:spacing w:before="140" w:after="80"/>
       </w:pPr>
       <w:r>
@@ -6835,6 +7245,7 @@
     </w:p>
     <w:p>
       <w:pPr>
+        <w:keepNext/>
         <w:spacing w:before="0" w:after="40"/>
         <w:ind w:left="288"/>
       </w:pPr>
@@ -6850,6 +7261,7 @@
     </w:p>
     <w:p>
       <w:pPr>
+        <w:keepNext/>
         <w:spacing w:before="0" w:after="40"/>
         <w:ind w:left="288"/>
       </w:pPr>
@@ -6865,6 +7277,7 @@
     </w:p>
     <w:p>
       <w:pPr>
+        <w:keepNext/>
         <w:spacing w:before="0" w:after="40"/>
         <w:ind w:left="288"/>
       </w:pPr>
@@ -6880,6 +7293,7 @@
     </w:p>
     <w:p>
       <w:pPr>
+        <w:keepNext/>
         <w:spacing w:before="0" w:after="40"/>
         <w:ind w:left="288"/>
       </w:pPr>
@@ -6895,6 +7309,7 @@
     </w:p>
     <w:p>
       <w:pPr>
+        <w:keepNext/>
         <w:spacing w:before="60" w:after="60"/>
       </w:pPr>
       <w:r>
@@ -6918,6 +7333,9 @@
         <w:gridCol w:w="10368"/>
       </w:tblGrid>
       <w:tr>
+        <w:trPr>
+          <w:cantSplit/>
+        </w:trPr>
         <w:tc>
           <w:tcPr>
             <w:tcW w:type="dxa" w:w="10368"/>
@@ -6944,6 +7362,7 @@
     </w:tbl>
     <w:p>
       <w:pPr>
+        <w:keepNext/>
         <w:spacing w:before="140" w:after="80"/>
       </w:pPr>
       <w:r>
@@ -6975,6 +7394,7 @@
     </w:p>
     <w:p>
       <w:pPr>
+        <w:keepNext/>
         <w:spacing w:before="0" w:after="40"/>
         <w:ind w:left="288"/>
       </w:pPr>
@@ -6990,6 +7410,7 @@
     </w:p>
     <w:p>
       <w:pPr>
+        <w:keepNext/>
         <w:spacing w:before="0" w:after="40"/>
         <w:ind w:left="288"/>
       </w:pPr>
@@ -7005,6 +7426,7 @@
     </w:p>
     <w:p>
       <w:pPr>
+        <w:keepNext/>
         <w:spacing w:before="0" w:after="40"/>
         <w:ind w:left="288"/>
       </w:pPr>
@@ -7020,6 +7442,7 @@
     </w:p>
     <w:p>
       <w:pPr>
+        <w:keepNext/>
         <w:spacing w:before="0" w:after="40"/>
         <w:ind w:left="288"/>
       </w:pPr>
@@ -7035,6 +7458,7 @@
     </w:p>
     <w:p>
       <w:pPr>
+        <w:keepNext/>
         <w:spacing w:before="60" w:after="60"/>
       </w:pPr>
       <w:r>
@@ -7058,6 +7482,9 @@
         <w:gridCol w:w="10368"/>
       </w:tblGrid>
       <w:tr>
+        <w:trPr>
+          <w:cantSplit/>
+        </w:trPr>
         <w:tc>
           <w:tcPr>
             <w:tcW w:type="dxa" w:w="10368"/>

</xml_diff>